<commit_message>
real-time message fiunctionality write up
most of the write up done.
</commit_message>
<xml_diff>
--- a/docs/dissertation start.docx
+++ b/docs/dissertation start.docx
@@ -4411,21 +4411,7 @@
         <w:rPr>
           <w:rFonts w:ascii="Garamond" w:hAnsi="Garamond"/>
         </w:rPr>
-        <w:t xml:space="preserve">Express JS is one of the most popular frameworks for building web servers and APIs. It greatly simplifies routing compared to node.js and, like react, has many libraries to extend functionality or take care of security e.g. passport, </w:t>
-      </w:r>
-      <w:proofErr w:type="spellStart"/>
-      <w:r>
-        <w:rPr>
-          <w:rFonts w:ascii="Garamond" w:hAnsi="Garamond"/>
-        </w:rPr>
-        <w:t>bcrypt</w:t>
-      </w:r>
-      <w:proofErr w:type="spellEnd"/>
-      <w:r>
-        <w:rPr>
-          <w:rFonts w:ascii="Garamond" w:hAnsi="Garamond"/>
-        </w:rPr>
-        <w:t xml:space="preserve">. It integrates easily with databases like </w:t>
+        <w:t xml:space="preserve">Express JS is one of the most popular frameworks for building web servers and APIs. It greatly simplifies routing compared to node.js and, like react, has many libraries to extend functionality or take care of security e.g. passport, bcrypt. It integrates easily with databases like </w:t>
       </w:r>
       <w:r>
         <w:rPr>
@@ -4451,7 +4437,6 @@
           <w:szCs w:val="24"/>
         </w:rPr>
       </w:pPr>
-      <w:proofErr w:type="spellStart"/>
       <w:r>
         <w:rPr>
           <w:rFonts w:ascii="Garamond" w:hAnsi="Garamond"/>
@@ -4463,7 +4448,6 @@
         </w:rPr>
         <w:t>PostGreSQL</w:t>
       </w:r>
-      <w:proofErr w:type="spellEnd"/>
     </w:p>
     <w:p>
       <w:pPr>
@@ -4473,14 +4457,12 @@
           <w:rFonts w:ascii="Garamond" w:hAnsi="Garamond"/>
         </w:rPr>
       </w:pPr>
-      <w:proofErr w:type="spellStart"/>
       <w:r>
         <w:rPr>
           <w:rFonts w:ascii="Garamond" w:hAnsi="Garamond"/>
         </w:rPr>
         <w:t>PostGreSQL</w:t>
       </w:r>
-      <w:proofErr w:type="spellEnd"/>
       <w:r>
         <w:rPr>
           <w:rFonts w:ascii="Garamond" w:hAnsi="Garamond"/>
@@ -4491,35 +4473,7 @@
         <w:rPr>
           <w:rFonts w:ascii="Garamond" w:hAnsi="Garamond"/>
         </w:rPr>
-        <w:t>that lends itself well to structured data and integrates easily with express via the ‘</w:t>
-      </w:r>
-      <w:proofErr w:type="spellStart"/>
-      <w:r>
-        <w:rPr>
-          <w:rFonts w:ascii="Garamond" w:hAnsi="Garamond"/>
-        </w:rPr>
-        <w:t>pg</w:t>
-      </w:r>
-      <w:proofErr w:type="spellEnd"/>
-      <w:r>
-        <w:rPr>
-          <w:rFonts w:ascii="Garamond" w:hAnsi="Garamond"/>
-        </w:rPr>
-        <w:t xml:space="preserve">’ library. MongoDB was excluded as it is </w:t>
-      </w:r>
-      <w:proofErr w:type="spellStart"/>
-      <w:r>
-        <w:rPr>
-          <w:rFonts w:ascii="Garamond" w:hAnsi="Garamond"/>
-        </w:rPr>
-        <w:t>noSQL</w:t>
-      </w:r>
-      <w:proofErr w:type="spellEnd"/>
-      <w:r>
-        <w:rPr>
-          <w:rFonts w:ascii="Garamond" w:hAnsi="Garamond"/>
-        </w:rPr>
-        <w:t>.</w:t>
+        <w:t>that lends itself well to structured data and integrates easily with express via the ‘pg’ library. MongoDB was excluded as it is noSQL.</w:t>
       </w:r>
     </w:p>
     <w:p>
@@ -6126,7 +6080,6 @@
         </w:rPr>
         <w:t xml:space="preserve">of </w:t>
       </w:r>
-      <w:proofErr w:type="spellStart"/>
       <w:r>
         <w:rPr>
           <w:rFonts w:ascii="Garamond" w:hAnsi="Garamond"/>
@@ -6135,14 +6088,12 @@
         </w:rPr>
         <w:t>useState</w:t>
       </w:r>
-      <w:proofErr w:type="spellEnd"/>
       <w:r>
         <w:rPr>
           <w:rFonts w:ascii="Garamond" w:hAnsi="Garamond"/>
         </w:rPr>
         <w:t xml:space="preserve"> for maintaining and updating component data, </w:t>
       </w:r>
-      <w:proofErr w:type="spellStart"/>
       <w:r>
         <w:rPr>
           <w:rFonts w:ascii="Garamond" w:hAnsi="Garamond"/>
@@ -6151,7 +6102,6 @@
         </w:rPr>
         <w:t>useEffect</w:t>
       </w:r>
-      <w:proofErr w:type="spellEnd"/>
       <w:r>
         <w:rPr>
           <w:rFonts w:ascii="Garamond" w:hAnsi="Garamond"/>
@@ -6170,7 +6120,6 @@
         </w:rPr>
         <w:t xml:space="preserve"> the API, and </w:t>
       </w:r>
-      <w:proofErr w:type="spellStart"/>
       <w:r>
         <w:rPr>
           <w:rFonts w:ascii="Garamond" w:hAnsi="Garamond"/>
@@ -6179,7 +6128,6 @@
         </w:rPr>
         <w:t>useContext</w:t>
       </w:r>
-      <w:proofErr w:type="spellEnd"/>
       <w:r>
         <w:rPr>
           <w:rFonts w:ascii="Garamond" w:hAnsi="Garamond"/>
@@ -6807,21 +6755,7 @@
         <w:rPr>
           <w:rFonts w:ascii="Garamond" w:hAnsi="Garamond"/>
         </w:rPr>
-        <w:t xml:space="preserve">. In contrast to the http request-response cycle, socket.io uses </w:t>
-      </w:r>
-      <w:proofErr w:type="spellStart"/>
-      <w:r>
-        <w:rPr>
-          <w:rFonts w:ascii="Garamond" w:hAnsi="Garamond"/>
-        </w:rPr>
-        <w:t>websockets</w:t>
-      </w:r>
-      <w:proofErr w:type="spellEnd"/>
-      <w:r>
-        <w:rPr>
-          <w:rFonts w:ascii="Garamond" w:hAnsi="Garamond"/>
-        </w:rPr>
-        <w:t xml:space="preserve"> </w:t>
+        <w:t xml:space="preserve">. In contrast to the http request-response cycle, socket.io uses websockets </w:t>
       </w:r>
       <w:r>
         <w:rPr>
@@ -6917,7 +6851,6 @@
         </w:rPr>
         <w:t xml:space="preserve"> from the database. The token is signed cryptographically using the </w:t>
       </w:r>
-      <w:proofErr w:type="spellStart"/>
       <w:r>
         <w:rPr>
           <w:rFonts w:ascii="Garamond" w:hAnsi="Garamond"/>
@@ -6926,14 +6859,12 @@
         </w:rPr>
         <w:t>process.env.JWT_SECRET</w:t>
       </w:r>
-      <w:proofErr w:type="spellEnd"/>
       <w:r>
         <w:rPr>
           <w:rFonts w:ascii="Garamond" w:hAnsi="Garamond"/>
         </w:rPr>
         <w:t xml:space="preserve"> variable. It is set to expire after 24 hours and is stored in the browser as an </w:t>
       </w:r>
-      <w:proofErr w:type="spellStart"/>
       <w:r>
         <w:rPr>
           <w:rFonts w:ascii="Garamond" w:hAnsi="Garamond"/>
@@ -6942,7 +6873,6 @@
         </w:rPr>
         <w:t>HTTPOnly</w:t>
       </w:r>
-      <w:proofErr w:type="spellEnd"/>
       <w:r>
         <w:rPr>
           <w:rFonts w:ascii="Garamond" w:hAnsi="Garamond"/>
@@ -6961,7 +6891,6 @@
         </w:rPr>
         <w:t xml:space="preserve">from being read by client-side </w:t>
       </w:r>
-      <w:proofErr w:type="spellStart"/>
       <w:r>
         <w:rPr>
           <w:rFonts w:ascii="Garamond" w:hAnsi="Garamond"/>
@@ -6970,7 +6899,6 @@
         </w:rPr>
         <w:t>HTTPOnly</w:t>
       </w:r>
-      <w:proofErr w:type="spellEnd"/>
       <w:r>
         <w:rPr>
           <w:rFonts w:ascii="Garamond" w:hAnsi="Garamond"/>
@@ -7001,21 +6929,18 @@
         </w:rPr>
         <w:t>{</w:t>
       </w:r>
-      <w:proofErr w:type="spellStart"/>
       <w:r>
         <w:rPr>
           <w:rFonts w:ascii="Garamond" w:hAnsi="Garamond"/>
         </w:rPr>
         <w:t>credentials:’include</w:t>
       </w:r>
-      <w:proofErr w:type="spellEnd"/>
       <w:r>
         <w:rPr>
           <w:rFonts w:ascii="Garamond" w:hAnsi="Garamond"/>
         </w:rPr>
         <w:t xml:space="preserve">’}, is verified server-side and the </w:t>
       </w:r>
-      <w:proofErr w:type="spellStart"/>
       <w:r>
         <w:rPr>
           <w:rFonts w:ascii="Garamond" w:hAnsi="Garamond"/>
@@ -7024,14 +6949,12 @@
         </w:rPr>
         <w:t>user_id</w:t>
       </w:r>
-      <w:proofErr w:type="spellEnd"/>
       <w:r>
         <w:rPr>
           <w:rFonts w:ascii="Garamond" w:hAnsi="Garamond"/>
         </w:rPr>
         <w:t xml:space="preserve"> is used to rebuild the logged-in user’s details in the </w:t>
       </w:r>
-      <w:proofErr w:type="spellStart"/>
       <w:r>
         <w:rPr>
           <w:rFonts w:ascii="Garamond" w:hAnsi="Garamond"/>
@@ -7040,14 +6963,12 @@
         </w:rPr>
         <w:t>req.user</w:t>
       </w:r>
-      <w:proofErr w:type="spellEnd"/>
       <w:r>
         <w:rPr>
           <w:rFonts w:ascii="Garamond" w:hAnsi="Garamond"/>
         </w:rPr>
         <w:t xml:space="preserve"> and </w:t>
       </w:r>
-      <w:proofErr w:type="spellStart"/>
       <w:r>
         <w:rPr>
           <w:rFonts w:ascii="Garamond" w:hAnsi="Garamond"/>
@@ -7056,7 +6977,6 @@
         </w:rPr>
         <w:t>socket.user</w:t>
       </w:r>
-      <w:proofErr w:type="spellEnd"/>
       <w:r>
         <w:rPr>
           <w:rFonts w:ascii="Garamond" w:hAnsi="Garamond"/>
@@ -7074,7 +6994,6 @@
           <w:color w:val="215E99" w:themeColor="text2" w:themeTint="BF"/>
         </w:rPr>
       </w:pPr>
-      <w:proofErr w:type="spellStart"/>
       <w:r>
         <w:rPr>
           <w:rFonts w:ascii="Garamond" w:hAnsi="Garamond"/>
@@ -7084,7 +7003,6 @@
         </w:rPr>
         <w:t>Bcrypt</w:t>
       </w:r>
-      <w:proofErr w:type="spellEnd"/>
     </w:p>
     <w:p>
       <w:pPr>
@@ -7109,21 +7027,7 @@
         <w:rPr>
           <w:rFonts w:ascii="Garamond" w:hAnsi="Garamond"/>
         </w:rPr>
-        <w:t xml:space="preserve">are handled using </w:t>
-      </w:r>
-      <w:proofErr w:type="spellStart"/>
-      <w:r>
-        <w:rPr>
-          <w:rFonts w:ascii="Garamond" w:hAnsi="Garamond"/>
-        </w:rPr>
-        <w:t>bcrypt</w:t>
-      </w:r>
-      <w:proofErr w:type="spellEnd"/>
-      <w:r>
-        <w:rPr>
-          <w:rFonts w:ascii="Garamond" w:hAnsi="Garamond"/>
-        </w:rPr>
-        <w:t xml:space="preserve"> </w:t>
+        <w:t xml:space="preserve">are handled using bcrypt </w:t>
       </w:r>
       <w:r>
         <w:rPr>
@@ -7141,21 +7045,7 @@
         <w:rPr>
           <w:rFonts w:ascii="Garamond" w:hAnsi="Garamond"/>
         </w:rPr>
-        <w:t xml:space="preserve">user details are obtained from the DB via form-submitted email, and the submitted password is compared with the password stored in DB via </w:t>
-      </w:r>
-      <w:proofErr w:type="spellStart"/>
-      <w:r>
-        <w:rPr>
-          <w:rFonts w:ascii="Garamond" w:hAnsi="Garamond"/>
-        </w:rPr>
-        <w:t>bcrypt</w:t>
-      </w:r>
-      <w:proofErr w:type="spellEnd"/>
-      <w:r>
-        <w:rPr>
-          <w:rFonts w:ascii="Garamond" w:hAnsi="Garamond"/>
-        </w:rPr>
-        <w:t>.</w:t>
+        <w:t>user details are obtained from the DB via form-submitted email, and the submitted password is compared with the password stored in DB via bcrypt.</w:t>
       </w:r>
     </w:p>
     <w:p>
@@ -7418,7 +7308,6 @@
         </w:rPr>
         <w:t xml:space="preserve"> validation schema that is integrated with RHF via </w:t>
       </w:r>
-      <w:proofErr w:type="spellStart"/>
       <w:r>
         <w:rPr>
           <w:rFonts w:ascii="Garamond" w:hAnsi="Garamond"/>
@@ -7427,7 +7316,6 @@
         </w:rPr>
         <w:t>ZodResolver</w:t>
       </w:r>
-      <w:proofErr w:type="spellEnd"/>
       <w:r>
         <w:rPr>
           <w:rFonts w:ascii="Garamond" w:hAnsi="Garamond"/>
@@ -7440,7 +7328,6 @@
         </w:rPr>
         <w:t xml:space="preserve"> As the form is large, fields are validated as soon as the user leaves an input to provide immediate corrective feedback. Validation errors are displayed inline in red via RHF’s </w:t>
       </w:r>
-      <w:proofErr w:type="spellStart"/>
       <w:r>
         <w:rPr>
           <w:rFonts w:ascii="Garamond" w:hAnsi="Garamond"/>
@@ -7449,7 +7336,6 @@
         </w:rPr>
         <w:t>formState.errors</w:t>
       </w:r>
-      <w:proofErr w:type="spellEnd"/>
       <w:r>
         <w:rPr>
           <w:rFonts w:ascii="Garamond" w:hAnsi="Garamond"/>
@@ -7491,7 +7377,6 @@
         <w:lastRenderedPageBreak/>
         <w:t xml:space="preserve">To ensure input of city and instrument data that is consistent with the format in the DB, the component uses </w:t>
       </w:r>
-      <w:proofErr w:type="spellStart"/>
       <w:r>
         <w:rPr>
           <w:rFonts w:ascii="Garamond" w:hAnsi="Garamond"/>
@@ -7500,7 +7385,6 @@
         </w:rPr>
         <w:t>useEffect</w:t>
       </w:r>
-      <w:proofErr w:type="spellEnd"/>
       <w:r>
         <w:rPr>
           <w:rFonts w:ascii="Garamond" w:hAnsi="Garamond"/>
@@ -7525,7 +7409,6 @@
         </w:rPr>
         <w:t>state (</w:t>
       </w:r>
-      <w:proofErr w:type="spellStart"/>
       <w:r>
         <w:rPr>
           <w:rFonts w:ascii="Garamond" w:hAnsi="Garamond"/>
@@ -7534,14 +7417,12 @@
         </w:rPr>
         <w:t>dbCities</w:t>
       </w:r>
-      <w:proofErr w:type="spellEnd"/>
       <w:r>
         <w:rPr>
           <w:rFonts w:ascii="Garamond" w:hAnsi="Garamond"/>
         </w:rPr>
         <w:t xml:space="preserve"> and </w:t>
       </w:r>
-      <w:proofErr w:type="spellStart"/>
       <w:r>
         <w:rPr>
           <w:rFonts w:ascii="Garamond" w:hAnsi="Garamond"/>
@@ -7550,7 +7431,6 @@
         </w:rPr>
         <w:t>dbInstruments</w:t>
       </w:r>
-      <w:proofErr w:type="spellEnd"/>
       <w:r>
         <w:rPr>
           <w:rFonts w:ascii="Garamond" w:hAnsi="Garamond"/>
@@ -7577,7 +7457,6 @@
         </w:rPr>
         <w:t xml:space="preserve"> and a new dropdown display array is created by filtering the relevant array to include only partial matches. Selecting the item populates the field using RHF’s </w:t>
       </w:r>
-      <w:proofErr w:type="spellStart"/>
       <w:r>
         <w:rPr>
           <w:rFonts w:ascii="Garamond" w:hAnsi="Garamond"/>
@@ -7586,7 +7465,6 @@
         </w:rPr>
         <w:t>setValue</w:t>
       </w:r>
-      <w:proofErr w:type="spellEnd"/>
       <w:r>
         <w:rPr>
           <w:rFonts w:ascii="Garamond" w:hAnsi="Garamond"/>
@@ -7625,7 +7503,6 @@
         </w:rPr>
         <w:t xml:space="preserve"> </w:t>
       </w:r>
-      <w:proofErr w:type="spellStart"/>
       <w:r>
         <w:rPr>
           <w:rFonts w:ascii="Garamond" w:hAnsi="Garamond"/>
@@ -7634,7 +7511,6 @@
         </w:rPr>
         <w:t>onSubmit</w:t>
       </w:r>
-      <w:proofErr w:type="spellEnd"/>
       <w:r>
         <w:rPr>
           <w:rFonts w:ascii="Garamond" w:hAnsi="Garamond"/>
@@ -7659,7 +7535,6 @@
         </w:rPr>
         <w:t xml:space="preserve">Server-side validation is performed in the </w:t>
       </w:r>
-      <w:proofErr w:type="spellStart"/>
       <w:r>
         <w:rPr>
           <w:rFonts w:ascii="Garamond" w:hAnsi="Garamond"/>
@@ -7668,7 +7543,6 @@
         </w:rPr>
         <w:t>tutorRegistrationController</w:t>
       </w:r>
-      <w:proofErr w:type="spellEnd"/>
       <w:r>
         <w:rPr>
           <w:rFonts w:ascii="Garamond" w:hAnsi="Garamond"/>
@@ -8014,7 +7888,6 @@
         </w:rPr>
         <w:t xml:space="preserve">, it then uses </w:t>
       </w:r>
-      <w:proofErr w:type="spellStart"/>
       <w:r>
         <w:rPr>
           <w:rFonts w:ascii="Garamond" w:hAnsi="Garamond"/>
@@ -8023,14 +7896,12 @@
         </w:rPr>
         <w:t>Bcrypt</w:t>
       </w:r>
-      <w:proofErr w:type="spellEnd"/>
       <w:r>
         <w:rPr>
           <w:rFonts w:ascii="Garamond" w:hAnsi="Garamond"/>
         </w:rPr>
         <w:t xml:space="preserve"> to check the hashed DB password with input password. If correct, then a frontend-safe </w:t>
       </w:r>
-      <w:proofErr w:type="spellStart"/>
       <w:r>
         <w:rPr>
           <w:rFonts w:ascii="Garamond" w:hAnsi="Garamond"/>
@@ -8039,7 +7910,6 @@
         </w:rPr>
         <w:t>strippedUser</w:t>
       </w:r>
-      <w:proofErr w:type="spellEnd"/>
       <w:r>
         <w:rPr>
           <w:rFonts w:ascii="Garamond" w:hAnsi="Garamond"/>
@@ -8108,7 +7978,6 @@
         </w:rPr>
         <w:t xml:space="preserve"> the </w:t>
       </w:r>
-      <w:proofErr w:type="spellStart"/>
       <w:r>
         <w:rPr>
           <w:rFonts w:ascii="Garamond" w:hAnsi="Garamond"/>
@@ -8117,7 +7986,6 @@
         </w:rPr>
         <w:t>UserContext</w:t>
       </w:r>
-      <w:proofErr w:type="spellEnd"/>
       <w:r>
         <w:rPr>
           <w:rFonts w:ascii="Garamond" w:hAnsi="Garamond"/>
@@ -8322,7 +8190,6 @@
         </w:rPr>
         <w:t xml:space="preserve">by the </w:t>
       </w:r>
-      <w:proofErr w:type="spellStart"/>
       <w:r>
         <w:rPr>
           <w:rFonts w:ascii="Garamond" w:hAnsi="Garamond"/>
@@ -8331,7 +8198,6 @@
         </w:rPr>
         <w:t>handleChange</w:t>
       </w:r>
-      <w:proofErr w:type="spellEnd"/>
       <w:r>
         <w:rPr>
           <w:rFonts w:ascii="Garamond" w:hAnsi="Garamond"/>
@@ -8386,7 +8252,6 @@
         </w:rPr>
         <w:t xml:space="preserve">. When the user presses the Enter key, the </w:t>
       </w:r>
-      <w:proofErr w:type="spellStart"/>
       <w:r>
         <w:rPr>
           <w:rFonts w:ascii="Garamond" w:hAnsi="Garamond"/>
@@ -8395,7 +8260,6 @@
         </w:rPr>
         <w:t>commitFilters</w:t>
       </w:r>
-      <w:proofErr w:type="spellEnd"/>
       <w:r>
         <w:rPr>
           <w:rFonts w:ascii="Garamond" w:hAnsi="Garamond"/>
@@ -8414,7 +8278,6 @@
         </w:rPr>
         <w:t xml:space="preserve"> to the browser’s query string using React Router’s </w:t>
       </w:r>
-      <w:proofErr w:type="spellStart"/>
       <w:r>
         <w:rPr>
           <w:rFonts w:ascii="Garamond" w:hAnsi="Garamond"/>
@@ -8423,7 +8286,6 @@
         </w:rPr>
         <w:t>setSearchParams</w:t>
       </w:r>
-      <w:proofErr w:type="spellEnd"/>
       <w:r>
         <w:rPr>
           <w:rFonts w:ascii="Garamond" w:hAnsi="Garamond"/>
@@ -8454,7 +8316,6 @@
         </w:rPr>
         <w:t xml:space="preserve"> </w:t>
       </w:r>
-      <w:proofErr w:type="spellStart"/>
       <w:r>
         <w:rPr>
           <w:rFonts w:ascii="Garamond" w:hAnsi="Garamond"/>
@@ -8463,14 +8324,12 @@
         </w:rPr>
         <w:t>useEffect</w:t>
       </w:r>
-      <w:proofErr w:type="spellEnd"/>
       <w:r>
         <w:rPr>
           <w:rFonts w:ascii="Garamond" w:hAnsi="Garamond"/>
         </w:rPr>
         <w:t xml:space="preserve"> hook dependant on </w:t>
       </w:r>
-      <w:proofErr w:type="spellStart"/>
       <w:r>
         <w:rPr>
           <w:rFonts w:ascii="Garamond" w:hAnsi="Garamond"/>
@@ -8479,7 +8338,6 @@
         </w:rPr>
         <w:t>searchParams</w:t>
       </w:r>
-      <w:proofErr w:type="spellEnd"/>
       <w:r>
         <w:rPr>
           <w:rFonts w:ascii="Garamond" w:hAnsi="Garamond"/>
@@ -8508,7 +8366,6 @@
         </w:rPr>
         <w:t xml:space="preserve">. A second </w:t>
       </w:r>
-      <w:proofErr w:type="spellStart"/>
       <w:r>
         <w:rPr>
           <w:rFonts w:ascii="Garamond" w:hAnsi="Garamond"/>
@@ -8517,30 +8374,19 @@
         </w:rPr>
         <w:t>useEffect</w:t>
       </w:r>
-      <w:proofErr w:type="spellEnd"/>
       <w:r>
         <w:rPr>
           <w:rFonts w:ascii="Garamond" w:hAnsi="Garamond"/>
         </w:rPr>
         <w:t xml:space="preserve">, dependant on </w:t>
       </w:r>
-      <w:proofErr w:type="spellStart"/>
-      <w:r>
-        <w:rPr>
-          <w:rFonts w:ascii="Garamond" w:hAnsi="Garamond"/>
-          <w:b/>
-          <w:bCs/>
-        </w:rPr>
-        <w:t>filters.city</w:t>
-      </w:r>
-      <w:proofErr w:type="spellEnd"/>
-      <w:r>
-        <w:rPr>
-          <w:rFonts w:ascii="Garamond" w:hAnsi="Garamond"/>
-          <w:b/>
-          <w:bCs/>
-        </w:rPr>
-        <w:t xml:space="preserve"> </w:t>
+      <w:r>
+        <w:rPr>
+          <w:rFonts w:ascii="Garamond" w:hAnsi="Garamond"/>
+          <w:b/>
+          <w:bCs/>
+        </w:rPr>
+        <w:t xml:space="preserve">filters.city </w:t>
       </w:r>
       <w:r>
         <w:rPr>
@@ -8554,16 +8400,7 @@
           <w:b/>
           <w:bCs/>
         </w:rPr>
-        <w:t xml:space="preserve"> </w:t>
-      </w:r>
-      <w:proofErr w:type="spellStart"/>
-      <w:r>
-        <w:rPr>
-          <w:rFonts w:ascii="Garamond" w:hAnsi="Garamond"/>
-          <w:b/>
-          <w:bCs/>
-        </w:rPr>
-        <w:t>filters.instrum</w:t>
+        <w:t xml:space="preserve"> filters.instrum</w:t>
       </w:r>
       <w:r>
         <w:rPr>
@@ -8581,7 +8418,6 @@
         </w:rPr>
         <w:t>nt</w:t>
       </w:r>
-      <w:proofErr w:type="spellEnd"/>
       <w:r>
         <w:rPr>
           <w:rFonts w:ascii="Garamond" w:hAnsi="Garamond"/>
@@ -8594,23 +8430,13 @@
         </w:rPr>
         <w:t xml:space="preserve">then uses </w:t>
       </w:r>
-      <w:proofErr w:type="spellStart"/>
-      <w:r>
-        <w:rPr>
-          <w:rFonts w:ascii="Garamond" w:hAnsi="Garamond"/>
-          <w:b/>
-          <w:bCs/>
-        </w:rPr>
-        <w:t>URLSearchParams</w:t>
-      </w:r>
-      <w:proofErr w:type="spellEnd"/>
-      <w:r>
-        <w:rPr>
-          <w:rFonts w:ascii="Garamond" w:hAnsi="Garamond"/>
-          <w:b/>
-          <w:bCs/>
-        </w:rPr>
-        <w:t xml:space="preserve"> </w:t>
+      <w:r>
+        <w:rPr>
+          <w:rFonts w:ascii="Garamond" w:hAnsi="Garamond"/>
+          <w:b/>
+          <w:bCs/>
+        </w:rPr>
+        <w:t xml:space="preserve">URLSearchParams </w:t>
       </w:r>
       <w:r>
         <w:rPr>
@@ -8748,14 +8574,14 @@
         </w:rPr>
         <w:t xml:space="preserve">he </w:t>
       </w:r>
-      <w:proofErr w:type="spellStart"/>
-      <w:r>
-        <w:rPr>
-          <w:rFonts w:ascii="Garamond" w:hAnsi="Garamond"/>
+      <w:r>
+        <w:rPr>
+          <w:rFonts w:ascii="Garamond" w:hAnsi="Garamond"/>
+          <w:b/>
+          <w:bCs/>
         </w:rPr>
         <w:t>TutorProfilePage</w:t>
       </w:r>
-      <w:proofErr w:type="spellEnd"/>
       <w:r>
         <w:rPr>
           <w:rFonts w:ascii="Garamond" w:hAnsi="Garamond"/>
@@ -8798,28 +8624,28 @@
         </w:rPr>
         <w:t xml:space="preserve"> child components </w:t>
       </w:r>
-      <w:proofErr w:type="spellStart"/>
-      <w:r>
-        <w:rPr>
-          <w:rFonts w:ascii="Garamond" w:hAnsi="Garamond"/>
+      <w:r>
+        <w:rPr>
+          <w:rFonts w:ascii="Garamond" w:hAnsi="Garamond"/>
+          <w:b/>
+          <w:bCs/>
         </w:rPr>
         <w:t>FocusedTutorCard</w:t>
       </w:r>
-      <w:proofErr w:type="spellEnd"/>
       <w:r>
         <w:rPr>
           <w:rFonts w:ascii="Garamond" w:hAnsi="Garamond"/>
         </w:rPr>
         <w:t xml:space="preserve"> and </w:t>
       </w:r>
-      <w:proofErr w:type="spellStart"/>
-      <w:r>
-        <w:rPr>
-          <w:rFonts w:ascii="Garamond" w:hAnsi="Garamond"/>
+      <w:r>
+        <w:rPr>
+          <w:rFonts w:ascii="Garamond" w:hAnsi="Garamond"/>
+          <w:b/>
+          <w:bCs/>
         </w:rPr>
         <w:t>BookingCalendar</w:t>
       </w:r>
-      <w:proofErr w:type="spellEnd"/>
       <w:r>
         <w:rPr>
           <w:rFonts w:ascii="Garamond" w:hAnsi="Garamond"/>
@@ -8844,7 +8670,6 @@
         </w:rPr>
         <w:t xml:space="preserve"> a </w:t>
       </w:r>
-      <w:proofErr w:type="spellStart"/>
       <w:r>
         <w:rPr>
           <w:rFonts w:ascii="Garamond" w:hAnsi="Garamond"/>
@@ -8853,7 +8678,6 @@
         </w:rPr>
         <w:t>draftBooking</w:t>
       </w:r>
-      <w:proofErr w:type="spellEnd"/>
       <w:r>
         <w:rPr>
           <w:rFonts w:ascii="Garamond" w:hAnsi="Garamond"/>
@@ -8922,14 +8746,14 @@
         </w:rPr>
         <w:t xml:space="preserve">The </w:t>
       </w:r>
-      <w:proofErr w:type="spellStart"/>
-      <w:r>
-        <w:rPr>
-          <w:rFonts w:ascii="Garamond" w:hAnsi="Garamond"/>
+      <w:r>
+        <w:rPr>
+          <w:rFonts w:ascii="Garamond" w:hAnsi="Garamond"/>
+          <w:b/>
+          <w:bCs/>
         </w:rPr>
         <w:t>FocusedTutorCard</w:t>
       </w:r>
-      <w:proofErr w:type="spellEnd"/>
       <w:r>
         <w:rPr>
           <w:rFonts w:ascii="Garamond" w:hAnsi="Garamond"/>
@@ -8966,7 +8790,6 @@
         </w:rPr>
         <w:t xml:space="preserve">passed-down </w:t>
       </w:r>
-      <w:proofErr w:type="spellStart"/>
       <w:r>
         <w:rPr>
           <w:rFonts w:ascii="Garamond" w:hAnsi="Garamond"/>
@@ -8975,21 +8798,20 @@
         </w:rPr>
         <w:t>updateDraftBooking</w:t>
       </w:r>
-      <w:proofErr w:type="spellEnd"/>
       <w:r>
         <w:rPr>
           <w:rFonts w:ascii="Garamond" w:hAnsi="Garamond"/>
         </w:rPr>
         <w:t xml:space="preserve"> function updates the </w:t>
       </w:r>
-      <w:proofErr w:type="spellStart"/>
-      <w:r>
-        <w:rPr>
-          <w:rFonts w:ascii="Garamond" w:hAnsi="Garamond"/>
+      <w:r>
+        <w:rPr>
+          <w:rFonts w:ascii="Garamond" w:hAnsi="Garamond"/>
+          <w:b/>
+          <w:bCs/>
         </w:rPr>
         <w:t>draftBooking</w:t>
       </w:r>
-      <w:proofErr w:type="spellEnd"/>
       <w:r>
         <w:rPr>
           <w:rFonts w:ascii="Garamond" w:hAnsi="Garamond"/>
@@ -9016,14 +8838,14 @@
         </w:rPr>
         <w:t xml:space="preserve">In parallel, the </w:t>
       </w:r>
-      <w:proofErr w:type="spellStart"/>
-      <w:r>
-        <w:rPr>
-          <w:rFonts w:ascii="Garamond" w:hAnsi="Garamond"/>
+      <w:r>
+        <w:rPr>
+          <w:rFonts w:ascii="Garamond" w:hAnsi="Garamond"/>
+          <w:b/>
+          <w:bCs/>
         </w:rPr>
         <w:t>BookingCalendar</w:t>
       </w:r>
-      <w:proofErr w:type="spellEnd"/>
       <w:r>
         <w:rPr>
           <w:rFonts w:ascii="Garamond" w:hAnsi="Garamond"/>
@@ -9120,7 +8942,6 @@
         </w:rPr>
         <w:t xml:space="preserve"> On choosing a slot, the </w:t>
       </w:r>
-      <w:proofErr w:type="spellStart"/>
       <w:r>
         <w:rPr>
           <w:rFonts w:ascii="Garamond" w:hAnsi="Garamond"/>
@@ -9129,7 +8950,6 @@
         </w:rPr>
         <w:t>handleSelectSlot</w:t>
       </w:r>
-      <w:proofErr w:type="spellEnd"/>
       <w:r>
         <w:rPr>
           <w:rFonts w:ascii="Garamond" w:hAnsi="Garamond"/>
@@ -9148,14 +8968,14 @@
         </w:rPr>
         <w:t xml:space="preserve">updates the </w:t>
       </w:r>
-      <w:proofErr w:type="spellStart"/>
-      <w:r>
-        <w:rPr>
-          <w:rFonts w:ascii="Garamond" w:hAnsi="Garamond"/>
+      <w:r>
+        <w:rPr>
+          <w:rFonts w:ascii="Garamond" w:hAnsi="Garamond"/>
+          <w:b/>
+          <w:bCs/>
         </w:rPr>
         <w:t>draftBooking</w:t>
       </w:r>
-      <w:proofErr w:type="spellEnd"/>
       <w:r>
         <w:rPr>
           <w:rFonts w:ascii="Garamond" w:hAnsi="Garamond"/>
@@ -9188,21 +9008,20 @@
         </w:rPr>
         <w:t xml:space="preserve">Before a booking can be confirmed, the frontend carries out a series of validation checks on the </w:t>
       </w:r>
-      <w:proofErr w:type="spellStart"/>
-      <w:r>
-        <w:rPr>
-          <w:rFonts w:ascii="Garamond" w:hAnsi="Garamond"/>
+      <w:r>
+        <w:rPr>
+          <w:rFonts w:ascii="Garamond" w:hAnsi="Garamond"/>
+          <w:b/>
+          <w:bCs/>
         </w:rPr>
         <w:t>draftBooking</w:t>
       </w:r>
-      <w:proofErr w:type="spellEnd"/>
       <w:r>
         <w:rPr>
           <w:rFonts w:ascii="Garamond" w:hAnsi="Garamond"/>
         </w:rPr>
         <w:t xml:space="preserve"> object using the </w:t>
       </w:r>
-      <w:proofErr w:type="spellStart"/>
       <w:r>
         <w:rPr>
           <w:rFonts w:ascii="Garamond" w:hAnsi="Garamond"/>
@@ -9211,7 +9030,6 @@
         </w:rPr>
         <w:t>preBookingChecks</w:t>
       </w:r>
-      <w:proofErr w:type="spellEnd"/>
       <w:r>
         <w:rPr>
           <w:rFonts w:ascii="Garamond" w:hAnsi="Garamond"/>
@@ -9248,7 +9066,6 @@
         </w:rPr>
         <w:t xml:space="preserve"> Draft bookings are sent to the backend in the </w:t>
       </w:r>
-      <w:proofErr w:type="spellStart"/>
       <w:r>
         <w:rPr>
           <w:rFonts w:ascii="Garamond" w:hAnsi="Garamond"/>
@@ -9258,7 +9075,6 @@
         <w:lastRenderedPageBreak/>
         <w:t>confirmDraftBooking</w:t>
       </w:r>
-      <w:proofErr w:type="spellEnd"/>
       <w:r>
         <w:rPr>
           <w:rFonts w:ascii="Garamond" w:hAnsi="Garamond"/>
@@ -9373,7 +9189,6 @@
         </w:rPr>
         <w:t xml:space="preserve">, the booking process is handled by the </w:t>
       </w:r>
-      <w:proofErr w:type="spellStart"/>
       <w:r>
         <w:rPr>
           <w:rFonts w:ascii="Garamond" w:hAnsi="Garamond"/>
@@ -9382,7 +9197,6 @@
         </w:rPr>
         <w:t>makeBooking</w:t>
       </w:r>
-      <w:proofErr w:type="spellEnd"/>
       <w:r>
         <w:rPr>
           <w:rFonts w:ascii="Garamond" w:hAnsi="Garamond"/>
@@ -9395,14 +9209,14 @@
         </w:rPr>
         <w:t xml:space="preserve">It receives the </w:t>
       </w:r>
-      <w:proofErr w:type="spellStart"/>
-      <w:r>
-        <w:rPr>
-          <w:rFonts w:ascii="Garamond" w:hAnsi="Garamond"/>
+      <w:r>
+        <w:rPr>
+          <w:rFonts w:ascii="Garamond" w:hAnsi="Garamond"/>
+          <w:b/>
+          <w:bCs/>
         </w:rPr>
         <w:t>draftBooking</w:t>
       </w:r>
-      <w:proofErr w:type="spellEnd"/>
       <w:r>
         <w:rPr>
           <w:rFonts w:ascii="Garamond" w:hAnsi="Garamond"/>
@@ -9447,21 +9261,35 @@
         </w:rPr>
         <w:t xml:space="preserve"> with any conformed bookings. Only if all checks pass is the booking inserted into database and the newly created booking, with booking id, is returned to frontend </w:t>
       </w:r>
-      <w:proofErr w:type="spellStart"/>
-      <w:r>
-        <w:rPr>
-          <w:rFonts w:ascii="Garamond" w:hAnsi="Garamond"/>
-          <w:b/>
-          <w:bCs/>
-        </w:rPr>
-        <w:t>tutorBookings</w:t>
-      </w:r>
-      <w:proofErr w:type="spellEnd"/>
-      <w:r>
-        <w:rPr>
-          <w:rFonts w:ascii="Garamond" w:hAnsi="Garamond"/>
-          <w:b/>
-          <w:bCs/>
+      <w:r>
+        <w:rPr>
+          <w:rFonts w:ascii="Garamond" w:hAnsi="Garamond"/>
+          <w:b/>
+          <w:bCs/>
+        </w:rPr>
+        <w:t xml:space="preserve">tutorBookings </w:t>
+      </w:r>
+      <w:r>
+        <w:rPr>
+          <w:rFonts w:ascii="Garamond" w:hAnsi="Garamond"/>
+        </w:rPr>
+        <w:t xml:space="preserve">state </w:t>
+      </w:r>
+      <w:r>
+        <w:rPr>
+          <w:rFonts w:ascii="Garamond" w:hAnsi="Garamond"/>
+        </w:rPr>
+        <w:t xml:space="preserve">for display on the </w:t>
+      </w:r>
+      <w:r>
+        <w:rPr>
+          <w:rFonts w:ascii="Garamond" w:hAnsi="Garamond"/>
+        </w:rPr>
+        <w:t>calendar.</w:t>
+      </w:r>
+      <w:r>
+        <w:rPr>
+          <w:rFonts w:ascii="Garamond" w:hAnsi="Garamond"/>
         </w:rPr>
         <w:t xml:space="preserve"> </w:t>
       </w:r>
@@ -9469,19 +9297,7 @@
         <w:rPr>
           <w:rFonts w:ascii="Garamond" w:hAnsi="Garamond"/>
         </w:rPr>
-        <w:t xml:space="preserve">state </w:t>
-      </w:r>
-      <w:r>
-        <w:rPr>
-          <w:rFonts w:ascii="Garamond" w:hAnsi="Garamond"/>
-        </w:rPr>
-        <w:t xml:space="preserve">for display on the </w:t>
-      </w:r>
-      <w:r>
-        <w:rPr>
-          <w:rFonts w:ascii="Garamond" w:hAnsi="Garamond"/>
-        </w:rPr>
-        <w:t>calendar.</w:t>
+        <w:t>This allows the calendar to display the confirmed booking immediately without another fetch.</w:t>
       </w:r>
       <w:r>
         <w:rPr>
@@ -9493,31 +9309,7 @@
         <w:rPr>
           <w:rFonts w:ascii="Garamond" w:hAnsi="Garamond"/>
         </w:rPr>
-        <w:t>This allows the calendar to display the confirmed booking immediately without another fetch.</w:t>
-      </w:r>
-      <w:r>
-        <w:rPr>
-          <w:rFonts w:ascii="Garamond" w:hAnsi="Garamond"/>
-        </w:rPr>
-        <w:t xml:space="preserve"> </w:t>
-      </w:r>
-      <w:r>
-        <w:rPr>
-          <w:rFonts w:ascii="Garamond" w:hAnsi="Garamond"/>
-        </w:rPr>
-        <w:t>These</w:t>
-      </w:r>
-      <w:r>
-        <w:rPr>
-          <w:rFonts w:ascii="Garamond" w:hAnsi="Garamond"/>
-        </w:rPr>
-        <w:t xml:space="preserve"> backend</w:t>
-      </w:r>
-      <w:r>
-        <w:rPr>
-          <w:rFonts w:ascii="Garamond" w:hAnsi="Garamond"/>
-        </w:rPr>
-        <w:t xml:space="preserve"> checks ensure that the backend is the </w:t>
+        <w:t xml:space="preserve">These backend checks ensure that the backend is the </w:t>
       </w:r>
       <w:r>
         <w:rPr>
@@ -9529,7 +9321,89 @@
         <w:rPr>
           <w:rFonts w:ascii="Garamond" w:hAnsi="Garamond"/>
         </w:rPr>
-        <w:t xml:space="preserve"> authority for making bookings</w:t>
+        <w:t xml:space="preserve"> authority for making bookings.</w:t>
+      </w:r>
+    </w:p>
+    <w:p>
+      <w:pPr>
+        <w:spacing w:line="360" w:lineRule="auto"/>
+        <w:rPr>
+          <w:rFonts w:ascii="Garamond" w:hAnsi="Garamond"/>
+        </w:rPr>
+      </w:pPr>
+      <w:r>
+        <w:rPr>
+          <w:rFonts w:ascii="Garamond" w:hAnsi="Garamond"/>
+        </w:rPr>
+        <w:t xml:space="preserve">The </w:t>
+      </w:r>
+      <w:r>
+        <w:rPr>
+          <w:rFonts w:ascii="Garamond" w:hAnsi="Garamond"/>
+          <w:b/>
+          <w:bCs/>
+        </w:rPr>
+        <w:t>BookingCalendar</w:t>
+      </w:r>
+      <w:r>
+        <w:rPr>
+          <w:rFonts w:ascii="Garamond" w:hAnsi="Garamond"/>
+        </w:rPr>
+        <w:t xml:space="preserve"> component also allows students to view the details of confirmed lessons. When clicking on a lesson, the </w:t>
+      </w:r>
+      <w:r>
+        <w:rPr>
+          <w:rFonts w:ascii="Garamond" w:hAnsi="Garamond"/>
+          <w:b/>
+          <w:bCs/>
+        </w:rPr>
+        <w:t>handleSelectEvent</w:t>
+      </w:r>
+      <w:r>
+        <w:rPr>
+          <w:rFonts w:ascii="Garamond" w:hAnsi="Garamond"/>
+        </w:rPr>
+        <w:t xml:space="preserve"> function sends a fetch request to obtain the full booking details from the database using the </w:t>
+      </w:r>
+      <w:r>
+        <w:rPr>
+          <w:rFonts w:ascii="Garamond" w:hAnsi="Garamond"/>
+          <w:b/>
+          <w:bCs/>
+        </w:rPr>
+        <w:t>booking_id</w:t>
+      </w:r>
+      <w:r>
+        <w:rPr>
+          <w:rFonts w:ascii="Garamond" w:hAnsi="Garamond"/>
+        </w:rPr>
+        <w:t>. The details are then displayed in a lessons-detail panel beneath the calendar.</w:t>
+      </w:r>
+    </w:p>
+    <w:p>
+      <w:pPr>
+        <w:spacing w:line="360" w:lineRule="auto"/>
+        <w:rPr>
+          <w:rFonts w:ascii="Garamond" w:hAnsi="Garamond"/>
+        </w:rPr>
+      </w:pPr>
+      <w:r>
+        <w:rPr>
+          <w:rFonts w:ascii="Garamond" w:hAnsi="Garamond"/>
+        </w:rPr>
+        <w:t>If a confirmed booking is selected, there is an option to cancel so long as the booking is not beginning within 24 hours. Th</w:t>
+      </w:r>
+      <w:r>
+        <w:rPr>
+          <w:rFonts w:ascii="Garamond" w:hAnsi="Garamond"/>
+        </w:rPr>
+        <w:t>is</w:t>
+      </w:r>
+      <w:r>
+        <w:rPr>
+          <w:rFonts w:ascii="Garamond" w:hAnsi="Garamond"/>
+        </w:rPr>
+        <w:t xml:space="preserve"> rule is enforced on the frontend by preventing clicking of the cancellation button, a warning message is displayed in the lesson-details panel, and these bookings are styled differently compared to bookings that can be cancelled (light blue vs dark blue)</w:t>
       </w:r>
       <w:r>
         <w:rPr>
@@ -9549,51 +9423,51 @@
         <w:rPr>
           <w:rFonts w:ascii="Garamond" w:hAnsi="Garamond"/>
         </w:rPr>
-        <w:t xml:space="preserve">The </w:t>
-      </w:r>
-      <w:proofErr w:type="spellStart"/>
-      <w:r>
-        <w:rPr>
-          <w:rFonts w:ascii="Garamond" w:hAnsi="Garamond"/>
-        </w:rPr>
-        <w:t>BookingCalendar</w:t>
-      </w:r>
-      <w:proofErr w:type="spellEnd"/>
-      <w:r>
-        <w:rPr>
-          <w:rFonts w:ascii="Garamond" w:hAnsi="Garamond"/>
-        </w:rPr>
-        <w:t xml:space="preserve"> component also allows students to view the details of confirmed lessons. When clicking on a lesson, the </w:t>
-      </w:r>
-      <w:proofErr w:type="spellStart"/>
-      <w:r>
-        <w:rPr>
-          <w:rFonts w:ascii="Garamond" w:hAnsi="Garamond"/>
-          <w:b/>
-          <w:bCs/>
-        </w:rPr>
-        <w:t>handleSelectEvent</w:t>
-      </w:r>
-      <w:proofErr w:type="spellEnd"/>
-      <w:r>
-        <w:rPr>
-          <w:rFonts w:ascii="Garamond" w:hAnsi="Garamond"/>
-        </w:rPr>
-        <w:t xml:space="preserve"> function sends a fetch request to obtain the full booking details from the database using the </w:t>
-      </w:r>
-      <w:proofErr w:type="spellStart"/>
-      <w:r>
-        <w:rPr>
-          <w:rFonts w:ascii="Garamond" w:hAnsi="Garamond"/>
-        </w:rPr>
-        <w:t>booking_id</w:t>
-      </w:r>
-      <w:proofErr w:type="spellEnd"/>
-      <w:r>
-        <w:rPr>
-          <w:rFonts w:ascii="Garamond" w:hAnsi="Garamond"/>
-        </w:rPr>
-        <w:t>. The details are then displayed in a lessons-detail panel beneath the calendar.</w:t>
+        <w:t>On</w:t>
+      </w:r>
+      <w:r>
+        <w:rPr>
+          <w:rFonts w:ascii="Garamond" w:hAnsi="Garamond"/>
+        </w:rPr>
+        <w:t xml:space="preserve"> the backend, cancellation requests are handled by the </w:t>
+      </w:r>
+      <w:r>
+        <w:rPr>
+          <w:rFonts w:ascii="Garamond" w:hAnsi="Garamond"/>
+          <w:b/>
+          <w:bCs/>
+        </w:rPr>
+        <w:t>cancelBookingById</w:t>
+      </w:r>
+      <w:r>
+        <w:rPr>
+          <w:rFonts w:ascii="Garamond" w:hAnsi="Garamond"/>
+        </w:rPr>
+        <w:t xml:space="preserve"> controller</w:t>
+      </w:r>
+      <w:r>
+        <w:rPr>
+          <w:rFonts w:ascii="Garamond" w:hAnsi="Garamond"/>
+        </w:rPr>
+        <w:t xml:space="preserve"> which validates the booking id, then updates the booking status to cancelled, via PATCH request, only if it exists in the database and starts in more than 24 hours (enforced using PostgreSQL interval function). </w:t>
+      </w:r>
+      <w:r>
+        <w:rPr>
+          <w:rFonts w:ascii="Garamond" w:hAnsi="Garamond"/>
+        </w:rPr>
+        <w:t>If no row update occurs, the controller runs various checks against the database in order to provide detailed responses to the frontend. If the cancellation is successful, the fro</w:t>
+      </w:r>
+      <w:r>
+        <w:rPr>
+          <w:rFonts w:ascii="Garamond" w:hAnsi="Garamond"/>
+        </w:rPr>
+        <w:t>n</w:t>
+      </w:r>
+      <w:r>
+        <w:rPr>
+          <w:rFonts w:ascii="Garamond" w:hAnsi="Garamond"/>
+        </w:rPr>
+        <w:t>tend removes the cancelled booking from state so the calendar display updates immediately.</w:t>
       </w:r>
     </w:p>
     <w:p>
@@ -9601,31 +9475,35 @@
         <w:spacing w:line="360" w:lineRule="auto"/>
         <w:rPr>
           <w:rFonts w:ascii="Garamond" w:hAnsi="Garamond"/>
-        </w:rPr>
-      </w:pPr>
-      <w:r>
-        <w:rPr>
-          <w:rFonts w:ascii="Garamond" w:hAnsi="Garamond"/>
-        </w:rPr>
-        <w:t>If a confirmed booking is selected, there is an option to cancel so long as the booking is not beginning within 24 hours. Th</w:t>
-      </w:r>
-      <w:r>
-        <w:rPr>
-          <w:rFonts w:ascii="Garamond" w:hAnsi="Garamond"/>
-        </w:rPr>
-        <w:t>is</w:t>
-      </w:r>
-      <w:r>
-        <w:rPr>
-          <w:rFonts w:ascii="Garamond" w:hAnsi="Garamond"/>
-        </w:rPr>
-        <w:t xml:space="preserve"> rule is enforced on the frontend by preventing clicking of the cancellation button, a warning message is displayed in the lesson-details panel, and these bookings are styled differently compared to bookings that can be cancelled (light blue vs dark blue)</w:t>
-      </w:r>
-      <w:r>
-        <w:rPr>
-          <w:rFonts w:ascii="Garamond" w:hAnsi="Garamond"/>
-        </w:rPr>
-        <w:t>.</w:t>
+          <w:b/>
+          <w:bCs/>
+        </w:rPr>
+      </w:pPr>
+      <w:r>
+        <w:rPr>
+          <w:rFonts w:ascii="Garamond" w:hAnsi="Garamond"/>
+        </w:rPr>
+        <w:t>Full functionality is summarise</w:t>
+      </w:r>
+      <w:r>
+        <w:rPr>
+          <w:rFonts w:ascii="Garamond" w:hAnsi="Garamond"/>
+        </w:rPr>
+        <w:t xml:space="preserve">d </w:t>
+      </w:r>
+      <w:r>
+        <w:rPr>
+          <w:rFonts w:ascii="Garamond" w:hAnsi="Garamond"/>
+        </w:rPr>
+        <w:t xml:space="preserve">in </w:t>
+      </w:r>
+      <w:r>
+        <w:rPr>
+          <w:rFonts w:ascii="Garamond" w:hAnsi="Garamond"/>
+          <w:b/>
+          <w:bCs/>
+        </w:rPr>
+        <w:t>Fig 3.2</w:t>
       </w:r>
     </w:p>
     <w:p>
@@ -9633,59 +9511,88 @@
         <w:spacing w:line="360" w:lineRule="auto"/>
         <w:rPr>
           <w:rFonts w:ascii="Garamond" w:hAnsi="Garamond"/>
-        </w:rPr>
-      </w:pPr>
-      <w:r>
-        <w:rPr>
-          <w:rFonts w:ascii="Garamond" w:hAnsi="Garamond"/>
-        </w:rPr>
-        <w:t>On</w:t>
-      </w:r>
-      <w:r>
-        <w:rPr>
-          <w:rFonts w:ascii="Garamond" w:hAnsi="Garamond"/>
-        </w:rPr>
-        <w:t xml:space="preserve"> the backend, cancellation requests are handled by the </w:t>
-      </w:r>
-      <w:proofErr w:type="spellStart"/>
-      <w:r>
-        <w:rPr>
-          <w:rFonts w:ascii="Garamond" w:hAnsi="Garamond"/>
-          <w:b/>
-          <w:bCs/>
-        </w:rPr>
-        <w:t>cancelBookingById</w:t>
-      </w:r>
-      <w:proofErr w:type="spellEnd"/>
-      <w:r>
-        <w:rPr>
-          <w:rFonts w:ascii="Garamond" w:hAnsi="Garamond"/>
-        </w:rPr>
-        <w:t xml:space="preserve"> controller</w:t>
-      </w:r>
-      <w:r>
-        <w:rPr>
-          <w:rFonts w:ascii="Garamond" w:hAnsi="Garamond"/>
-        </w:rPr>
-        <w:t xml:space="preserve"> which validates the booking id, then updates the booking status to cancelled, via PATCH request, only if it exists in the database and starts in more than 24 hours (enforced using PostgreSQL interval function). </w:t>
-      </w:r>
-      <w:r>
-        <w:rPr>
-          <w:rFonts w:ascii="Garamond" w:hAnsi="Garamond"/>
-        </w:rPr>
-        <w:t>If no row update occurs, the controller runs various checks against the database in order to provide detailed responses to the frontend. If the cancellation is successful, the fro</w:t>
-      </w:r>
-      <w:r>
-        <w:rPr>
-          <w:rFonts w:ascii="Garamond" w:hAnsi="Garamond"/>
-        </w:rPr>
-        <w:t>n</w:t>
-      </w:r>
-      <w:r>
-        <w:rPr>
-          <w:rFonts w:ascii="Garamond" w:hAnsi="Garamond"/>
-        </w:rPr>
-        <w:t>tend removes the cancelled booking from state so the calendar display updates immediately.</w:t>
+          <w:b/>
+          <w:bCs/>
+        </w:rPr>
+      </w:pPr>
+      <w:r>
+        <w:rPr>
+          <w:rFonts w:ascii="Garamond" w:hAnsi="Garamond"/>
+          <w:b/>
+          <w:bCs/>
+        </w:rPr>
+        <w:lastRenderedPageBreak/>
+        <w:drawing>
+          <wp:inline distT="0" distB="0" distL="0" distR="0" wp14:anchorId="141DB5F0" wp14:editId="0BC63590">
+            <wp:extent cx="5303520" cy="8898237"/>
+            <wp:effectExtent l="0" t="0" r="0" b="0"/>
+            <wp:docPr id="1975675822" name="Picture 2"/>
+            <wp:cNvGraphicFramePr>
+              <a:graphicFrameLocks xmlns:a="http://schemas.openxmlformats.org/drawingml/2006/main" noChangeAspect="1"/>
+            </wp:cNvGraphicFramePr>
+            <a:graphic xmlns:a="http://schemas.openxmlformats.org/drawingml/2006/main">
+              <a:graphicData uri="http://schemas.openxmlformats.org/drawingml/2006/picture">
+                <pic:pic xmlns:pic="http://schemas.openxmlformats.org/drawingml/2006/picture">
+                  <pic:nvPicPr>
+                    <pic:cNvPr id="0" name="Picture 6"/>
+                    <pic:cNvPicPr>
+                      <a:picLocks noChangeAspect="1" noChangeArrowheads="1"/>
+                    </pic:cNvPicPr>
+                  </pic:nvPicPr>
+                  <pic:blipFill>
+                    <a:blip r:embed="rId7" cstate="print">
+                      <a:extLst>
+                        <a:ext uri="{28A0092B-C50C-407E-A947-70E740481C1C}">
+                          <a14:useLocalDpi xmlns:a14="http://schemas.microsoft.com/office/drawing/2010/main" val="0"/>
+                        </a:ext>
+                      </a:extLst>
+                    </a:blip>
+                    <a:srcRect/>
+                    <a:stretch>
+                      <a:fillRect/>
+                    </a:stretch>
+                  </pic:blipFill>
+                  <pic:spPr bwMode="auto">
+                    <a:xfrm>
+                      <a:off x="0" y="0"/>
+                      <a:ext cx="5308042" cy="8905825"/>
+                    </a:xfrm>
+                    <a:prstGeom prst="rect">
+                      <a:avLst/>
+                    </a:prstGeom>
+                    <a:noFill/>
+                    <a:ln>
+                      <a:noFill/>
+                    </a:ln>
+                  </pic:spPr>
+                </pic:pic>
+              </a:graphicData>
+            </a:graphic>
+          </wp:inline>
+        </w:drawing>
+      </w:r>
+    </w:p>
+    <w:p>
+      <w:pPr>
+        <w:spacing w:line="360" w:lineRule="auto"/>
+        <w:ind w:left="720" w:firstLine="720"/>
+        <w:rPr>
+          <w:rFonts w:ascii="Garamond" w:hAnsi="Garamond"/>
+        </w:rPr>
+      </w:pPr>
+      <w:r>
+        <w:rPr>
+          <w:rFonts w:ascii="Garamond" w:hAnsi="Garamond"/>
+          <w:b/>
+          <w:bCs/>
+        </w:rPr>
+        <w:t xml:space="preserve">Fig 3.2: </w:t>
+      </w:r>
+      <w:r>
+        <w:rPr>
+          <w:rFonts w:ascii="Garamond" w:hAnsi="Garamond"/>
+        </w:rPr>
+        <w:t>Lesson booking, confirmation, data retrieval, and cancellation</w:t>
       </w:r>
     </w:p>
     <w:p>
@@ -9711,6 +9618,7 @@
           <w:sz w:val="22"/>
           <w:szCs w:val="22"/>
         </w:rPr>
+        <w:lastRenderedPageBreak/>
         <w:t>3.2.</w:t>
       </w:r>
       <w:r>
@@ -9733,9 +9641,1608 @@
           <w:sz w:val="22"/>
           <w:szCs w:val="22"/>
         </w:rPr>
-        <w:t xml:space="preserve"> Webchat</w:t>
+        <w:t xml:space="preserve"> </w:t>
       </w:r>
       <w:bookmarkEnd w:id="27"/>
+      <w:r>
+        <w:rPr>
+          <w:rFonts w:ascii="Garamond" w:hAnsi="Garamond"/>
+          <w:b/>
+          <w:bCs/>
+          <w:color w:val="215E99" w:themeColor="text2" w:themeTint="BF"/>
+          <w:sz w:val="22"/>
+          <w:szCs w:val="22"/>
+        </w:rPr>
+        <w:t>Real-time messaging</w:t>
+      </w:r>
+      <w:r>
+        <w:rPr>
+          <w:rFonts w:ascii="Garamond" w:hAnsi="Garamond"/>
+          <w:b/>
+          <w:bCs/>
+          <w:color w:val="215E99" w:themeColor="text2" w:themeTint="BF"/>
+          <w:sz w:val="22"/>
+          <w:szCs w:val="22"/>
+        </w:rPr>
+        <w:t xml:space="preserve"> [39,40,41,42,43,44,45,46,47,48]</w:t>
+      </w:r>
+    </w:p>
+    <w:p>
+      <w:pPr>
+        <w:spacing w:line="360" w:lineRule="auto"/>
+        <w:rPr>
+          <w:rFonts w:ascii="Garamond" w:hAnsi="Garamond"/>
+        </w:rPr>
+      </w:pPr>
+      <w:r>
+        <w:rPr>
+          <w:rFonts w:ascii="Garamond" w:hAnsi="Garamond"/>
+        </w:rPr>
+        <w:t xml:space="preserve">The webchat system </w:t>
+      </w:r>
+      <w:r>
+        <w:rPr>
+          <w:rFonts w:ascii="Garamond" w:hAnsi="Garamond"/>
+        </w:rPr>
+        <w:t xml:space="preserve">combines </w:t>
+      </w:r>
+      <w:r>
+        <w:rPr>
+          <w:rFonts w:ascii="Garamond" w:hAnsi="Garamond"/>
+        </w:rPr>
+        <w:t xml:space="preserve">HTTP request-response </w:t>
+      </w:r>
+      <w:r>
+        <w:rPr>
+          <w:rFonts w:ascii="Garamond" w:hAnsi="Garamond"/>
+        </w:rPr>
+        <w:t>and</w:t>
+      </w:r>
+      <w:r>
+        <w:rPr>
+          <w:rFonts w:ascii="Garamond" w:hAnsi="Garamond"/>
+        </w:rPr>
+        <w:t xml:space="preserve"> Socket.io. HTTP is used </w:t>
+      </w:r>
+      <w:r>
+        <w:rPr>
+          <w:rFonts w:ascii="Garamond" w:hAnsi="Garamond"/>
+        </w:rPr>
+        <w:t xml:space="preserve">for authenticated </w:t>
+      </w:r>
+      <w:r>
+        <w:rPr>
+          <w:rFonts w:ascii="Garamond" w:hAnsi="Garamond"/>
+        </w:rPr>
+        <w:t>retriev</w:t>
+      </w:r>
+      <w:r>
+        <w:rPr>
+          <w:rFonts w:ascii="Garamond" w:hAnsi="Garamond"/>
+        </w:rPr>
+        <w:t xml:space="preserve">al of </w:t>
+      </w:r>
+      <w:r>
+        <w:rPr>
+          <w:rFonts w:ascii="Garamond" w:hAnsi="Garamond"/>
+        </w:rPr>
+        <w:t>stored conversation history and inbox summaries from the database, and Socket.io handles</w:t>
+      </w:r>
+      <w:r>
+        <w:rPr>
+          <w:rFonts w:ascii="Garamond" w:hAnsi="Garamond"/>
+        </w:rPr>
+        <w:t xml:space="preserve"> real-time communication and instant notifications. </w:t>
+      </w:r>
+      <w:r>
+        <w:rPr>
+          <w:rFonts w:ascii="Garamond" w:hAnsi="Garamond"/>
+        </w:rPr>
+        <w:t xml:space="preserve">This arrangement separates chat history from live interactions. </w:t>
+      </w:r>
+      <w:r>
+        <w:rPr>
+          <w:rFonts w:ascii="Garamond" w:hAnsi="Garamond"/>
+        </w:rPr>
+        <w:t xml:space="preserve"> The functionality is created through a series of complimentary event listeners and emitters on front and back end. Listeners take the form socket.on() or io.on() and emitters socket.emit() or io.emit().</w:t>
+      </w:r>
+    </w:p>
+    <w:p>
+      <w:pPr>
+        <w:spacing w:line="360" w:lineRule="auto"/>
+        <w:rPr>
+          <w:rFonts w:ascii="Garamond" w:hAnsi="Garamond"/>
+        </w:rPr>
+      </w:pPr>
+      <w:r>
+        <w:rPr>
+          <w:rFonts w:ascii="Garamond" w:hAnsi="Garamond"/>
+        </w:rPr>
+        <w:t xml:space="preserve">On the frontend, the </w:t>
+      </w:r>
+      <w:r>
+        <w:rPr>
+          <w:rFonts w:ascii="Garamond" w:hAnsi="Garamond"/>
+          <w:b/>
+          <w:bCs/>
+        </w:rPr>
+        <w:t>Main.jsx</w:t>
+      </w:r>
+      <w:r>
+        <w:rPr>
+          <w:rFonts w:ascii="Garamond" w:hAnsi="Garamond"/>
+        </w:rPr>
+        <w:t xml:space="preserve"> component acts as the top-level component for real-time messaging functionality. It provides </w:t>
+      </w:r>
+      <w:r>
+        <w:rPr>
+          <w:rFonts w:ascii="Garamond" w:hAnsi="Garamond"/>
+          <w:b/>
+          <w:bCs/>
+        </w:rPr>
+        <w:t>UserContext</w:t>
+      </w:r>
+      <w:r>
+        <w:rPr>
+          <w:rFonts w:ascii="Garamond" w:hAnsi="Garamond"/>
+        </w:rPr>
+        <w:t xml:space="preserve"> and </w:t>
+      </w:r>
+      <w:r>
+        <w:rPr>
+          <w:rFonts w:ascii="Garamond" w:hAnsi="Garamond"/>
+          <w:b/>
+          <w:bCs/>
+        </w:rPr>
+        <w:t>ChatContext</w:t>
+      </w:r>
+      <w:r>
+        <w:rPr>
+          <w:rFonts w:ascii="Garamond" w:hAnsi="Garamond"/>
+        </w:rPr>
+        <w:t xml:space="preserve"> which allow user and chat state to be shared across the application and conditionally renders the </w:t>
+      </w:r>
+      <w:r>
+        <w:rPr>
+          <w:rFonts w:ascii="Garamond" w:hAnsi="Garamond"/>
+          <w:b/>
+          <w:bCs/>
+        </w:rPr>
+        <w:t>ChatNotifier</w:t>
+      </w:r>
+      <w:r>
+        <w:rPr>
+          <w:rFonts w:ascii="Garamond" w:hAnsi="Garamond"/>
+        </w:rPr>
+        <w:t xml:space="preserve">, </w:t>
+      </w:r>
+      <w:r>
+        <w:rPr>
+          <w:rFonts w:ascii="Garamond" w:hAnsi="Garamond"/>
+          <w:b/>
+          <w:bCs/>
+        </w:rPr>
+        <w:t>ChatMessagesIcon</w:t>
+      </w:r>
+      <w:r>
+        <w:rPr>
+          <w:rFonts w:ascii="Garamond" w:hAnsi="Garamond"/>
+        </w:rPr>
+        <w:t xml:space="preserve">, and </w:t>
+      </w:r>
+      <w:r>
+        <w:rPr>
+          <w:rFonts w:ascii="Garamond" w:hAnsi="Garamond"/>
+          <w:b/>
+          <w:bCs/>
+        </w:rPr>
+        <w:t>MessagesDrawer</w:t>
+      </w:r>
+      <w:r>
+        <w:rPr>
+          <w:rFonts w:ascii="Garamond" w:hAnsi="Garamond"/>
+        </w:rPr>
+        <w:t xml:space="preserve"> components only if a user is logged in. </w:t>
+      </w:r>
+      <w:r>
+        <w:rPr>
+          <w:rFonts w:ascii="Garamond" w:hAnsi="Garamond"/>
+          <w:b/>
+          <w:bCs/>
+        </w:rPr>
+        <w:t>Main.jsx</w:t>
+      </w:r>
+      <w:r>
+        <w:rPr>
+          <w:rFonts w:ascii="Garamond" w:hAnsi="Garamond"/>
+        </w:rPr>
+        <w:t xml:space="preserve"> also manages the socket.io client connection with a </w:t>
+      </w:r>
+      <w:r>
+        <w:rPr>
+          <w:rFonts w:ascii="Garamond" w:hAnsi="Garamond"/>
+          <w:b/>
+          <w:bCs/>
+        </w:rPr>
+        <w:t>useEffect</w:t>
+      </w:r>
+      <w:r>
+        <w:rPr>
+          <w:rFonts w:ascii="Garamond" w:hAnsi="Garamond"/>
+        </w:rPr>
+        <w:t xml:space="preserve"> hook dependant on </w:t>
+      </w:r>
+      <w:r>
+        <w:rPr>
+          <w:rFonts w:ascii="Garamond" w:hAnsi="Garamond"/>
+          <w:b/>
+          <w:bCs/>
+        </w:rPr>
+        <w:t>user</w:t>
+      </w:r>
+      <w:r>
+        <w:rPr>
+          <w:rFonts w:ascii="Garamond" w:hAnsi="Garamond"/>
+        </w:rPr>
+        <w:t xml:space="preserve"> login status. When a user is logs in, the client connects</w:t>
+      </w:r>
+      <w:r>
+        <w:rPr>
+          <w:rFonts w:ascii="Garamond" w:hAnsi="Garamond"/>
+        </w:rPr>
+        <w:t xml:space="preserve"> using the app’s </w:t>
+      </w:r>
+      <w:r>
+        <w:rPr>
+          <w:rFonts w:ascii="Garamond" w:hAnsi="Garamond"/>
+          <w:b/>
+          <w:bCs/>
+        </w:rPr>
+        <w:t>socket.mjs</w:t>
+      </w:r>
+      <w:r>
+        <w:rPr>
+          <w:rFonts w:ascii="Garamond" w:hAnsi="Garamond"/>
+        </w:rPr>
+        <w:t xml:space="preserve"> socket instance.</w:t>
+      </w:r>
+      <w:r>
+        <w:rPr>
+          <w:rFonts w:ascii="Garamond" w:hAnsi="Garamond"/>
+        </w:rPr>
+        <w:t xml:space="preserve"> </w:t>
+      </w:r>
+      <w:r>
+        <w:rPr>
+          <w:rFonts w:ascii="Garamond" w:hAnsi="Garamond"/>
+        </w:rPr>
+        <w:t>W</w:t>
+      </w:r>
+      <w:r>
+        <w:rPr>
+          <w:rFonts w:ascii="Garamond" w:hAnsi="Garamond"/>
+        </w:rPr>
+        <w:t>hen a user logs out, the socket disconnects.  This ensures that real-time messaging is only available to authenticated users and that connections are not kept after logout.</w:t>
+      </w:r>
+    </w:p>
+    <w:p>
+      <w:pPr>
+        <w:spacing w:line="360" w:lineRule="auto"/>
+        <w:rPr>
+          <w:rFonts w:ascii="Garamond" w:hAnsi="Garamond"/>
+        </w:rPr>
+      </w:pPr>
+      <w:r>
+        <w:rPr>
+          <w:rFonts w:ascii="Garamond" w:hAnsi="Garamond"/>
+        </w:rPr>
+        <w:t>Webchat a</w:t>
+      </w:r>
+      <w:r>
+        <w:rPr>
+          <w:rFonts w:ascii="Garamond" w:hAnsi="Garamond"/>
+        </w:rPr>
+        <w:t xml:space="preserve">uthentication relies on the </w:t>
+      </w:r>
+      <w:r>
+        <w:rPr>
+          <w:rFonts w:ascii="Garamond" w:hAnsi="Garamond"/>
+          <w:b/>
+          <w:bCs/>
+        </w:rPr>
+        <w:t>JWT</w:t>
+      </w:r>
+      <w:r>
+        <w:rPr>
+          <w:rFonts w:ascii="Garamond" w:hAnsi="Garamond"/>
+        </w:rPr>
+        <w:t xml:space="preserve"> stored in an http-only cookie, but express and socket.io handle it differently. For http requests, protected chat-history routes use the </w:t>
+      </w:r>
+      <w:r>
+        <w:rPr>
+          <w:rFonts w:ascii="Garamond" w:hAnsi="Garamond"/>
+          <w:b/>
+          <w:bCs/>
+        </w:rPr>
+        <w:t>protect</w:t>
+      </w:r>
+      <w:r>
+        <w:rPr>
+          <w:rFonts w:ascii="Garamond" w:hAnsi="Garamond"/>
+        </w:rPr>
+        <w:t xml:space="preserve"> middleware which reads the </w:t>
+      </w:r>
+      <w:r>
+        <w:rPr>
+          <w:rFonts w:ascii="Garamond" w:hAnsi="Garamond"/>
+          <w:b/>
+          <w:bCs/>
+        </w:rPr>
+        <w:t>token</w:t>
+      </w:r>
+      <w:r>
+        <w:rPr>
+          <w:rFonts w:ascii="Garamond" w:hAnsi="Garamond"/>
+        </w:rPr>
+        <w:t xml:space="preserve"> cookie from </w:t>
+      </w:r>
+      <w:r>
+        <w:rPr>
+          <w:rFonts w:ascii="Garamond" w:hAnsi="Garamond"/>
+          <w:b/>
+          <w:bCs/>
+        </w:rPr>
+        <w:t>req.cookies</w:t>
+      </w:r>
+      <w:r>
+        <w:rPr>
+          <w:rFonts w:ascii="Garamond" w:hAnsi="Garamond"/>
+        </w:rPr>
+        <w:t xml:space="preserve">, verifies it and retrieves the matching user from the database and attaches user info to </w:t>
+      </w:r>
+      <w:r>
+        <w:rPr>
+          <w:rFonts w:ascii="Garamond" w:hAnsi="Garamond"/>
+          <w:b/>
+          <w:bCs/>
+        </w:rPr>
+        <w:t>req.user</w:t>
+      </w:r>
+      <w:r>
+        <w:rPr>
+          <w:rFonts w:ascii="Garamond" w:hAnsi="Garamond"/>
+        </w:rPr>
+        <w:t xml:space="preserve"> using the </w:t>
+      </w:r>
+      <w:r>
+        <w:rPr>
+          <w:rFonts w:ascii="Garamond" w:hAnsi="Garamond"/>
+          <w:b/>
+          <w:bCs/>
+        </w:rPr>
+        <w:t>buildUserInfo</w:t>
+      </w:r>
+      <w:r>
+        <w:rPr>
+          <w:rFonts w:ascii="Garamond" w:hAnsi="Garamond"/>
+        </w:rPr>
+        <w:t xml:space="preserve"> function.</w:t>
+      </w:r>
+      <w:r>
+        <w:rPr>
+          <w:rFonts w:ascii="Garamond" w:hAnsi="Garamond"/>
+        </w:rPr>
+        <w:t xml:space="preserve"> Subsequent route controllers can treat the request as authenticated and access the user info</w:t>
+      </w:r>
+      <w:r>
+        <w:rPr>
+          <w:rFonts w:ascii="Garamond" w:hAnsi="Garamond"/>
+        </w:rPr>
+        <w:t xml:space="preserve"> for their own authentication needs</w:t>
+      </w:r>
+      <w:r>
+        <w:rPr>
+          <w:rFonts w:ascii="Garamond" w:hAnsi="Garamond"/>
+        </w:rPr>
+        <w:t>.</w:t>
+      </w:r>
+    </w:p>
+    <w:p>
+      <w:pPr>
+        <w:spacing w:line="360" w:lineRule="auto"/>
+        <w:rPr>
+          <w:rFonts w:ascii="Garamond" w:hAnsi="Garamond"/>
+        </w:rPr>
+      </w:pPr>
+      <w:r>
+        <w:rPr>
+          <w:rFonts w:ascii="Garamond" w:hAnsi="Garamond"/>
+        </w:rPr>
+        <w:t xml:space="preserve">Because socket.io cannot access request and response objects, custom middleware is used. In </w:t>
+      </w:r>
+      <w:r>
+        <w:rPr>
+          <w:rFonts w:ascii="Garamond" w:hAnsi="Garamond"/>
+          <w:b/>
+          <w:bCs/>
+        </w:rPr>
+        <w:t>server.mjs</w:t>
+      </w:r>
+      <w:r>
+        <w:rPr>
+          <w:rFonts w:ascii="Garamond" w:hAnsi="Garamond"/>
+        </w:rPr>
+        <w:t xml:space="preserve">, the </w:t>
+      </w:r>
+      <w:r>
+        <w:rPr>
+          <w:rFonts w:ascii="Garamond" w:hAnsi="Garamond"/>
+          <w:b/>
+          <w:bCs/>
+        </w:rPr>
+        <w:t>io.use()</w:t>
+      </w:r>
+      <w:r>
+        <w:rPr>
+          <w:rFonts w:ascii="Garamond" w:hAnsi="Garamond"/>
+        </w:rPr>
+        <w:t xml:space="preserve"> middleware reads the cookie from </w:t>
+      </w:r>
+      <w:r>
+        <w:rPr>
+          <w:rFonts w:ascii="Garamond" w:hAnsi="Garamond"/>
+          <w:b/>
+          <w:bCs/>
+        </w:rPr>
+        <w:t>socket.handshake.headers.</w:t>
+      </w:r>
+      <w:r>
+        <w:rPr>
+          <w:rFonts w:ascii="Garamond" w:hAnsi="Garamond"/>
+        </w:rPr>
+        <w:t>cookie</w:t>
+      </w:r>
+      <w:r>
+        <w:rPr>
+          <w:rFonts w:ascii="Garamond" w:hAnsi="Garamond"/>
+        </w:rPr>
+        <w:t xml:space="preserve">, </w:t>
+      </w:r>
+      <w:r>
+        <w:rPr>
+          <w:rFonts w:ascii="Garamond" w:hAnsi="Garamond"/>
+        </w:rPr>
+        <w:t>extracts</w:t>
+      </w:r>
+      <w:r>
+        <w:rPr>
+          <w:rFonts w:ascii="Garamond" w:hAnsi="Garamond"/>
+        </w:rPr>
+        <w:t xml:space="preserve"> the cookie payload, verifies it, and, as above, retrieves matching user</w:t>
+      </w:r>
+      <w:r>
+        <w:rPr>
+          <w:rFonts w:ascii="Garamond" w:hAnsi="Garamond"/>
+        </w:rPr>
+        <w:t xml:space="preserve"> info</w:t>
+      </w:r>
+      <w:r>
+        <w:rPr>
+          <w:rFonts w:ascii="Garamond" w:hAnsi="Garamond"/>
+        </w:rPr>
+        <w:t xml:space="preserve"> from the database and attache</w:t>
+      </w:r>
+      <w:r>
+        <w:rPr>
+          <w:rFonts w:ascii="Garamond" w:hAnsi="Garamond"/>
+        </w:rPr>
+        <w:t>s it</w:t>
+      </w:r>
+      <w:r>
+        <w:rPr>
+          <w:rFonts w:ascii="Garamond" w:hAnsi="Garamond"/>
+        </w:rPr>
+        <w:t xml:space="preserve"> to </w:t>
+      </w:r>
+      <w:r>
+        <w:rPr>
+          <w:rFonts w:ascii="Garamond" w:hAnsi="Garamond"/>
+          <w:b/>
+          <w:bCs/>
+        </w:rPr>
+        <w:t>socket.user</w:t>
+      </w:r>
+      <w:r>
+        <w:rPr>
+          <w:rFonts w:ascii="Garamond" w:hAnsi="Garamond"/>
+        </w:rPr>
+        <w:t xml:space="preserve"> using the </w:t>
+      </w:r>
+      <w:r>
+        <w:rPr>
+          <w:rFonts w:ascii="Garamond" w:hAnsi="Garamond"/>
+          <w:b/>
+          <w:bCs/>
+        </w:rPr>
+        <w:t>buil</w:t>
+      </w:r>
+      <w:r>
+        <w:rPr>
+          <w:rFonts w:ascii="Garamond" w:hAnsi="Garamond"/>
+          <w:b/>
+          <w:bCs/>
+        </w:rPr>
+        <w:t>d</w:t>
+      </w:r>
+      <w:r>
+        <w:rPr>
+          <w:rFonts w:ascii="Garamond" w:hAnsi="Garamond"/>
+          <w:b/>
+          <w:bCs/>
+        </w:rPr>
+        <w:t>UserInfo</w:t>
+      </w:r>
+      <w:r>
+        <w:rPr>
+          <w:rFonts w:ascii="Garamond" w:hAnsi="Garamond"/>
+        </w:rPr>
+        <w:t xml:space="preserve"> function.</w:t>
+      </w:r>
+      <w:r>
+        <w:rPr>
+          <w:rFonts w:ascii="Garamond" w:hAnsi="Garamond"/>
+        </w:rPr>
+        <w:t xml:space="preserve"> If no matching user is found, the connection is rejected. To </w:t>
+      </w:r>
+      <w:r>
+        <w:rPr>
+          <w:rFonts w:ascii="Garamond" w:hAnsi="Garamond"/>
+        </w:rPr>
+        <w:t>support</w:t>
+      </w:r>
+      <w:r>
+        <w:rPr>
+          <w:rFonts w:ascii="Garamond" w:hAnsi="Garamond"/>
+        </w:rPr>
+        <w:t xml:space="preserve"> this authentication, the frontend’s socket instance is configured to send credentials</w:t>
+      </w:r>
+      <w:r>
+        <w:rPr>
+          <w:rFonts w:ascii="Garamond" w:hAnsi="Garamond"/>
+        </w:rPr>
+        <w:t xml:space="preserve"> during the handshake</w:t>
+      </w:r>
+      <w:r>
+        <w:rPr>
+          <w:rFonts w:ascii="Garamond" w:hAnsi="Garamond"/>
+        </w:rPr>
+        <w:t xml:space="preserve"> and </w:t>
+      </w:r>
+      <w:r>
+        <w:rPr>
+          <w:rFonts w:ascii="Garamond" w:hAnsi="Garamond"/>
+          <w:b/>
+          <w:bCs/>
+        </w:rPr>
+        <w:t>not</w:t>
+      </w:r>
+      <w:r>
+        <w:rPr>
+          <w:rFonts w:ascii="Garamond" w:hAnsi="Garamond"/>
+        </w:rPr>
+        <w:t xml:space="preserve"> to autoconnect.</w:t>
+      </w:r>
+    </w:p>
+    <w:p>
+      <w:pPr>
+        <w:spacing w:line="360" w:lineRule="auto"/>
+        <w:rPr>
+          <w:rFonts w:ascii="Garamond" w:hAnsi="Garamond"/>
+        </w:rPr>
+      </w:pPr>
+      <w:r>
+        <w:rPr>
+          <w:rFonts w:ascii="Garamond" w:hAnsi="Garamond"/>
+        </w:rPr>
+        <w:t xml:space="preserve">Once a socket has been authenticated, the backend’s </w:t>
+      </w:r>
+      <w:r>
+        <w:rPr>
+          <w:rFonts w:ascii="Garamond" w:hAnsi="Garamond"/>
+          <w:b/>
+          <w:bCs/>
+        </w:rPr>
+        <w:t>io.on(‘connection’)</w:t>
+      </w:r>
+      <w:r>
+        <w:rPr>
+          <w:rFonts w:ascii="Garamond" w:hAnsi="Garamond"/>
+        </w:rPr>
+        <w:t xml:space="preserve"> handler uses the authenticated </w:t>
+      </w:r>
+      <w:r>
+        <w:rPr>
+          <w:rFonts w:ascii="Garamond" w:hAnsi="Garamond"/>
+          <w:b/>
+          <w:bCs/>
+        </w:rPr>
+        <w:t>socket.user</w:t>
+      </w:r>
+      <w:r>
+        <w:rPr>
+          <w:rFonts w:ascii="Garamond" w:hAnsi="Garamond"/>
+        </w:rPr>
+        <w:t xml:space="preserve"> object to identify the logged-in user and to create a personalised</w:t>
+      </w:r>
+      <w:r>
+        <w:rPr>
+          <w:rFonts w:ascii="Garamond" w:hAnsi="Garamond"/>
+        </w:rPr>
+        <w:t>, private</w:t>
+      </w:r>
+      <w:r>
+        <w:rPr>
+          <w:rFonts w:ascii="Garamond" w:hAnsi="Garamond"/>
+        </w:rPr>
+        <w:t xml:space="preserve"> </w:t>
+      </w:r>
+      <w:r>
+        <w:rPr>
+          <w:rFonts w:ascii="Garamond" w:hAnsi="Garamond"/>
+          <w:b/>
+          <w:bCs/>
+        </w:rPr>
+        <w:t>room</w:t>
+      </w:r>
+      <w:r>
+        <w:rPr>
+          <w:rFonts w:ascii="Garamond" w:hAnsi="Garamond"/>
+        </w:rPr>
+        <w:t xml:space="preserve"> named </w:t>
+      </w:r>
+      <w:r>
+        <w:rPr>
+          <w:rFonts w:ascii="Garamond" w:hAnsi="Garamond"/>
+        </w:rPr>
+        <w:t xml:space="preserve">using their user id e.g. </w:t>
+      </w:r>
+      <w:r>
+        <w:rPr>
+          <w:rFonts w:ascii="Garamond" w:hAnsi="Garamond"/>
+          <w:b/>
+          <w:bCs/>
+        </w:rPr>
+        <w:t>user:</w:t>
+      </w:r>
+      <w:r>
+        <w:rPr>
+          <w:rFonts w:ascii="Garamond" w:hAnsi="Garamond"/>
+          <w:b/>
+          <w:bCs/>
+        </w:rPr>
+        <w:t xml:space="preserve">12 </w:t>
+      </w:r>
+      <w:r>
+        <w:rPr>
+          <w:rFonts w:ascii="Garamond" w:hAnsi="Garamond"/>
+        </w:rPr>
+        <w:t>which is used for notifying them of messages received from any other user.</w:t>
+      </w:r>
+      <w:r>
+        <w:rPr>
+          <w:rFonts w:ascii="Garamond" w:hAnsi="Garamond"/>
+        </w:rPr>
+        <w:t xml:space="preserve"> Crucially, the server also initialises </w:t>
+      </w:r>
+      <w:r>
+        <w:rPr>
+          <w:rFonts w:ascii="Garamond" w:hAnsi="Garamond"/>
+          <w:b/>
+          <w:bCs/>
+        </w:rPr>
+        <w:t>socket.data.dmPeers</w:t>
+      </w:r>
+      <w:r>
+        <w:rPr>
+          <w:rFonts w:ascii="Garamond" w:hAnsi="Garamond"/>
+        </w:rPr>
+        <w:t xml:space="preserve"> which is used to store the direct-message room</w:t>
+      </w:r>
+      <w:r>
+        <w:rPr>
+          <w:rFonts w:ascii="Garamond" w:hAnsi="Garamond"/>
+        </w:rPr>
+        <w:t xml:space="preserve"> names </w:t>
+      </w:r>
+      <w:r>
+        <w:rPr>
+          <w:rFonts w:ascii="Garamond" w:hAnsi="Garamond"/>
+        </w:rPr>
+        <w:t>between student and tutors.</w:t>
+      </w:r>
+    </w:p>
+    <w:p>
+      <w:pPr>
+        <w:spacing w:line="360" w:lineRule="auto"/>
+        <w:rPr>
+          <w:rFonts w:ascii="Garamond" w:hAnsi="Garamond"/>
+        </w:rPr>
+      </w:pPr>
+      <w:r>
+        <w:rPr>
+          <w:rFonts w:ascii="Garamond" w:hAnsi="Garamond"/>
+        </w:rPr>
+        <w:t xml:space="preserve">A conversation room is created only when the student opens a chat window in the frontend via the ‘message tutor’ button in the </w:t>
+      </w:r>
+      <w:r>
+        <w:rPr>
+          <w:rFonts w:ascii="Garamond" w:hAnsi="Garamond"/>
+          <w:b/>
+          <w:bCs/>
+        </w:rPr>
+        <w:t>FocusedTutorCard</w:t>
+      </w:r>
+      <w:r>
+        <w:rPr>
+          <w:rFonts w:ascii="Garamond" w:hAnsi="Garamond"/>
+        </w:rPr>
+        <w:t xml:space="preserve"> component. The button can only be clicked if a student is logged in and it opens the </w:t>
+      </w:r>
+      <w:r>
+        <w:rPr>
+          <w:rFonts w:ascii="Garamond" w:hAnsi="Garamond"/>
+          <w:b/>
+          <w:bCs/>
+        </w:rPr>
+        <w:t>ChatWindow</w:t>
+      </w:r>
+      <w:r>
+        <w:rPr>
+          <w:rFonts w:ascii="Garamond" w:hAnsi="Garamond"/>
+        </w:rPr>
+        <w:t xml:space="preserve"> component. Once opened, this component emits the </w:t>
+      </w:r>
+      <w:r>
+        <w:rPr>
+          <w:rFonts w:ascii="Garamond" w:hAnsi="Garamond"/>
+          <w:b/>
+          <w:bCs/>
+        </w:rPr>
+        <w:t>join_room</w:t>
+      </w:r>
+      <w:r>
+        <w:rPr>
+          <w:rFonts w:ascii="Garamond" w:hAnsi="Garamond"/>
+        </w:rPr>
+        <w:t xml:space="preserve"> event</w:t>
+      </w:r>
+      <w:r>
+        <w:rPr>
+          <w:rFonts w:ascii="Garamond" w:hAnsi="Garamond"/>
+        </w:rPr>
+        <w:t xml:space="preserve">, sending </w:t>
+      </w:r>
+      <w:r>
+        <w:rPr>
+          <w:rFonts w:ascii="Garamond" w:hAnsi="Garamond"/>
+        </w:rPr>
+        <w:t xml:space="preserve">the </w:t>
+      </w:r>
+      <w:r>
+        <w:rPr>
+          <w:rFonts w:ascii="Garamond" w:hAnsi="Garamond"/>
+        </w:rPr>
+        <w:t>intended recipient/</w:t>
+      </w:r>
+      <w:r>
+        <w:rPr>
+          <w:rFonts w:ascii="Garamond" w:hAnsi="Garamond"/>
+        </w:rPr>
+        <w:t xml:space="preserve">tutor’s user id (loaded in </w:t>
+      </w:r>
+      <w:r>
+        <w:rPr>
+          <w:rFonts w:ascii="Garamond" w:hAnsi="Garamond"/>
+          <w:b/>
+          <w:bCs/>
+        </w:rPr>
+        <w:t>FocusedTutorCard</w:t>
+      </w:r>
+      <w:r>
+        <w:rPr>
+          <w:rFonts w:ascii="Garamond" w:hAnsi="Garamond"/>
+        </w:rPr>
+        <w:t xml:space="preserve">’s initial render) labelled as </w:t>
+      </w:r>
+      <w:r>
+        <w:rPr>
+          <w:rFonts w:ascii="Garamond" w:hAnsi="Garamond"/>
+          <w:b/>
+          <w:bCs/>
+        </w:rPr>
+        <w:t>otherUserId</w:t>
+      </w:r>
+      <w:r>
+        <w:rPr>
+          <w:rFonts w:ascii="Garamond" w:hAnsi="Garamond"/>
+        </w:rPr>
+        <w:t xml:space="preserve">. The socket server listens for this event, </w:t>
+      </w:r>
+      <w:r>
+        <w:rPr>
+          <w:rFonts w:ascii="Garamond" w:hAnsi="Garamond"/>
+        </w:rPr>
+        <w:t>obtains</w:t>
+      </w:r>
+      <w:r>
+        <w:rPr>
+          <w:rFonts w:ascii="Garamond" w:hAnsi="Garamond"/>
+        </w:rPr>
+        <w:t xml:space="preserve"> the logged-in user</w:t>
+      </w:r>
+      <w:r>
+        <w:rPr>
+          <w:rFonts w:ascii="Garamond" w:hAnsi="Garamond"/>
+        </w:rPr>
+        <w:t xml:space="preserve">’s user id via </w:t>
+      </w:r>
+      <w:r>
+        <w:rPr>
+          <w:rFonts w:ascii="Garamond" w:hAnsi="Garamond"/>
+          <w:b/>
+          <w:bCs/>
+        </w:rPr>
+        <w:t xml:space="preserve">socket.user </w:t>
+      </w:r>
+      <w:r>
+        <w:rPr>
+          <w:rFonts w:ascii="Garamond" w:hAnsi="Garamond"/>
+        </w:rPr>
+        <w:t>and</w:t>
+      </w:r>
+      <w:r>
+        <w:rPr>
+          <w:rFonts w:ascii="Garamond" w:hAnsi="Garamond"/>
+        </w:rPr>
+        <w:t xml:space="preserve"> </w:t>
+      </w:r>
+      <w:r>
+        <w:rPr>
+          <w:rFonts w:ascii="Garamond" w:hAnsi="Garamond"/>
+        </w:rPr>
+        <w:t xml:space="preserve">the </w:t>
+      </w:r>
+      <w:r>
+        <w:rPr>
+          <w:rFonts w:ascii="Garamond" w:hAnsi="Garamond"/>
+        </w:rPr>
+        <w:t>other user/chat recipient’s id</w:t>
+      </w:r>
+      <w:r>
+        <w:rPr>
+          <w:rFonts w:ascii="Garamond" w:hAnsi="Garamond"/>
+        </w:rPr>
+        <w:t xml:space="preserve"> from </w:t>
+      </w:r>
+      <w:r>
+        <w:rPr>
+          <w:rFonts w:ascii="Garamond" w:hAnsi="Garamond"/>
+          <w:b/>
+          <w:bCs/>
+        </w:rPr>
+        <w:t>otherUserId</w:t>
+      </w:r>
+      <w:r>
+        <w:rPr>
+          <w:rFonts w:ascii="Garamond" w:hAnsi="Garamond"/>
+        </w:rPr>
+        <w:t xml:space="preserve">, prevents self-chat, and </w:t>
+      </w:r>
+      <w:r>
+        <w:rPr>
+          <w:rFonts w:ascii="Garamond" w:hAnsi="Garamond"/>
+        </w:rPr>
+        <w:lastRenderedPageBreak/>
+        <w:t xml:space="preserve">generates a permanent, unique room name by ordering the </w:t>
+      </w:r>
+      <w:r>
+        <w:rPr>
+          <w:rFonts w:ascii="Garamond" w:hAnsi="Garamond"/>
+        </w:rPr>
+        <w:t>logged-in user</w:t>
+      </w:r>
+      <w:r>
+        <w:rPr>
+          <w:rFonts w:ascii="Garamond" w:hAnsi="Garamond"/>
+        </w:rPr>
+        <w:t xml:space="preserve"> and </w:t>
+      </w:r>
+      <w:r>
+        <w:rPr>
+          <w:rFonts w:ascii="Garamond" w:hAnsi="Garamond"/>
+        </w:rPr>
+        <w:t>recipient user</w:t>
+      </w:r>
+      <w:r>
+        <w:rPr>
+          <w:rFonts w:ascii="Garamond" w:hAnsi="Garamond"/>
+        </w:rPr>
+        <w:t xml:space="preserve"> ids from lowest to highest</w:t>
+      </w:r>
+      <w:r>
+        <w:rPr>
+          <w:rFonts w:ascii="Garamond" w:hAnsi="Garamond"/>
+        </w:rPr>
+        <w:t xml:space="preserve">. This is so both particpants in a chat resolve to the same room name. </w:t>
+      </w:r>
+      <w:r>
+        <w:rPr>
+          <w:rFonts w:ascii="Garamond" w:hAnsi="Garamond"/>
+        </w:rPr>
+        <w:t>The logged-in user’s socket then joins that room and the room number</w:t>
+      </w:r>
+      <w:r>
+        <w:rPr>
+          <w:rFonts w:ascii="Garamond" w:hAnsi="Garamond"/>
+        </w:rPr>
+        <w:t xml:space="preserve"> and recipient/other user id</w:t>
+      </w:r>
+      <w:r>
+        <w:rPr>
+          <w:rFonts w:ascii="Garamond" w:hAnsi="Garamond"/>
+        </w:rPr>
+        <w:t xml:space="preserve"> </w:t>
+      </w:r>
+      <w:r>
+        <w:rPr>
+          <w:rFonts w:ascii="Garamond" w:hAnsi="Garamond"/>
+        </w:rPr>
+        <w:t>are</w:t>
+      </w:r>
+      <w:r>
+        <w:rPr>
+          <w:rFonts w:ascii="Garamond" w:hAnsi="Garamond"/>
+        </w:rPr>
+        <w:t xml:space="preserve"> stored in </w:t>
+      </w:r>
+      <w:r>
+        <w:rPr>
+          <w:rFonts w:ascii="Garamond" w:hAnsi="Garamond"/>
+          <w:b/>
+          <w:bCs/>
+        </w:rPr>
+        <w:t>socket.data.dmPeers</w:t>
+      </w:r>
+      <w:r>
+        <w:rPr>
+          <w:rFonts w:ascii="Garamond" w:hAnsi="Garamond"/>
+          <w:b/>
+          <w:bCs/>
+        </w:rPr>
+        <w:t xml:space="preserve"> </w:t>
+      </w:r>
+      <w:r>
+        <w:rPr>
+          <w:rFonts w:ascii="Garamond" w:hAnsi="Garamond"/>
+        </w:rPr>
+        <w:t>as key-value pairs</w:t>
+      </w:r>
+      <w:r>
+        <w:rPr>
+          <w:rFonts w:ascii="Garamond" w:hAnsi="Garamond"/>
+        </w:rPr>
+        <w:t xml:space="preserve">. Finally, the server emits the room name back to the frontend where it is stored in the </w:t>
+      </w:r>
+      <w:r>
+        <w:rPr>
+          <w:rFonts w:ascii="Garamond" w:hAnsi="Garamond"/>
+          <w:b/>
+          <w:bCs/>
+        </w:rPr>
+        <w:t>ChatWindow</w:t>
+      </w:r>
+      <w:r>
+        <w:rPr>
+          <w:rFonts w:ascii="Garamond" w:hAnsi="Garamond"/>
+        </w:rPr>
+        <w:t xml:space="preserve"> component state and used to direct </w:t>
+      </w:r>
+      <w:r>
+        <w:rPr>
+          <w:rFonts w:ascii="Garamond" w:hAnsi="Garamond"/>
+        </w:rPr>
+        <w:t>the component’s subsequent chat</w:t>
+      </w:r>
+      <w:r>
+        <w:rPr>
+          <w:rFonts w:ascii="Garamond" w:hAnsi="Garamond"/>
+        </w:rPr>
+        <w:t xml:space="preserve"> messages to the correct room via </w:t>
+      </w:r>
+      <w:r>
+        <w:rPr>
+          <w:rFonts w:ascii="Garamond" w:hAnsi="Garamond"/>
+        </w:rPr>
+        <w:t>its</w:t>
+      </w:r>
+      <w:r>
+        <w:rPr>
+          <w:rFonts w:ascii="Garamond" w:hAnsi="Garamond"/>
+        </w:rPr>
+        <w:t xml:space="preserve"> emitted  </w:t>
+      </w:r>
+      <w:r>
+        <w:rPr>
+          <w:rFonts w:ascii="Garamond" w:hAnsi="Garamond"/>
+          <w:b/>
+          <w:bCs/>
+        </w:rPr>
+        <w:t>chat_message</w:t>
+      </w:r>
+      <w:r>
+        <w:rPr>
+          <w:rFonts w:ascii="Garamond" w:hAnsi="Garamond"/>
+        </w:rPr>
+        <w:t xml:space="preserve"> event.</w:t>
+      </w:r>
+    </w:p>
+    <w:p>
+      <w:pPr>
+        <w:spacing w:line="360" w:lineRule="auto"/>
+        <w:rPr>
+          <w:rFonts w:ascii="Garamond" w:hAnsi="Garamond"/>
+        </w:rPr>
+      </w:pPr>
+      <w:r>
+        <w:rPr>
+          <w:rFonts w:ascii="Garamond" w:hAnsi="Garamond"/>
+        </w:rPr>
+        <w:t xml:space="preserve">In parallel with joining a live room, </w:t>
+      </w:r>
+      <w:r>
+        <w:rPr>
+          <w:rFonts w:ascii="Garamond" w:hAnsi="Garamond"/>
+          <w:b/>
+          <w:bCs/>
+        </w:rPr>
+        <w:t>ChatWindow</w:t>
+      </w:r>
+      <w:r>
+        <w:rPr>
+          <w:rFonts w:ascii="Garamond" w:hAnsi="Garamond"/>
+        </w:rPr>
+        <w:t xml:space="preserve"> component fetches any historical messages for the same chat pair by sending an http request</w:t>
+      </w:r>
+      <w:r>
+        <w:rPr>
+          <w:rFonts w:ascii="Garamond" w:hAnsi="Garamond"/>
+        </w:rPr>
+        <w:t xml:space="preserve">. This request is handled by the protected </w:t>
+      </w:r>
+      <w:r>
+        <w:rPr>
+          <w:rFonts w:ascii="Garamond" w:hAnsi="Garamond"/>
+          <w:b/>
+          <w:bCs/>
+        </w:rPr>
+        <w:t>getMessagesFromDB</w:t>
+      </w:r>
+      <w:r>
+        <w:rPr>
+          <w:rFonts w:ascii="Garamond" w:hAnsi="Garamond"/>
+          <w:b/>
+          <w:bCs/>
+        </w:rPr>
+        <w:t xml:space="preserve"> </w:t>
+      </w:r>
+      <w:r>
+        <w:rPr>
+          <w:rFonts w:ascii="Garamond" w:hAnsi="Garamond"/>
+        </w:rPr>
+        <w:t xml:space="preserve">controller  which uses </w:t>
+      </w:r>
+      <w:r>
+        <w:rPr>
+          <w:rFonts w:ascii="Garamond" w:hAnsi="Garamond"/>
+          <w:b/>
+          <w:bCs/>
+        </w:rPr>
+        <w:t>req.user</w:t>
+      </w:r>
+      <w:r>
+        <w:rPr>
+          <w:rFonts w:ascii="Garamond" w:hAnsi="Garamond"/>
+        </w:rPr>
+        <w:t xml:space="preserve"> and </w:t>
+      </w:r>
+      <w:r>
+        <w:rPr>
+          <w:rFonts w:ascii="Garamond" w:hAnsi="Garamond"/>
+          <w:b/>
+          <w:bCs/>
+        </w:rPr>
+        <w:t>req.params.otherUserId</w:t>
+      </w:r>
+      <w:r>
+        <w:rPr>
+          <w:rFonts w:ascii="Garamond" w:hAnsi="Garamond"/>
+        </w:rPr>
+        <w:t xml:space="preserve"> to identify the participants, arranges the ids in ascending order, and checks if a room of that name is stored in the database, If a matching room is found, its messages are loaded from the database and rendered in the frontend </w:t>
+      </w:r>
+      <w:r>
+        <w:rPr>
+          <w:rFonts w:ascii="Garamond" w:hAnsi="Garamond"/>
+          <w:b/>
+          <w:bCs/>
+        </w:rPr>
+        <w:t>ChatWindow</w:t>
+      </w:r>
+      <w:r>
+        <w:rPr>
+          <w:rFonts w:ascii="Garamond" w:hAnsi="Garamond"/>
+        </w:rPr>
+        <w:t xml:space="preserve"> via state. If no room is found, an empty array is returned. </w:t>
+      </w:r>
+    </w:p>
+    <w:p>
+      <w:pPr>
+        <w:spacing w:line="360" w:lineRule="auto"/>
+        <w:rPr>
+          <w:rFonts w:ascii="Garamond" w:hAnsi="Garamond"/>
+        </w:rPr>
+      </w:pPr>
+      <w:r>
+        <w:rPr>
+          <w:rFonts w:ascii="Garamond" w:hAnsi="Garamond"/>
+        </w:rPr>
+        <w:t xml:space="preserve">For message persistence, when a user sends a message from </w:t>
+      </w:r>
+      <w:r>
+        <w:rPr>
+          <w:rFonts w:ascii="Garamond" w:hAnsi="Garamond"/>
+          <w:b/>
+          <w:bCs/>
+        </w:rPr>
+        <w:t xml:space="preserve">ChatWindow, </w:t>
+      </w:r>
+      <w:r>
+        <w:rPr>
+          <w:rFonts w:ascii="Garamond" w:hAnsi="Garamond"/>
+        </w:rPr>
+        <w:t>the component’s</w:t>
+      </w:r>
+      <w:r>
+        <w:rPr>
+          <w:rFonts w:ascii="Garamond" w:hAnsi="Garamond"/>
+          <w:b/>
+          <w:bCs/>
+        </w:rPr>
+        <w:t xml:space="preserve"> </w:t>
+      </w:r>
+      <w:r>
+        <w:rPr>
+          <w:rFonts w:ascii="Garamond" w:hAnsi="Garamond"/>
+          <w:b/>
+          <w:bCs/>
+        </w:rPr>
+        <w:t>handleSend</w:t>
+      </w:r>
+      <w:r>
+        <w:rPr>
+          <w:rFonts w:ascii="Garamond" w:hAnsi="Garamond"/>
+          <w:b/>
+          <w:bCs/>
+        </w:rPr>
+        <w:t xml:space="preserve"> </w:t>
+      </w:r>
+      <w:r>
+        <w:rPr>
+          <w:rFonts w:ascii="Garamond" w:hAnsi="Garamond"/>
+        </w:rPr>
+        <w:t xml:space="preserve">function validates that the message is not empty and that a </w:t>
+      </w:r>
+      <w:r>
+        <w:rPr>
+          <w:rFonts w:ascii="Garamond" w:hAnsi="Garamond"/>
+          <w:b/>
+          <w:bCs/>
+        </w:rPr>
+        <w:t>room</w:t>
+      </w:r>
+      <w:r>
+        <w:rPr>
+          <w:rFonts w:ascii="Garamond" w:hAnsi="Garamond"/>
+        </w:rPr>
+        <w:t xml:space="preserve"> name has been received from the backend. It then emits the </w:t>
+      </w:r>
+      <w:r>
+        <w:rPr>
+          <w:rFonts w:ascii="Garamond" w:hAnsi="Garamond"/>
+          <w:b/>
+          <w:bCs/>
+        </w:rPr>
+        <w:t>chat_message</w:t>
+      </w:r>
+      <w:r>
+        <w:rPr>
+          <w:rFonts w:ascii="Garamond" w:hAnsi="Garamond"/>
+        </w:rPr>
+        <w:t xml:space="preserve"> event containing the room name and trimmed message text. For security, the component does not send user or recipient user ids; instead, the backend derives the ids from the </w:t>
+      </w:r>
+      <w:r>
+        <w:rPr>
+          <w:rFonts w:ascii="Garamond" w:hAnsi="Garamond"/>
+          <w:b/>
+          <w:bCs/>
+        </w:rPr>
+        <w:t>socket.user</w:t>
+      </w:r>
+      <w:r>
+        <w:rPr>
+          <w:rFonts w:ascii="Garamond" w:hAnsi="Garamond"/>
+        </w:rPr>
+        <w:t xml:space="preserve"> and </w:t>
+      </w:r>
+      <w:r>
+        <w:rPr>
+          <w:rFonts w:ascii="Garamond" w:hAnsi="Garamond"/>
+          <w:b/>
+          <w:bCs/>
+        </w:rPr>
+        <w:t>socket.data.dmPeers</w:t>
+      </w:r>
+      <w:r>
+        <w:rPr>
+          <w:rFonts w:ascii="Garamond" w:hAnsi="Garamond"/>
+        </w:rPr>
+        <w:t xml:space="preserve"> objects.</w:t>
+      </w:r>
+    </w:p>
+    <w:p>
+      <w:pPr>
+        <w:spacing w:line="360" w:lineRule="auto"/>
+        <w:rPr>
+          <w:rFonts w:ascii="Garamond" w:hAnsi="Garamond"/>
+        </w:rPr>
+      </w:pPr>
+      <w:r>
+        <w:rPr>
+          <w:rFonts w:ascii="Garamond" w:hAnsi="Garamond"/>
+        </w:rPr>
+        <w:t xml:space="preserve">When the backend receives the component’s </w:t>
+      </w:r>
+      <w:r>
+        <w:rPr>
+          <w:rFonts w:ascii="Garamond" w:hAnsi="Garamond"/>
+          <w:b/>
+          <w:bCs/>
+        </w:rPr>
+        <w:t>chat_message</w:t>
+      </w:r>
+      <w:r>
+        <w:rPr>
+          <w:rFonts w:ascii="Garamond" w:hAnsi="Garamond"/>
+        </w:rPr>
+        <w:t xml:space="preserve"> event, its </w:t>
+      </w:r>
+      <w:r>
+        <w:rPr>
+          <w:rFonts w:ascii="Garamond" w:hAnsi="Garamond"/>
+          <w:b/>
+          <w:bCs/>
+        </w:rPr>
+        <w:t>chat_message</w:t>
+      </w:r>
+      <w:r>
+        <w:rPr>
+          <w:rFonts w:ascii="Garamond" w:hAnsi="Garamond"/>
+        </w:rPr>
+        <w:t xml:space="preserve"> event handler validates that the socket is a member of that room. It then derives the user and recipient ids as described above,</w:t>
+      </w:r>
+      <w:r>
+        <w:rPr>
+          <w:rFonts w:ascii="Garamond" w:hAnsi="Garamond"/>
+        </w:rPr>
+        <w:t xml:space="preserve"> and</w:t>
+      </w:r>
+      <w:r>
+        <w:rPr>
+          <w:rFonts w:ascii="Garamond" w:hAnsi="Garamond"/>
+        </w:rPr>
+        <w:t xml:space="preserve"> regenerates the room name</w:t>
+      </w:r>
+      <w:r>
+        <w:rPr>
+          <w:rFonts w:ascii="Garamond" w:hAnsi="Garamond"/>
+        </w:rPr>
+        <w:t>. The handler then uses an UPSERT query so the room name is only stored if it doesn’t already exist and the room_id is returned. This reduces calls to the database as the logic is handled in one query rather than check-then-insert queries.</w:t>
+      </w:r>
+    </w:p>
+    <w:p>
+      <w:pPr>
+        <w:spacing w:line="360" w:lineRule="auto"/>
+        <w:rPr>
+          <w:rFonts w:ascii="Garamond" w:hAnsi="Garamond"/>
+        </w:rPr>
+      </w:pPr>
+      <w:r>
+        <w:rPr>
+          <w:rFonts w:ascii="Garamond" w:hAnsi="Garamond"/>
+        </w:rPr>
+        <w:t xml:space="preserve">The returned </w:t>
+      </w:r>
+      <w:r>
+        <w:rPr>
+          <w:rFonts w:ascii="Garamond" w:hAnsi="Garamond"/>
+          <w:b/>
+          <w:bCs/>
+        </w:rPr>
+        <w:t>room_id</w:t>
+      </w:r>
+      <w:r>
+        <w:rPr>
+          <w:rFonts w:ascii="Garamond" w:hAnsi="Garamond"/>
+        </w:rPr>
+        <w:t xml:space="preserve"> is then used to insert the message text in to the </w:t>
+      </w:r>
+      <w:r>
+        <w:rPr>
+          <w:rFonts w:ascii="Garamond" w:hAnsi="Garamond"/>
+          <w:b/>
+          <w:bCs/>
+        </w:rPr>
+        <w:t>chat_messages</w:t>
+      </w:r>
+      <w:r>
+        <w:rPr>
+          <w:rFonts w:ascii="Garamond" w:hAnsi="Garamond"/>
+        </w:rPr>
+        <w:t xml:space="preserve"> table along with sender user id, recipient user id and room id. </w:t>
+      </w:r>
+      <w:r>
+        <w:rPr>
+          <w:rFonts w:ascii="Garamond" w:hAnsi="Garamond"/>
+        </w:rPr>
+        <w:t>At this insert, t</w:t>
+      </w:r>
+      <w:r>
+        <w:rPr>
+          <w:rFonts w:ascii="Garamond" w:hAnsi="Garamond"/>
+        </w:rPr>
+        <w:t xml:space="preserve">he database returns a </w:t>
+      </w:r>
+      <w:r>
+        <w:rPr>
+          <w:rFonts w:ascii="Garamond" w:hAnsi="Garamond"/>
+          <w:b/>
+          <w:bCs/>
+        </w:rPr>
+        <w:t>message_id</w:t>
+      </w:r>
+      <w:r>
+        <w:rPr>
+          <w:rFonts w:ascii="Garamond" w:hAnsi="Garamond"/>
+        </w:rPr>
+        <w:t xml:space="preserve">  and </w:t>
+      </w:r>
+      <w:r>
+        <w:rPr>
+          <w:rFonts w:ascii="Garamond" w:hAnsi="Garamond"/>
+          <w:b/>
+          <w:bCs/>
+        </w:rPr>
+        <w:t>sent_at</w:t>
+      </w:r>
+      <w:r>
+        <w:rPr>
+          <w:rFonts w:ascii="Garamond" w:hAnsi="Garamond"/>
+        </w:rPr>
+        <w:t xml:space="preserve"> timestamp </w:t>
+      </w:r>
+      <w:r>
+        <w:rPr>
+          <w:rFonts w:ascii="Garamond" w:hAnsi="Garamond"/>
+        </w:rPr>
+        <w:t xml:space="preserve">and the </w:t>
+      </w:r>
+      <w:r>
+        <w:rPr>
+          <w:rFonts w:ascii="Garamond" w:hAnsi="Garamond"/>
+          <w:b/>
+          <w:bCs/>
+        </w:rPr>
+        <w:t>room_id</w:t>
+      </w:r>
+      <w:r>
+        <w:rPr>
+          <w:rFonts w:ascii="Garamond" w:hAnsi="Garamond"/>
+        </w:rPr>
+        <w:t xml:space="preserve"> </w:t>
+      </w:r>
+      <w:r>
+        <w:rPr>
+          <w:rFonts w:ascii="Garamond" w:hAnsi="Garamond"/>
+        </w:rPr>
+        <w:t xml:space="preserve">which are then used to backfill the </w:t>
+      </w:r>
+      <w:r>
+        <w:rPr>
+          <w:rFonts w:ascii="Garamond" w:hAnsi="Garamond"/>
+          <w:b/>
+          <w:bCs/>
+        </w:rPr>
+        <w:t>chat</w:t>
+      </w:r>
+      <w:r>
+        <w:rPr>
+          <w:rFonts w:ascii="Garamond" w:hAnsi="Garamond"/>
+          <w:b/>
+          <w:bCs/>
+        </w:rPr>
+        <w:t>_rooms</w:t>
+      </w:r>
+      <w:r>
+        <w:rPr>
+          <w:rFonts w:ascii="Garamond" w:hAnsi="Garamond"/>
+        </w:rPr>
+        <w:t xml:space="preserve"> table relevant </w:t>
+      </w:r>
+      <w:r>
+        <w:rPr>
+          <w:rFonts w:ascii="Garamond" w:hAnsi="Garamond"/>
+          <w:b/>
+          <w:bCs/>
+        </w:rPr>
+        <w:t>room_id</w:t>
+      </w:r>
+      <w:r>
+        <w:rPr>
+          <w:rFonts w:ascii="Garamond" w:hAnsi="Garamond"/>
+        </w:rPr>
+        <w:t xml:space="preserve"> row with the </w:t>
+      </w:r>
+      <w:r>
+        <w:rPr>
+          <w:rFonts w:ascii="Garamond" w:hAnsi="Garamond"/>
+          <w:b/>
+          <w:bCs/>
+        </w:rPr>
+        <w:t>message_id</w:t>
+      </w:r>
+      <w:r>
+        <w:rPr>
+          <w:rFonts w:ascii="Garamond" w:hAnsi="Garamond"/>
+        </w:rPr>
+        <w:t xml:space="preserve"> and </w:t>
+      </w:r>
+      <w:r>
+        <w:rPr>
+          <w:rFonts w:ascii="Garamond" w:hAnsi="Garamond"/>
+          <w:b/>
+          <w:bCs/>
+        </w:rPr>
+        <w:t>sent_at</w:t>
+      </w:r>
+      <w:r>
+        <w:rPr>
+          <w:rFonts w:ascii="Garamond" w:hAnsi="Garamond"/>
+        </w:rPr>
+        <w:t xml:space="preserve"> timestamp. This allows the inbox-summary functionality described below.</w:t>
+      </w:r>
+      <w:r>
+        <w:rPr>
+          <w:rFonts w:ascii="Garamond" w:hAnsi="Garamond"/>
+        </w:rPr>
+        <w:t xml:space="preserve"> Once the message has been saved, the backend creates a message object and emits it to the frontend via </w:t>
+      </w:r>
+      <w:r>
+        <w:rPr>
+          <w:rFonts w:ascii="Garamond" w:hAnsi="Garamond"/>
+          <w:b/>
+          <w:bCs/>
+        </w:rPr>
+        <w:t>io.to(room).emit()</w:t>
+      </w:r>
+      <w:r>
+        <w:rPr>
+          <w:rFonts w:ascii="Garamond" w:hAnsi="Garamond"/>
+        </w:rPr>
+        <w:t xml:space="preserve"> so that both parties receive the message.</w:t>
+      </w:r>
+      <w:r>
+        <w:rPr>
+          <w:rFonts w:ascii="Garamond" w:hAnsi="Garamond"/>
+        </w:rPr>
+        <w:t xml:space="preserve"> Finally, to support notification, a truncated message object is sent to the recipient’s personal room via </w:t>
+      </w:r>
+      <w:r>
+        <w:rPr>
+          <w:rFonts w:ascii="Garamond" w:hAnsi="Garamond"/>
+          <w:b/>
+          <w:bCs/>
+        </w:rPr>
+        <w:t>io.to(`user:${recipientUserId}`).emit('incoming_chat'</w:t>
+      </w:r>
+      <w:r>
+        <w:rPr>
+          <w:rFonts w:ascii="Garamond" w:hAnsi="Garamond"/>
+          <w:b/>
+          <w:bCs/>
+        </w:rPr>
+        <w:t>)</w:t>
+      </w:r>
+      <w:r>
+        <w:rPr>
+          <w:rFonts w:ascii="Garamond" w:hAnsi="Garamond"/>
+        </w:rPr>
+        <w:t>.</w:t>
+      </w:r>
+    </w:p>
+    <w:p>
+      <w:pPr>
+        <w:spacing w:line="360" w:lineRule="auto"/>
+        <w:rPr>
+          <w:rFonts w:ascii="Garamond" w:hAnsi="Garamond"/>
+        </w:rPr>
+      </w:pPr>
+      <w:r>
+        <w:rPr>
+          <w:rFonts w:ascii="Garamond" w:hAnsi="Garamond"/>
+        </w:rPr>
+        <w:t xml:space="preserve">On the frontend, </w:t>
+      </w:r>
+      <w:r>
+        <w:rPr>
+          <w:rFonts w:ascii="Garamond" w:hAnsi="Garamond"/>
+          <w:b/>
+          <w:bCs/>
+        </w:rPr>
+        <w:t xml:space="preserve">ChatWindow </w:t>
+      </w:r>
+      <w:r>
+        <w:rPr>
+          <w:rFonts w:ascii="Garamond" w:hAnsi="Garamond"/>
+        </w:rPr>
+        <w:t xml:space="preserve">component listens for server-emitted </w:t>
+      </w:r>
+      <w:r>
+        <w:rPr>
+          <w:rFonts w:ascii="Garamond" w:hAnsi="Garamond"/>
+          <w:b/>
+          <w:bCs/>
+        </w:rPr>
+        <w:t>chat_message</w:t>
+      </w:r>
+      <w:r>
+        <w:rPr>
+          <w:rFonts w:ascii="Garamond" w:hAnsi="Garamond"/>
+        </w:rPr>
+        <w:t xml:space="preserve"> events and adds them to its </w:t>
+      </w:r>
+      <w:r>
+        <w:rPr>
+          <w:rFonts w:ascii="Garamond" w:hAnsi="Garamond"/>
+          <w:b/>
+          <w:bCs/>
+        </w:rPr>
+        <w:t>messages</w:t>
+      </w:r>
+      <w:r>
+        <w:rPr>
+          <w:rFonts w:ascii="Garamond" w:hAnsi="Garamond"/>
+        </w:rPr>
+        <w:t xml:space="preserve"> state array</w:t>
+      </w:r>
+    </w:p>
+    <w:p>
+      <w:pPr>
+        <w:spacing w:line="360" w:lineRule="auto"/>
+        <w:rPr>
+          <w:rFonts w:ascii="Garamond" w:hAnsi="Garamond"/>
+          <w:b/>
+          <w:bCs/>
+        </w:rPr>
+      </w:pPr>
     </w:p>
     <w:p>
       <w:pPr>
@@ -9995,6 +11502,7 @@
           <w:sz w:val="28"/>
           <w:szCs w:val="28"/>
         </w:rPr>
+        <w:lastRenderedPageBreak/>
         <w:t>References</w:t>
       </w:r>
       <w:bookmarkEnd w:id="28"/>
@@ -10026,7 +11534,7 @@
         </w:rPr>
         <w:t xml:space="preserve">1: </w:t>
       </w:r>
-      <w:hyperlink r:id="rId7" w:history="1">
+      <w:hyperlink r:id="rId8" w:history="1">
         <w:r>
           <w:rPr>
             <w:rStyle w:val="Hyperlink"/>
@@ -10050,7 +11558,7 @@
         </w:rPr>
         <w:t xml:space="preserve">2: </w:t>
       </w:r>
-      <w:hyperlink r:id="rId8" w:history="1">
+      <w:hyperlink r:id="rId9" w:history="1">
         <w:r>
           <w:rPr>
             <w:rStyle w:val="Hyperlink"/>
@@ -10074,7 +11582,7 @@
         </w:rPr>
         <w:t xml:space="preserve">3: </w:t>
       </w:r>
-      <w:hyperlink r:id="rId9" w:history="1">
+      <w:hyperlink r:id="rId10" w:history="1">
         <w:r>
           <w:rPr>
             <w:rStyle w:val="Hyperlink"/>
@@ -10104,7 +11612,6 @@
         <w:rPr>
           <w:rFonts w:ascii="Garamond" w:hAnsi="Garamond"/>
         </w:rPr>
-        <w:lastRenderedPageBreak/>
         <w:t>Chapter 3</w:t>
       </w:r>
     </w:p>

</xml_diff>

<commit_message>
first finished draft of chapter 3
need to add sequence diagrams and then add code in the appendix
</commit_message>
<xml_diff>
--- a/docs/dissertation start.docx
+++ b/docs/dissertation start.docx
@@ -4411,7 +4411,21 @@
         <w:rPr>
           <w:rFonts w:ascii="Garamond" w:hAnsi="Garamond"/>
         </w:rPr>
-        <w:t xml:space="preserve">Express JS is one of the most popular frameworks for building web servers and APIs. It greatly simplifies routing compared to node.js and, like react, has many libraries to extend functionality or take care of security e.g. passport, bcrypt. It integrates easily with databases like </w:t>
+        <w:t xml:space="preserve">Express JS is one of the most popular frameworks for building web servers and APIs. It greatly simplifies routing compared to node.js and, like react, has many libraries to extend functionality or take care of security e.g. passport, </w:t>
+      </w:r>
+      <w:proofErr w:type="spellStart"/>
+      <w:r>
+        <w:rPr>
+          <w:rFonts w:ascii="Garamond" w:hAnsi="Garamond"/>
+        </w:rPr>
+        <w:t>bcrypt</w:t>
+      </w:r>
+      <w:proofErr w:type="spellEnd"/>
+      <w:r>
+        <w:rPr>
+          <w:rFonts w:ascii="Garamond" w:hAnsi="Garamond"/>
+        </w:rPr>
+        <w:t xml:space="preserve">. It integrates easily with databases like </w:t>
       </w:r>
       <w:r>
         <w:rPr>
@@ -4437,6 +4451,7 @@
           <w:szCs w:val="24"/>
         </w:rPr>
       </w:pPr>
+      <w:proofErr w:type="spellStart"/>
       <w:r>
         <w:rPr>
           <w:rFonts w:ascii="Garamond" w:hAnsi="Garamond"/>
@@ -4448,6 +4463,7 @@
         </w:rPr>
         <w:t>PostGreSQL</w:t>
       </w:r>
+      <w:proofErr w:type="spellEnd"/>
     </w:p>
     <w:p>
       <w:pPr>
@@ -4457,12 +4473,14 @@
           <w:rFonts w:ascii="Garamond" w:hAnsi="Garamond"/>
         </w:rPr>
       </w:pPr>
+      <w:proofErr w:type="spellStart"/>
       <w:r>
         <w:rPr>
           <w:rFonts w:ascii="Garamond" w:hAnsi="Garamond"/>
         </w:rPr>
         <w:t>PostGreSQL</w:t>
       </w:r>
+      <w:proofErr w:type="spellEnd"/>
       <w:r>
         <w:rPr>
           <w:rFonts w:ascii="Garamond" w:hAnsi="Garamond"/>
@@ -4473,7 +4491,35 @@
         <w:rPr>
           <w:rFonts w:ascii="Garamond" w:hAnsi="Garamond"/>
         </w:rPr>
-        <w:t>that lends itself well to structured data and integrates easily with express via the ‘pg’ library. MongoDB was excluded as it is noSQL.</w:t>
+        <w:t>that lends itself well to structured data and integrates easily with express via the ‘</w:t>
+      </w:r>
+      <w:proofErr w:type="spellStart"/>
+      <w:r>
+        <w:rPr>
+          <w:rFonts w:ascii="Garamond" w:hAnsi="Garamond"/>
+        </w:rPr>
+        <w:t>pg</w:t>
+      </w:r>
+      <w:proofErr w:type="spellEnd"/>
+      <w:r>
+        <w:rPr>
+          <w:rFonts w:ascii="Garamond" w:hAnsi="Garamond"/>
+        </w:rPr>
+        <w:t xml:space="preserve">’ library. MongoDB was excluded as it is </w:t>
+      </w:r>
+      <w:proofErr w:type="spellStart"/>
+      <w:r>
+        <w:rPr>
+          <w:rFonts w:ascii="Garamond" w:hAnsi="Garamond"/>
+        </w:rPr>
+        <w:t>noSQL</w:t>
+      </w:r>
+      <w:proofErr w:type="spellEnd"/>
+      <w:r>
+        <w:rPr>
+          <w:rFonts w:ascii="Garamond" w:hAnsi="Garamond"/>
+        </w:rPr>
+        <w:t>.</w:t>
       </w:r>
     </w:p>
     <w:p>
@@ -6080,6 +6126,7 @@
         </w:rPr>
         <w:t xml:space="preserve">of </w:t>
       </w:r>
+      <w:proofErr w:type="spellStart"/>
       <w:r>
         <w:rPr>
           <w:rFonts w:ascii="Garamond" w:hAnsi="Garamond"/>
@@ -6088,12 +6135,14 @@
         </w:rPr>
         <w:t>useState</w:t>
       </w:r>
+      <w:proofErr w:type="spellEnd"/>
       <w:r>
         <w:rPr>
           <w:rFonts w:ascii="Garamond" w:hAnsi="Garamond"/>
         </w:rPr>
         <w:t xml:space="preserve"> for maintaining and updating component data, </w:t>
       </w:r>
+      <w:proofErr w:type="spellStart"/>
       <w:r>
         <w:rPr>
           <w:rFonts w:ascii="Garamond" w:hAnsi="Garamond"/>
@@ -6102,6 +6151,7 @@
         </w:rPr>
         <w:t>useEffect</w:t>
       </w:r>
+      <w:proofErr w:type="spellEnd"/>
       <w:r>
         <w:rPr>
           <w:rFonts w:ascii="Garamond" w:hAnsi="Garamond"/>
@@ -6120,6 +6170,7 @@
         </w:rPr>
         <w:t xml:space="preserve"> the API, and </w:t>
       </w:r>
+      <w:proofErr w:type="spellStart"/>
       <w:r>
         <w:rPr>
           <w:rFonts w:ascii="Garamond" w:hAnsi="Garamond"/>
@@ -6128,6 +6179,7 @@
         </w:rPr>
         <w:t>useContext</w:t>
       </w:r>
+      <w:proofErr w:type="spellEnd"/>
       <w:r>
         <w:rPr>
           <w:rFonts w:ascii="Garamond" w:hAnsi="Garamond"/>
@@ -6755,13 +6807,39 @@
         <w:rPr>
           <w:rFonts w:ascii="Garamond" w:hAnsi="Garamond"/>
         </w:rPr>
-        <w:t xml:space="preserve">. In contrast to the http request-response cycle, socket.io uses websockets </w:t>
-      </w:r>
+        <w:t xml:space="preserve">. In contrast to the </w:t>
+      </w:r>
+      <w:r>
+        <w:rPr>
+          <w:rFonts w:ascii="Garamond" w:hAnsi="Garamond"/>
+        </w:rPr>
+        <w:t>HTTP</w:t>
+      </w:r>
+      <w:r>
+        <w:rPr>
+          <w:rFonts w:ascii="Garamond" w:hAnsi="Garamond"/>
+        </w:rPr>
+        <w:t xml:space="preserve"> request-response cycle, socket.io uses </w:t>
+      </w:r>
+      <w:proofErr w:type="spellStart"/>
       <w:r>
         <w:rPr>
           <w:rFonts w:ascii="Garamond" w:hAnsi="Garamond"/>
         </w:rPr>
         <w:lastRenderedPageBreak/>
+        <w:t>websockets</w:t>
+      </w:r>
+      <w:proofErr w:type="spellEnd"/>
+      <w:r>
+        <w:rPr>
+          <w:rFonts w:ascii="Garamond" w:hAnsi="Garamond"/>
+        </w:rPr>
+        <w:t xml:space="preserve"> </w:t>
+      </w:r>
+      <w:r>
+        <w:rPr>
+          <w:rFonts w:ascii="Garamond" w:hAnsi="Garamond"/>
+        </w:rPr>
         <w:t xml:space="preserve">to </w:t>
       </w:r>
       <w:r>
@@ -6851,6 +6929,7 @@
         </w:rPr>
         <w:t xml:space="preserve"> from the database. The token is signed cryptographically using the </w:t>
       </w:r>
+      <w:proofErr w:type="spellStart"/>
       <w:r>
         <w:rPr>
           <w:rFonts w:ascii="Garamond" w:hAnsi="Garamond"/>
@@ -6859,12 +6938,14 @@
         </w:rPr>
         <w:t>process.env.JWT_SECRET</w:t>
       </w:r>
+      <w:proofErr w:type="spellEnd"/>
       <w:r>
         <w:rPr>
           <w:rFonts w:ascii="Garamond" w:hAnsi="Garamond"/>
         </w:rPr>
         <w:t xml:space="preserve"> variable. It is set to expire after 24 hours and is stored in the browser as an </w:t>
       </w:r>
+      <w:proofErr w:type="spellStart"/>
       <w:r>
         <w:rPr>
           <w:rFonts w:ascii="Garamond" w:hAnsi="Garamond"/>
@@ -6873,6 +6954,7 @@
         </w:rPr>
         <w:t>HTTPOnly</w:t>
       </w:r>
+      <w:proofErr w:type="spellEnd"/>
       <w:r>
         <w:rPr>
           <w:rFonts w:ascii="Garamond" w:hAnsi="Garamond"/>
@@ -6891,6 +6973,7 @@
         </w:rPr>
         <w:t xml:space="preserve">from being read by client-side </w:t>
       </w:r>
+      <w:proofErr w:type="spellStart"/>
       <w:r>
         <w:rPr>
           <w:rFonts w:ascii="Garamond" w:hAnsi="Garamond"/>
@@ -6899,6 +6982,7 @@
         </w:rPr>
         <w:t>HTTPOnly</w:t>
       </w:r>
+      <w:proofErr w:type="spellEnd"/>
       <w:r>
         <w:rPr>
           <w:rFonts w:ascii="Garamond" w:hAnsi="Garamond"/>
@@ -6929,18 +7013,21 @@
         </w:rPr>
         <w:t>{</w:t>
       </w:r>
+      <w:proofErr w:type="spellStart"/>
       <w:r>
         <w:rPr>
           <w:rFonts w:ascii="Garamond" w:hAnsi="Garamond"/>
         </w:rPr>
         <w:t>credentials:’include</w:t>
       </w:r>
+      <w:proofErr w:type="spellEnd"/>
       <w:r>
         <w:rPr>
           <w:rFonts w:ascii="Garamond" w:hAnsi="Garamond"/>
         </w:rPr>
         <w:t xml:space="preserve">’}, is verified server-side and the </w:t>
       </w:r>
+      <w:proofErr w:type="spellStart"/>
       <w:r>
         <w:rPr>
           <w:rFonts w:ascii="Garamond" w:hAnsi="Garamond"/>
@@ -6949,12 +7036,14 @@
         </w:rPr>
         <w:t>user_id</w:t>
       </w:r>
+      <w:proofErr w:type="spellEnd"/>
       <w:r>
         <w:rPr>
           <w:rFonts w:ascii="Garamond" w:hAnsi="Garamond"/>
         </w:rPr>
         <w:t xml:space="preserve"> is used to rebuild the logged-in user’s details in the </w:t>
       </w:r>
+      <w:proofErr w:type="spellStart"/>
       <w:r>
         <w:rPr>
           <w:rFonts w:ascii="Garamond" w:hAnsi="Garamond"/>
@@ -6963,12 +7052,14 @@
         </w:rPr>
         <w:t>req.user</w:t>
       </w:r>
+      <w:proofErr w:type="spellEnd"/>
       <w:r>
         <w:rPr>
           <w:rFonts w:ascii="Garamond" w:hAnsi="Garamond"/>
         </w:rPr>
         <w:t xml:space="preserve"> and </w:t>
       </w:r>
+      <w:proofErr w:type="spellStart"/>
       <w:r>
         <w:rPr>
           <w:rFonts w:ascii="Garamond" w:hAnsi="Garamond"/>
@@ -6977,6 +7068,7 @@
         </w:rPr>
         <w:t>socket.user</w:t>
       </w:r>
+      <w:proofErr w:type="spellEnd"/>
       <w:r>
         <w:rPr>
           <w:rFonts w:ascii="Garamond" w:hAnsi="Garamond"/>
@@ -6994,6 +7086,7 @@
           <w:color w:val="215E99" w:themeColor="text2" w:themeTint="BF"/>
         </w:rPr>
       </w:pPr>
+      <w:proofErr w:type="spellStart"/>
       <w:r>
         <w:rPr>
           <w:rFonts w:ascii="Garamond" w:hAnsi="Garamond"/>
@@ -7003,6 +7096,7 @@
         </w:rPr>
         <w:t>Bcrypt</w:t>
       </w:r>
+      <w:proofErr w:type="spellEnd"/>
     </w:p>
     <w:p>
       <w:pPr>
@@ -7027,7 +7121,21 @@
         <w:rPr>
           <w:rFonts w:ascii="Garamond" w:hAnsi="Garamond"/>
         </w:rPr>
-        <w:t xml:space="preserve">are handled using bcrypt </w:t>
+        <w:t xml:space="preserve">are handled using </w:t>
+      </w:r>
+      <w:proofErr w:type="spellStart"/>
+      <w:r>
+        <w:rPr>
+          <w:rFonts w:ascii="Garamond" w:hAnsi="Garamond"/>
+        </w:rPr>
+        <w:t>bcrypt</w:t>
+      </w:r>
+      <w:proofErr w:type="spellEnd"/>
+      <w:r>
+        <w:rPr>
+          <w:rFonts w:ascii="Garamond" w:hAnsi="Garamond"/>
+        </w:rPr>
+        <w:t xml:space="preserve"> </w:t>
       </w:r>
       <w:r>
         <w:rPr>
@@ -7045,7 +7153,21 @@
         <w:rPr>
           <w:rFonts w:ascii="Garamond" w:hAnsi="Garamond"/>
         </w:rPr>
-        <w:t>user details are obtained from the DB via form-submitted email, and the submitted password is compared with the password stored in DB via bcrypt.</w:t>
+        <w:t xml:space="preserve">user details are obtained from the DB via form-submitted email, and the submitted password is compared with the password stored in DB via </w:t>
+      </w:r>
+      <w:proofErr w:type="spellStart"/>
+      <w:r>
+        <w:rPr>
+          <w:rFonts w:ascii="Garamond" w:hAnsi="Garamond"/>
+        </w:rPr>
+        <w:t>bcrypt</w:t>
+      </w:r>
+      <w:proofErr w:type="spellEnd"/>
+      <w:r>
+        <w:rPr>
+          <w:rFonts w:ascii="Garamond" w:hAnsi="Garamond"/>
+        </w:rPr>
+        <w:t>.</w:t>
       </w:r>
     </w:p>
     <w:p>
@@ -7308,6 +7430,7 @@
         </w:rPr>
         <w:t xml:space="preserve"> validation schema that is integrated with RHF via </w:t>
       </w:r>
+      <w:proofErr w:type="spellStart"/>
       <w:r>
         <w:rPr>
           <w:rFonts w:ascii="Garamond" w:hAnsi="Garamond"/>
@@ -7316,6 +7439,7 @@
         </w:rPr>
         <w:t>ZodResolver</w:t>
       </w:r>
+      <w:proofErr w:type="spellEnd"/>
       <w:r>
         <w:rPr>
           <w:rFonts w:ascii="Garamond" w:hAnsi="Garamond"/>
@@ -7328,6 +7452,7 @@
         </w:rPr>
         <w:t xml:space="preserve"> As the form is large, fields are validated as soon as the user leaves an input to provide immediate corrective feedback. Validation errors are displayed inline in red via RHF’s </w:t>
       </w:r>
+      <w:proofErr w:type="spellStart"/>
       <w:r>
         <w:rPr>
           <w:rFonts w:ascii="Garamond" w:hAnsi="Garamond"/>
@@ -7336,6 +7461,7 @@
         </w:rPr>
         <w:t>formState.errors</w:t>
       </w:r>
+      <w:proofErr w:type="spellEnd"/>
       <w:r>
         <w:rPr>
           <w:rFonts w:ascii="Garamond" w:hAnsi="Garamond"/>
@@ -7377,6 +7503,7 @@
         <w:lastRenderedPageBreak/>
         <w:t xml:space="preserve">To ensure input of city and instrument data that is consistent with the format in the DB, the component uses </w:t>
       </w:r>
+      <w:proofErr w:type="spellStart"/>
       <w:r>
         <w:rPr>
           <w:rFonts w:ascii="Garamond" w:hAnsi="Garamond"/>
@@ -7385,6 +7512,7 @@
         </w:rPr>
         <w:t>useEffect</w:t>
       </w:r>
+      <w:proofErr w:type="spellEnd"/>
       <w:r>
         <w:rPr>
           <w:rFonts w:ascii="Garamond" w:hAnsi="Garamond"/>
@@ -7409,6 +7537,7 @@
         </w:rPr>
         <w:t>state (</w:t>
       </w:r>
+      <w:proofErr w:type="spellStart"/>
       <w:r>
         <w:rPr>
           <w:rFonts w:ascii="Garamond" w:hAnsi="Garamond"/>
@@ -7417,12 +7546,14 @@
         </w:rPr>
         <w:t>dbCities</w:t>
       </w:r>
+      <w:proofErr w:type="spellEnd"/>
       <w:r>
         <w:rPr>
           <w:rFonts w:ascii="Garamond" w:hAnsi="Garamond"/>
         </w:rPr>
         <w:t xml:space="preserve"> and </w:t>
       </w:r>
+      <w:proofErr w:type="spellStart"/>
       <w:r>
         <w:rPr>
           <w:rFonts w:ascii="Garamond" w:hAnsi="Garamond"/>
@@ -7431,6 +7562,7 @@
         </w:rPr>
         <w:t>dbInstruments</w:t>
       </w:r>
+      <w:proofErr w:type="spellEnd"/>
       <w:r>
         <w:rPr>
           <w:rFonts w:ascii="Garamond" w:hAnsi="Garamond"/>
@@ -7457,6 +7589,7 @@
         </w:rPr>
         <w:t xml:space="preserve"> and a new dropdown display array is created by filtering the relevant array to include only partial matches. Selecting the item populates the field using RHF’s </w:t>
       </w:r>
+      <w:proofErr w:type="spellStart"/>
       <w:r>
         <w:rPr>
           <w:rFonts w:ascii="Garamond" w:hAnsi="Garamond"/>
@@ -7465,6 +7598,7 @@
         </w:rPr>
         <w:t>setValue</w:t>
       </w:r>
+      <w:proofErr w:type="spellEnd"/>
       <w:r>
         <w:rPr>
           <w:rFonts w:ascii="Garamond" w:hAnsi="Garamond"/>
@@ -7503,6 +7637,7 @@
         </w:rPr>
         <w:t xml:space="preserve"> </w:t>
       </w:r>
+      <w:proofErr w:type="spellStart"/>
       <w:r>
         <w:rPr>
           <w:rFonts w:ascii="Garamond" w:hAnsi="Garamond"/>
@@ -7511,6 +7646,7 @@
         </w:rPr>
         <w:t>onSubmit</w:t>
       </w:r>
+      <w:proofErr w:type="spellEnd"/>
       <w:r>
         <w:rPr>
           <w:rFonts w:ascii="Garamond" w:hAnsi="Garamond"/>
@@ -7527,7 +7663,19 @@
         <w:rPr>
           <w:rFonts w:ascii="Garamond" w:hAnsi="Garamond"/>
         </w:rPr>
-        <w:t xml:space="preserve">which sends a POST request to the tutor registration endpoint with relevant http content headers and a JSON body payload. </w:t>
+        <w:t xml:space="preserve">which sends a POST request to the tutor registration endpoint with relevant </w:t>
+      </w:r>
+      <w:r>
+        <w:rPr>
+          <w:rFonts w:ascii="Garamond" w:hAnsi="Garamond"/>
+        </w:rPr>
+        <w:t>HTTP</w:t>
+      </w:r>
+      <w:r>
+        <w:rPr>
+          <w:rFonts w:ascii="Garamond" w:hAnsi="Garamond"/>
+        </w:rPr>
+        <w:t xml:space="preserve"> content headers and a JSON body payload. </w:t>
       </w:r>
       <w:r>
         <w:rPr>
@@ -7535,6 +7683,7 @@
         </w:rPr>
         <w:t xml:space="preserve">Server-side validation is performed in the </w:t>
       </w:r>
+      <w:proofErr w:type="spellStart"/>
       <w:r>
         <w:rPr>
           <w:rFonts w:ascii="Garamond" w:hAnsi="Garamond"/>
@@ -7543,6 +7692,7 @@
         </w:rPr>
         <w:t>tutorRegistrationController</w:t>
       </w:r>
+      <w:proofErr w:type="spellEnd"/>
       <w:r>
         <w:rPr>
           <w:rFonts w:ascii="Garamond" w:hAnsi="Garamond"/>
@@ -7888,6 +8038,7 @@
         </w:rPr>
         <w:t xml:space="preserve">, it then uses </w:t>
       </w:r>
+      <w:proofErr w:type="spellStart"/>
       <w:r>
         <w:rPr>
           <w:rFonts w:ascii="Garamond" w:hAnsi="Garamond"/>
@@ -7896,12 +8047,14 @@
         </w:rPr>
         <w:t>Bcrypt</w:t>
       </w:r>
+      <w:proofErr w:type="spellEnd"/>
       <w:r>
         <w:rPr>
           <w:rFonts w:ascii="Garamond" w:hAnsi="Garamond"/>
         </w:rPr>
         <w:t xml:space="preserve"> to check the hashed DB password with input password. If correct, then a frontend-safe </w:t>
       </w:r>
+      <w:proofErr w:type="spellStart"/>
       <w:r>
         <w:rPr>
           <w:rFonts w:ascii="Garamond" w:hAnsi="Garamond"/>
@@ -7910,6 +8063,7 @@
         </w:rPr>
         <w:t>strippedUser</w:t>
       </w:r>
+      <w:proofErr w:type="spellEnd"/>
       <w:r>
         <w:rPr>
           <w:rFonts w:ascii="Garamond" w:hAnsi="Garamond"/>
@@ -7934,7 +8088,19 @@
         <w:rPr>
           <w:rFonts w:ascii="Garamond" w:hAnsi="Garamond"/>
         </w:rPr>
-        <w:t xml:space="preserve">an http-only </w:t>
+        <w:t xml:space="preserve">an </w:t>
+      </w:r>
+      <w:r>
+        <w:rPr>
+          <w:rFonts w:ascii="Garamond" w:hAnsi="Garamond"/>
+        </w:rPr>
+        <w:t>HTTP</w:t>
+      </w:r>
+      <w:r>
+        <w:rPr>
+          <w:rFonts w:ascii="Garamond" w:hAnsi="Garamond"/>
+        </w:rPr>
+        <w:t xml:space="preserve">-only </w:t>
       </w:r>
       <w:r>
         <w:rPr>
@@ -7978,6 +8144,7 @@
         </w:rPr>
         <w:t xml:space="preserve"> the </w:t>
       </w:r>
+      <w:proofErr w:type="spellStart"/>
       <w:r>
         <w:rPr>
           <w:rFonts w:ascii="Garamond" w:hAnsi="Garamond"/>
@@ -7986,6 +8153,7 @@
         </w:rPr>
         <w:t>UserContext</w:t>
       </w:r>
+      <w:proofErr w:type="spellEnd"/>
       <w:r>
         <w:rPr>
           <w:rFonts w:ascii="Garamond" w:hAnsi="Garamond"/>
@@ -8190,6 +8358,7 @@
         </w:rPr>
         <w:t xml:space="preserve">by the </w:t>
       </w:r>
+      <w:proofErr w:type="spellStart"/>
       <w:r>
         <w:rPr>
           <w:rFonts w:ascii="Garamond" w:hAnsi="Garamond"/>
@@ -8198,6 +8367,7 @@
         </w:rPr>
         <w:t>handleChange</w:t>
       </w:r>
+      <w:proofErr w:type="spellEnd"/>
       <w:r>
         <w:rPr>
           <w:rFonts w:ascii="Garamond" w:hAnsi="Garamond"/>
@@ -8252,6 +8422,7 @@
         </w:rPr>
         <w:t xml:space="preserve">. When the user presses the Enter key, the </w:t>
       </w:r>
+      <w:proofErr w:type="spellStart"/>
       <w:r>
         <w:rPr>
           <w:rFonts w:ascii="Garamond" w:hAnsi="Garamond"/>
@@ -8260,6 +8431,7 @@
         </w:rPr>
         <w:t>commitFilters</w:t>
       </w:r>
+      <w:proofErr w:type="spellEnd"/>
       <w:r>
         <w:rPr>
           <w:rFonts w:ascii="Garamond" w:hAnsi="Garamond"/>
@@ -8278,6 +8450,7 @@
         </w:rPr>
         <w:t xml:space="preserve"> to the browser’s query string using React Router’s </w:t>
       </w:r>
+      <w:proofErr w:type="spellStart"/>
       <w:r>
         <w:rPr>
           <w:rFonts w:ascii="Garamond" w:hAnsi="Garamond"/>
@@ -8286,6 +8459,7 @@
         </w:rPr>
         <w:t>setSearchParams</w:t>
       </w:r>
+      <w:proofErr w:type="spellEnd"/>
       <w:r>
         <w:rPr>
           <w:rFonts w:ascii="Garamond" w:hAnsi="Garamond"/>
@@ -8316,6 +8490,7 @@
         </w:rPr>
         <w:t xml:space="preserve"> </w:t>
       </w:r>
+      <w:proofErr w:type="spellStart"/>
       <w:r>
         <w:rPr>
           <w:rFonts w:ascii="Garamond" w:hAnsi="Garamond"/>
@@ -8324,12 +8499,14 @@
         </w:rPr>
         <w:t>useEffect</w:t>
       </w:r>
+      <w:proofErr w:type="spellEnd"/>
       <w:r>
         <w:rPr>
           <w:rFonts w:ascii="Garamond" w:hAnsi="Garamond"/>
         </w:rPr>
         <w:t xml:space="preserve"> hook dependant on </w:t>
       </w:r>
+      <w:proofErr w:type="spellStart"/>
       <w:r>
         <w:rPr>
           <w:rFonts w:ascii="Garamond" w:hAnsi="Garamond"/>
@@ -8338,6 +8515,7 @@
         </w:rPr>
         <w:t>searchParams</w:t>
       </w:r>
+      <w:proofErr w:type="spellEnd"/>
       <w:r>
         <w:rPr>
           <w:rFonts w:ascii="Garamond" w:hAnsi="Garamond"/>
@@ -8366,6 +8544,7 @@
         </w:rPr>
         <w:t xml:space="preserve">. A second </w:t>
       </w:r>
+      <w:proofErr w:type="spellStart"/>
       <w:r>
         <w:rPr>
           <w:rFonts w:ascii="Garamond" w:hAnsi="Garamond"/>
@@ -8374,19 +8553,30 @@
         </w:rPr>
         <w:t>useEffect</w:t>
       </w:r>
+      <w:proofErr w:type="spellEnd"/>
       <w:r>
         <w:rPr>
           <w:rFonts w:ascii="Garamond" w:hAnsi="Garamond"/>
         </w:rPr>
         <w:t xml:space="preserve">, dependant on </w:t>
       </w:r>
-      <w:r>
-        <w:rPr>
-          <w:rFonts w:ascii="Garamond" w:hAnsi="Garamond"/>
-          <w:b/>
-          <w:bCs/>
-        </w:rPr>
-        <w:t xml:space="preserve">filters.city </w:t>
+      <w:proofErr w:type="spellStart"/>
+      <w:r>
+        <w:rPr>
+          <w:rFonts w:ascii="Garamond" w:hAnsi="Garamond"/>
+          <w:b/>
+          <w:bCs/>
+        </w:rPr>
+        <w:t>filters.city</w:t>
+      </w:r>
+      <w:proofErr w:type="spellEnd"/>
+      <w:r>
+        <w:rPr>
+          <w:rFonts w:ascii="Garamond" w:hAnsi="Garamond"/>
+          <w:b/>
+          <w:bCs/>
+        </w:rPr>
+        <w:t xml:space="preserve"> </w:t>
       </w:r>
       <w:r>
         <w:rPr>
@@ -8400,7 +8590,16 @@
           <w:b/>
           <w:bCs/>
         </w:rPr>
-        <w:t xml:space="preserve"> filters.instrum</w:t>
+        <w:t xml:space="preserve"> </w:t>
+      </w:r>
+      <w:proofErr w:type="spellStart"/>
+      <w:r>
+        <w:rPr>
+          <w:rFonts w:ascii="Garamond" w:hAnsi="Garamond"/>
+          <w:b/>
+          <w:bCs/>
+        </w:rPr>
+        <w:t>filters.instrum</w:t>
       </w:r>
       <w:r>
         <w:rPr>
@@ -8418,6 +8617,7 @@
         </w:rPr>
         <w:t>nt</w:t>
       </w:r>
+      <w:proofErr w:type="spellEnd"/>
       <w:r>
         <w:rPr>
           <w:rFonts w:ascii="Garamond" w:hAnsi="Garamond"/>
@@ -8430,13 +8630,23 @@
         </w:rPr>
         <w:t xml:space="preserve">then uses </w:t>
       </w:r>
-      <w:r>
-        <w:rPr>
-          <w:rFonts w:ascii="Garamond" w:hAnsi="Garamond"/>
-          <w:b/>
-          <w:bCs/>
-        </w:rPr>
-        <w:t xml:space="preserve">URLSearchParams </w:t>
+      <w:proofErr w:type="spellStart"/>
+      <w:r>
+        <w:rPr>
+          <w:rFonts w:ascii="Garamond" w:hAnsi="Garamond"/>
+          <w:b/>
+          <w:bCs/>
+        </w:rPr>
+        <w:t>URLSearchParams</w:t>
+      </w:r>
+      <w:proofErr w:type="spellEnd"/>
+      <w:r>
+        <w:rPr>
+          <w:rFonts w:ascii="Garamond" w:hAnsi="Garamond"/>
+          <w:b/>
+          <w:bCs/>
+        </w:rPr>
+        <w:t xml:space="preserve"> </w:t>
       </w:r>
       <w:r>
         <w:rPr>
@@ -8574,6 +8784,7 @@
         </w:rPr>
         <w:t xml:space="preserve">he </w:t>
       </w:r>
+      <w:proofErr w:type="spellStart"/>
       <w:r>
         <w:rPr>
           <w:rFonts w:ascii="Garamond" w:hAnsi="Garamond"/>
@@ -8582,6 +8793,7 @@
         </w:rPr>
         <w:t>TutorProfilePage</w:t>
       </w:r>
+      <w:proofErr w:type="spellEnd"/>
       <w:r>
         <w:rPr>
           <w:rFonts w:ascii="Garamond" w:hAnsi="Garamond"/>
@@ -8624,6 +8836,7 @@
         </w:rPr>
         <w:t xml:space="preserve"> child components </w:t>
       </w:r>
+      <w:proofErr w:type="spellStart"/>
       <w:r>
         <w:rPr>
           <w:rFonts w:ascii="Garamond" w:hAnsi="Garamond"/>
@@ -8632,12 +8845,14 @@
         </w:rPr>
         <w:t>FocusedTutorCard</w:t>
       </w:r>
+      <w:proofErr w:type="spellEnd"/>
       <w:r>
         <w:rPr>
           <w:rFonts w:ascii="Garamond" w:hAnsi="Garamond"/>
         </w:rPr>
         <w:t xml:space="preserve"> and </w:t>
       </w:r>
+      <w:proofErr w:type="spellStart"/>
       <w:r>
         <w:rPr>
           <w:rFonts w:ascii="Garamond" w:hAnsi="Garamond"/>
@@ -8646,6 +8861,7 @@
         </w:rPr>
         <w:t>BookingCalendar</w:t>
       </w:r>
+      <w:proofErr w:type="spellEnd"/>
       <w:r>
         <w:rPr>
           <w:rFonts w:ascii="Garamond" w:hAnsi="Garamond"/>
@@ -8670,6 +8886,7 @@
         </w:rPr>
         <w:t xml:space="preserve"> a </w:t>
       </w:r>
+      <w:proofErr w:type="spellStart"/>
       <w:r>
         <w:rPr>
           <w:rFonts w:ascii="Garamond" w:hAnsi="Garamond"/>
@@ -8678,6 +8895,7 @@
         </w:rPr>
         <w:t>draftBooking</w:t>
       </w:r>
+      <w:proofErr w:type="spellEnd"/>
       <w:r>
         <w:rPr>
           <w:rFonts w:ascii="Garamond" w:hAnsi="Garamond"/>
@@ -8746,6 +8964,7 @@
         </w:rPr>
         <w:t xml:space="preserve">The </w:t>
       </w:r>
+      <w:proofErr w:type="spellStart"/>
       <w:r>
         <w:rPr>
           <w:rFonts w:ascii="Garamond" w:hAnsi="Garamond"/>
@@ -8754,6 +8973,7 @@
         </w:rPr>
         <w:t>FocusedTutorCard</w:t>
       </w:r>
+      <w:proofErr w:type="spellEnd"/>
       <w:r>
         <w:rPr>
           <w:rFonts w:ascii="Garamond" w:hAnsi="Garamond"/>
@@ -8790,6 +9010,7 @@
         </w:rPr>
         <w:t xml:space="preserve">passed-down </w:t>
       </w:r>
+      <w:proofErr w:type="spellStart"/>
       <w:r>
         <w:rPr>
           <w:rFonts w:ascii="Garamond" w:hAnsi="Garamond"/>
@@ -8798,12 +9019,14 @@
         </w:rPr>
         <w:t>updateDraftBooking</w:t>
       </w:r>
+      <w:proofErr w:type="spellEnd"/>
       <w:r>
         <w:rPr>
           <w:rFonts w:ascii="Garamond" w:hAnsi="Garamond"/>
         </w:rPr>
         <w:t xml:space="preserve"> function updates the </w:t>
       </w:r>
+      <w:proofErr w:type="spellStart"/>
       <w:r>
         <w:rPr>
           <w:rFonts w:ascii="Garamond" w:hAnsi="Garamond"/>
@@ -8812,6 +9035,7 @@
         </w:rPr>
         <w:t>draftBooking</w:t>
       </w:r>
+      <w:proofErr w:type="spellEnd"/>
       <w:r>
         <w:rPr>
           <w:rFonts w:ascii="Garamond" w:hAnsi="Garamond"/>
@@ -8838,6 +9062,7 @@
         </w:rPr>
         <w:t xml:space="preserve">In parallel, the </w:t>
       </w:r>
+      <w:proofErr w:type="spellStart"/>
       <w:r>
         <w:rPr>
           <w:rFonts w:ascii="Garamond" w:hAnsi="Garamond"/>
@@ -8846,6 +9071,7 @@
         </w:rPr>
         <w:t>BookingCalendar</w:t>
       </w:r>
+      <w:proofErr w:type="spellEnd"/>
       <w:r>
         <w:rPr>
           <w:rFonts w:ascii="Garamond" w:hAnsi="Garamond"/>
@@ -8942,6 +9168,7 @@
         </w:rPr>
         <w:t xml:space="preserve"> On choosing a slot, the </w:t>
       </w:r>
+      <w:proofErr w:type="spellStart"/>
       <w:r>
         <w:rPr>
           <w:rFonts w:ascii="Garamond" w:hAnsi="Garamond"/>
@@ -8950,6 +9177,7 @@
         </w:rPr>
         <w:t>handleSelectSlot</w:t>
       </w:r>
+      <w:proofErr w:type="spellEnd"/>
       <w:r>
         <w:rPr>
           <w:rFonts w:ascii="Garamond" w:hAnsi="Garamond"/>
@@ -8968,6 +9196,7 @@
         </w:rPr>
         <w:t xml:space="preserve">updates the </w:t>
       </w:r>
+      <w:proofErr w:type="spellStart"/>
       <w:r>
         <w:rPr>
           <w:rFonts w:ascii="Garamond" w:hAnsi="Garamond"/>
@@ -8976,6 +9205,7 @@
         </w:rPr>
         <w:t>draftBooking</w:t>
       </w:r>
+      <w:proofErr w:type="spellEnd"/>
       <w:r>
         <w:rPr>
           <w:rFonts w:ascii="Garamond" w:hAnsi="Garamond"/>
@@ -9008,6 +9238,7 @@
         </w:rPr>
         <w:t xml:space="preserve">Before a booking can be confirmed, the frontend carries out a series of validation checks on the </w:t>
       </w:r>
+      <w:proofErr w:type="spellStart"/>
       <w:r>
         <w:rPr>
           <w:rFonts w:ascii="Garamond" w:hAnsi="Garamond"/>
@@ -9016,12 +9247,14 @@
         </w:rPr>
         <w:t>draftBooking</w:t>
       </w:r>
+      <w:proofErr w:type="spellEnd"/>
       <w:r>
         <w:rPr>
           <w:rFonts w:ascii="Garamond" w:hAnsi="Garamond"/>
         </w:rPr>
         <w:t xml:space="preserve"> object using the </w:t>
       </w:r>
+      <w:proofErr w:type="spellStart"/>
       <w:r>
         <w:rPr>
           <w:rFonts w:ascii="Garamond" w:hAnsi="Garamond"/>
@@ -9030,6 +9263,7 @@
         </w:rPr>
         <w:t>preBookingChecks</w:t>
       </w:r>
+      <w:proofErr w:type="spellEnd"/>
       <w:r>
         <w:rPr>
           <w:rFonts w:ascii="Garamond" w:hAnsi="Garamond"/>
@@ -9066,6 +9300,7 @@
         </w:rPr>
         <w:t xml:space="preserve"> Draft bookings are sent to the backend in the </w:t>
       </w:r>
+      <w:proofErr w:type="spellStart"/>
       <w:r>
         <w:rPr>
           <w:rFonts w:ascii="Garamond" w:hAnsi="Garamond"/>
@@ -9075,6 +9310,7 @@
         <w:lastRenderedPageBreak/>
         <w:t>confirmDraftBooking</w:t>
       </w:r>
+      <w:proofErr w:type="spellEnd"/>
       <w:r>
         <w:rPr>
           <w:rFonts w:ascii="Garamond" w:hAnsi="Garamond"/>
@@ -9189,6 +9425,7 @@
         </w:rPr>
         <w:t xml:space="preserve">, the booking process is handled by the </w:t>
       </w:r>
+      <w:proofErr w:type="spellStart"/>
       <w:r>
         <w:rPr>
           <w:rFonts w:ascii="Garamond" w:hAnsi="Garamond"/>
@@ -9197,6 +9434,7 @@
         </w:rPr>
         <w:t>makeBooking</w:t>
       </w:r>
+      <w:proofErr w:type="spellEnd"/>
       <w:r>
         <w:rPr>
           <w:rFonts w:ascii="Garamond" w:hAnsi="Garamond"/>
@@ -9209,6 +9447,7 @@
         </w:rPr>
         <w:t xml:space="preserve">It receives the </w:t>
       </w:r>
+      <w:proofErr w:type="spellStart"/>
       <w:r>
         <w:rPr>
           <w:rFonts w:ascii="Garamond" w:hAnsi="Garamond"/>
@@ -9217,6 +9456,7 @@
         </w:rPr>
         <w:t>draftBooking</w:t>
       </w:r>
+      <w:proofErr w:type="spellEnd"/>
       <w:r>
         <w:rPr>
           <w:rFonts w:ascii="Garamond" w:hAnsi="Garamond"/>
@@ -9261,13 +9501,23 @@
         </w:rPr>
         <w:t xml:space="preserve"> with any conformed bookings. Only if all checks pass is the booking inserted into database and the newly created booking, with booking id, is returned to frontend </w:t>
       </w:r>
-      <w:r>
-        <w:rPr>
-          <w:rFonts w:ascii="Garamond" w:hAnsi="Garamond"/>
-          <w:b/>
-          <w:bCs/>
-        </w:rPr>
-        <w:t xml:space="preserve">tutorBookings </w:t>
+      <w:proofErr w:type="spellStart"/>
+      <w:r>
+        <w:rPr>
+          <w:rFonts w:ascii="Garamond" w:hAnsi="Garamond"/>
+          <w:b/>
+          <w:bCs/>
+        </w:rPr>
+        <w:t>tutorBookings</w:t>
+      </w:r>
+      <w:proofErr w:type="spellEnd"/>
+      <w:r>
+        <w:rPr>
+          <w:rFonts w:ascii="Garamond" w:hAnsi="Garamond"/>
+          <w:b/>
+          <w:bCs/>
+        </w:rPr>
+        <w:t xml:space="preserve"> </w:t>
       </w:r>
       <w:r>
         <w:rPr>
@@ -9337,6 +9587,7 @@
         </w:rPr>
         <w:t xml:space="preserve">The </w:t>
       </w:r>
+      <w:proofErr w:type="spellStart"/>
       <w:r>
         <w:rPr>
           <w:rFonts w:ascii="Garamond" w:hAnsi="Garamond"/>
@@ -9345,12 +9596,14 @@
         </w:rPr>
         <w:t>BookingCalendar</w:t>
       </w:r>
+      <w:proofErr w:type="spellEnd"/>
       <w:r>
         <w:rPr>
           <w:rFonts w:ascii="Garamond" w:hAnsi="Garamond"/>
         </w:rPr>
         <w:t xml:space="preserve"> component also allows students to view the details of confirmed lessons. When clicking on a lesson, the </w:t>
       </w:r>
+      <w:proofErr w:type="spellStart"/>
       <w:r>
         <w:rPr>
           <w:rFonts w:ascii="Garamond" w:hAnsi="Garamond"/>
@@ -9359,12 +9612,14 @@
         </w:rPr>
         <w:t>handleSelectEvent</w:t>
       </w:r>
+      <w:proofErr w:type="spellEnd"/>
       <w:r>
         <w:rPr>
           <w:rFonts w:ascii="Garamond" w:hAnsi="Garamond"/>
         </w:rPr>
         <w:t xml:space="preserve"> function sends a fetch request to obtain the full booking details from the database using the </w:t>
       </w:r>
+      <w:proofErr w:type="spellStart"/>
       <w:r>
         <w:rPr>
           <w:rFonts w:ascii="Garamond" w:hAnsi="Garamond"/>
@@ -9373,6 +9628,7 @@
         </w:rPr>
         <w:t>booking_id</w:t>
       </w:r>
+      <w:proofErr w:type="spellEnd"/>
       <w:r>
         <w:rPr>
           <w:rFonts w:ascii="Garamond" w:hAnsi="Garamond"/>
@@ -9431,6 +9687,7 @@
         </w:rPr>
         <w:t xml:space="preserve"> the backend, cancellation requests are handled by the </w:t>
       </w:r>
+      <w:proofErr w:type="spellStart"/>
       <w:r>
         <w:rPr>
           <w:rFonts w:ascii="Garamond" w:hAnsi="Garamond"/>
@@ -9439,6 +9696,7 @@
         </w:rPr>
         <w:t>cancelBookingById</w:t>
       </w:r>
+      <w:proofErr w:type="spellEnd"/>
       <w:r>
         <w:rPr>
           <w:rFonts w:ascii="Garamond" w:hAnsi="Garamond"/>
@@ -9520,6 +9778,7 @@
           <w:rFonts w:ascii="Garamond" w:hAnsi="Garamond"/>
           <w:b/>
           <w:bCs/>
+          <w:noProof/>
         </w:rPr>
         <w:lastRenderedPageBreak/>
         <w:drawing>
@@ -9744,7 +10003,115 @@
         <w:rPr>
           <w:rFonts w:ascii="Garamond" w:hAnsi="Garamond"/>
         </w:rPr>
-        <w:t xml:space="preserve"> The functionality is created through a series of complimentary event listeners and emitters on front and back end. Listeners take the form socket.on() or io.on() and emitters socket.emit() or io.emit().</w:t>
+        <w:t xml:space="preserve"> The functionality is created through a series of compl</w:t>
+      </w:r>
+      <w:r>
+        <w:rPr>
+          <w:rFonts w:ascii="Garamond" w:hAnsi="Garamond"/>
+        </w:rPr>
+        <w:t>e</w:t>
+      </w:r>
+      <w:r>
+        <w:rPr>
+          <w:rFonts w:ascii="Garamond" w:hAnsi="Garamond"/>
+        </w:rPr>
+        <w:t xml:space="preserve">mentary event listeners and emitters on front and back end. Listeners take the form </w:t>
+      </w:r>
+      <w:proofErr w:type="spellStart"/>
+      <w:r>
+        <w:rPr>
+          <w:rFonts w:ascii="Garamond" w:hAnsi="Garamond"/>
+          <w:b/>
+          <w:bCs/>
+        </w:rPr>
+        <w:t>socket.on</w:t>
+      </w:r>
+      <w:proofErr w:type="spellEnd"/>
+      <w:r>
+        <w:rPr>
+          <w:rFonts w:ascii="Garamond" w:hAnsi="Garamond"/>
+          <w:b/>
+          <w:bCs/>
+        </w:rPr>
+        <w:t>()</w:t>
+      </w:r>
+      <w:r>
+        <w:rPr>
+          <w:rFonts w:ascii="Garamond" w:hAnsi="Garamond"/>
+        </w:rPr>
+        <w:t xml:space="preserve"> or </w:t>
+      </w:r>
+      <w:proofErr w:type="spellStart"/>
+      <w:r>
+        <w:rPr>
+          <w:rFonts w:ascii="Garamond" w:hAnsi="Garamond"/>
+          <w:b/>
+          <w:bCs/>
+        </w:rPr>
+        <w:t>io.on</w:t>
+      </w:r>
+      <w:proofErr w:type="spellEnd"/>
+      <w:r>
+        <w:rPr>
+          <w:rFonts w:ascii="Garamond" w:hAnsi="Garamond"/>
+          <w:b/>
+          <w:bCs/>
+        </w:rPr>
+        <w:t>()</w:t>
+      </w:r>
+      <w:r>
+        <w:rPr>
+          <w:rFonts w:ascii="Garamond" w:hAnsi="Garamond"/>
+        </w:rPr>
+        <w:t xml:space="preserve"> and emitters </w:t>
+      </w:r>
+      <w:proofErr w:type="spellStart"/>
+      <w:r>
+        <w:rPr>
+          <w:rFonts w:ascii="Garamond" w:hAnsi="Garamond"/>
+          <w:b/>
+          <w:bCs/>
+        </w:rPr>
+        <w:t>socket.emit</w:t>
+      </w:r>
+      <w:proofErr w:type="spellEnd"/>
+      <w:r>
+        <w:rPr>
+          <w:rFonts w:ascii="Garamond" w:hAnsi="Garamond"/>
+          <w:b/>
+          <w:bCs/>
+        </w:rPr>
+        <w:t>()</w:t>
+      </w:r>
+      <w:r>
+        <w:rPr>
+          <w:rFonts w:ascii="Garamond" w:hAnsi="Garamond"/>
+        </w:rPr>
+        <w:t xml:space="preserve"> or </w:t>
+      </w:r>
+      <w:proofErr w:type="spellStart"/>
+      <w:r>
+        <w:rPr>
+          <w:rFonts w:ascii="Garamond" w:hAnsi="Garamond"/>
+          <w:b/>
+          <w:bCs/>
+        </w:rPr>
+        <w:t>io.emit</w:t>
+      </w:r>
+      <w:proofErr w:type="spellEnd"/>
+      <w:r>
+        <w:rPr>
+          <w:rFonts w:ascii="Garamond" w:hAnsi="Garamond"/>
+          <w:b/>
+          <w:bCs/>
+        </w:rPr>
+        <w:t>()</w:t>
+      </w:r>
+      <w:r>
+        <w:rPr>
+          <w:rFonts w:ascii="Garamond" w:hAnsi="Garamond"/>
+        </w:rPr>
+        <w:t>.</w:t>
       </w:r>
     </w:p>
     <w:p>
@@ -9760,6 +10127,7 @@
         </w:rPr>
         <w:t xml:space="preserve">On the frontend, the </w:t>
       </w:r>
+      <w:proofErr w:type="spellStart"/>
       <w:r>
         <w:rPr>
           <w:rFonts w:ascii="Garamond" w:hAnsi="Garamond"/>
@@ -9768,12 +10136,14 @@
         </w:rPr>
         <w:t>Main.jsx</w:t>
       </w:r>
+      <w:proofErr w:type="spellEnd"/>
       <w:r>
         <w:rPr>
           <w:rFonts w:ascii="Garamond" w:hAnsi="Garamond"/>
         </w:rPr>
         <w:t xml:space="preserve"> component acts as the top-level component for real-time messaging functionality. It provides </w:t>
       </w:r>
+      <w:proofErr w:type="spellStart"/>
       <w:r>
         <w:rPr>
           <w:rFonts w:ascii="Garamond" w:hAnsi="Garamond"/>
@@ -9782,12 +10152,14 @@
         </w:rPr>
         <w:t>UserContext</w:t>
       </w:r>
+      <w:proofErr w:type="spellEnd"/>
       <w:r>
         <w:rPr>
           <w:rFonts w:ascii="Garamond" w:hAnsi="Garamond"/>
         </w:rPr>
         <w:t xml:space="preserve"> and </w:t>
       </w:r>
+      <w:proofErr w:type="spellStart"/>
       <w:r>
         <w:rPr>
           <w:rFonts w:ascii="Garamond" w:hAnsi="Garamond"/>
@@ -9796,12 +10168,14 @@
         </w:rPr>
         <w:t>ChatContext</w:t>
       </w:r>
+      <w:proofErr w:type="spellEnd"/>
       <w:r>
         <w:rPr>
           <w:rFonts w:ascii="Garamond" w:hAnsi="Garamond"/>
         </w:rPr>
         <w:t xml:space="preserve"> which allow user and chat state to be shared across the application and conditionally renders the </w:t>
       </w:r>
+      <w:proofErr w:type="spellStart"/>
       <w:r>
         <w:rPr>
           <w:rFonts w:ascii="Garamond" w:hAnsi="Garamond"/>
@@ -9810,12 +10184,14 @@
         </w:rPr>
         <w:t>ChatNotifier</w:t>
       </w:r>
+      <w:proofErr w:type="spellEnd"/>
       <w:r>
         <w:rPr>
           <w:rFonts w:ascii="Garamond" w:hAnsi="Garamond"/>
         </w:rPr>
         <w:t xml:space="preserve">, </w:t>
       </w:r>
+      <w:proofErr w:type="spellStart"/>
       <w:r>
         <w:rPr>
           <w:rFonts w:ascii="Garamond" w:hAnsi="Garamond"/>
@@ -9824,12 +10200,14 @@
         </w:rPr>
         <w:t>ChatMessagesIcon</w:t>
       </w:r>
+      <w:proofErr w:type="spellEnd"/>
       <w:r>
         <w:rPr>
           <w:rFonts w:ascii="Garamond" w:hAnsi="Garamond"/>
         </w:rPr>
         <w:t xml:space="preserve">, and </w:t>
       </w:r>
+      <w:proofErr w:type="spellStart"/>
       <w:r>
         <w:rPr>
           <w:rFonts w:ascii="Garamond" w:hAnsi="Garamond"/>
@@ -9838,12 +10216,14 @@
         </w:rPr>
         <w:t>MessagesDrawer</w:t>
       </w:r>
+      <w:proofErr w:type="spellEnd"/>
       <w:r>
         <w:rPr>
           <w:rFonts w:ascii="Garamond" w:hAnsi="Garamond"/>
         </w:rPr>
         <w:t xml:space="preserve"> components only if a user is logged in. </w:t>
       </w:r>
+      <w:proofErr w:type="spellStart"/>
       <w:r>
         <w:rPr>
           <w:rFonts w:ascii="Garamond" w:hAnsi="Garamond"/>
@@ -9852,12 +10232,14 @@
         </w:rPr>
         <w:t>Main.jsx</w:t>
       </w:r>
+      <w:proofErr w:type="spellEnd"/>
       <w:r>
         <w:rPr>
           <w:rFonts w:ascii="Garamond" w:hAnsi="Garamond"/>
         </w:rPr>
         <w:t xml:space="preserve"> also manages the socket.io client connection with a </w:t>
       </w:r>
+      <w:proofErr w:type="spellStart"/>
       <w:r>
         <w:rPr>
           <w:rFonts w:ascii="Garamond" w:hAnsi="Garamond"/>
@@ -9866,6 +10248,7 @@
         </w:rPr>
         <w:t>useEffect</w:t>
       </w:r>
+      <w:proofErr w:type="spellEnd"/>
       <w:r>
         <w:rPr>
           <w:rFonts w:ascii="Garamond" w:hAnsi="Garamond"/>
@@ -9884,7 +10267,7 @@
         <w:rPr>
           <w:rFonts w:ascii="Garamond" w:hAnsi="Garamond"/>
         </w:rPr>
-        <w:t xml:space="preserve"> login status. When a user is logs in, the client connects</w:t>
+        <w:t xml:space="preserve"> login status. When a user logs in, the client connects</w:t>
       </w:r>
       <w:r>
         <w:rPr>
@@ -9892,6 +10275,7 @@
         </w:rPr>
         <w:t xml:space="preserve"> using the app’s </w:t>
       </w:r>
+      <w:proofErr w:type="spellStart"/>
       <w:r>
         <w:rPr>
           <w:rFonts w:ascii="Garamond" w:hAnsi="Garamond"/>
@@ -9900,6 +10284,7 @@
         </w:rPr>
         <w:t>socket.mjs</w:t>
       </w:r>
+      <w:proofErr w:type="spellEnd"/>
       <w:r>
         <w:rPr>
           <w:rFonts w:ascii="Garamond" w:hAnsi="Garamond"/>
@@ -9956,7 +10341,31 @@
         <w:rPr>
           <w:rFonts w:ascii="Garamond" w:hAnsi="Garamond"/>
         </w:rPr>
-        <w:t xml:space="preserve"> stored in an http-only cookie, but express and socket.io handle it differently. For http requests, protected chat-history routes use the </w:t>
+        <w:t xml:space="preserve"> stored in an </w:t>
+      </w:r>
+      <w:r>
+        <w:rPr>
+          <w:rFonts w:ascii="Garamond" w:hAnsi="Garamond"/>
+        </w:rPr>
+        <w:t>HTTP</w:t>
+      </w:r>
+      <w:r>
+        <w:rPr>
+          <w:rFonts w:ascii="Garamond" w:hAnsi="Garamond"/>
+        </w:rPr>
+        <w:t xml:space="preserve">-only cookie, but express and socket.io handle it differently. For </w:t>
+      </w:r>
+      <w:r>
+        <w:rPr>
+          <w:rFonts w:ascii="Garamond" w:hAnsi="Garamond"/>
+        </w:rPr>
+        <w:t>HTTP</w:t>
+      </w:r>
+      <w:r>
+        <w:rPr>
+          <w:rFonts w:ascii="Garamond" w:hAnsi="Garamond"/>
+        </w:rPr>
+        <w:t xml:space="preserve"> requests, protected chat-history routes use the </w:t>
       </w:r>
       <w:r>
         <w:rPr>
@@ -9986,6 +10395,7 @@
         </w:rPr>
         <w:t xml:space="preserve"> cookie from </w:t>
       </w:r>
+      <w:proofErr w:type="spellStart"/>
       <w:r>
         <w:rPr>
           <w:rFonts w:ascii="Garamond" w:hAnsi="Garamond"/>
@@ -9994,12 +10404,14 @@
         </w:rPr>
         <w:t>req.cookies</w:t>
       </w:r>
+      <w:proofErr w:type="spellEnd"/>
       <w:r>
         <w:rPr>
           <w:rFonts w:ascii="Garamond" w:hAnsi="Garamond"/>
         </w:rPr>
         <w:t xml:space="preserve">, verifies it and retrieves the matching user from the database and attaches user info to </w:t>
       </w:r>
+      <w:proofErr w:type="spellStart"/>
       <w:r>
         <w:rPr>
           <w:rFonts w:ascii="Garamond" w:hAnsi="Garamond"/>
@@ -10008,12 +10420,14 @@
         </w:rPr>
         <w:t>req.user</w:t>
       </w:r>
+      <w:proofErr w:type="spellEnd"/>
       <w:r>
         <w:rPr>
           <w:rFonts w:ascii="Garamond" w:hAnsi="Garamond"/>
         </w:rPr>
         <w:t xml:space="preserve"> using the </w:t>
       </w:r>
+      <w:proofErr w:type="spellStart"/>
       <w:r>
         <w:rPr>
           <w:rFonts w:ascii="Garamond" w:hAnsi="Garamond"/>
@@ -10022,6 +10436,7 @@
         </w:rPr>
         <w:t>buildUserInfo</w:t>
       </w:r>
+      <w:proofErr w:type="spellEnd"/>
       <w:r>
         <w:rPr>
           <w:rFonts w:ascii="Garamond" w:hAnsi="Garamond"/>
@@ -10038,7 +10453,7 @@
         <w:rPr>
           <w:rFonts w:ascii="Garamond" w:hAnsi="Garamond"/>
         </w:rPr>
-        <w:t xml:space="preserve"> for their own authentication needs</w:t>
+        <w:t xml:space="preserve"> for their own needs</w:t>
       </w:r>
       <w:r>
         <w:rPr>
@@ -10060,6 +10475,7 @@
         </w:rPr>
         <w:t xml:space="preserve">Because socket.io cannot access request and response objects, custom middleware is used. In </w:t>
       </w:r>
+      <w:proofErr w:type="spellStart"/>
       <w:r>
         <w:rPr>
           <w:rFonts w:ascii="Garamond" w:hAnsi="Garamond"/>
@@ -10068,19 +10484,30 @@
         </w:rPr>
         <w:t>server.mjs</w:t>
       </w:r>
+      <w:proofErr w:type="spellEnd"/>
       <w:r>
         <w:rPr>
           <w:rFonts w:ascii="Garamond" w:hAnsi="Garamond"/>
         </w:rPr>
         <w:t xml:space="preserve">, the </w:t>
       </w:r>
-      <w:r>
-        <w:rPr>
-          <w:rFonts w:ascii="Garamond" w:hAnsi="Garamond"/>
-          <w:b/>
-          <w:bCs/>
-        </w:rPr>
-        <w:t>io.use()</w:t>
+      <w:proofErr w:type="spellStart"/>
+      <w:r>
+        <w:rPr>
+          <w:rFonts w:ascii="Garamond" w:hAnsi="Garamond"/>
+          <w:b/>
+          <w:bCs/>
+        </w:rPr>
+        <w:t>io.use</w:t>
+      </w:r>
+      <w:proofErr w:type="spellEnd"/>
+      <w:r>
+        <w:rPr>
+          <w:rFonts w:ascii="Garamond" w:hAnsi="Garamond"/>
+          <w:b/>
+          <w:bCs/>
+        </w:rPr>
+        <w:t>()</w:t>
       </w:r>
       <w:r>
         <w:rPr>
@@ -10088,6 +10515,7 @@
         </w:rPr>
         <w:t xml:space="preserve"> middleware reads the cookie from </w:t>
       </w:r>
+      <w:proofErr w:type="spellStart"/>
       <w:r>
         <w:rPr>
           <w:rFonts w:ascii="Garamond" w:hAnsi="Garamond"/>
@@ -10099,9 +10527,12 @@
       <w:r>
         <w:rPr>
           <w:rFonts w:ascii="Garamond" w:hAnsi="Garamond"/>
+          <w:b/>
+          <w:bCs/>
         </w:rPr>
         <w:t>cookie</w:t>
       </w:r>
+      <w:proofErr w:type="spellEnd"/>
       <w:r>
         <w:rPr>
           <w:rFonts w:ascii="Garamond" w:hAnsi="Garamond"/>
@@ -10144,6 +10575,7 @@
         </w:rPr>
         <w:t xml:space="preserve"> to </w:t>
       </w:r>
+      <w:proofErr w:type="spellStart"/>
       <w:r>
         <w:rPr>
           <w:rFonts w:ascii="Garamond" w:hAnsi="Garamond"/>
@@ -10152,12 +10584,14 @@
         </w:rPr>
         <w:t>socket.user</w:t>
       </w:r>
+      <w:proofErr w:type="spellEnd"/>
       <w:r>
         <w:rPr>
           <w:rFonts w:ascii="Garamond" w:hAnsi="Garamond"/>
         </w:rPr>
         <w:t xml:space="preserve"> using the </w:t>
       </w:r>
+      <w:proofErr w:type="spellStart"/>
       <w:r>
         <w:rPr>
           <w:rFonts w:ascii="Garamond" w:hAnsi="Garamond"/>
@@ -10182,6 +10616,7 @@
         </w:rPr>
         <w:t>UserInfo</w:t>
       </w:r>
+      <w:proofErr w:type="spellEnd"/>
       <w:r>
         <w:rPr>
           <w:rFonts w:ascii="Garamond" w:hAnsi="Garamond"/>
@@ -10230,7 +10665,21 @@
         <w:rPr>
           <w:rFonts w:ascii="Garamond" w:hAnsi="Garamond"/>
         </w:rPr>
-        <w:t xml:space="preserve"> to autoconnect.</w:t>
+        <w:t xml:space="preserve"> to </w:t>
+      </w:r>
+      <w:proofErr w:type="spellStart"/>
+      <w:r>
+        <w:rPr>
+          <w:rFonts w:ascii="Garamond" w:hAnsi="Garamond"/>
+        </w:rPr>
+        <w:t>autoconnect</w:t>
+      </w:r>
+      <w:proofErr w:type="spellEnd"/>
+      <w:r>
+        <w:rPr>
+          <w:rFonts w:ascii="Garamond" w:hAnsi="Garamond"/>
+        </w:rPr>
+        <w:t>.</w:t>
       </w:r>
     </w:p>
     <w:p>
@@ -10244,15 +10693,39 @@
         <w:rPr>
           <w:rFonts w:ascii="Garamond" w:hAnsi="Garamond"/>
         </w:rPr>
-        <w:t xml:space="preserve">Once a socket has been authenticated, the backend’s </w:t>
-      </w:r>
-      <w:r>
-        <w:rPr>
-          <w:rFonts w:ascii="Garamond" w:hAnsi="Garamond"/>
-          <w:b/>
-          <w:bCs/>
-        </w:rPr>
-        <w:t>io.on(‘connection’)</w:t>
+        <w:t xml:space="preserve">Once a socket has been authenticated, the </w:t>
+      </w:r>
+      <w:proofErr w:type="spellStart"/>
+      <w:r>
+        <w:rPr>
+          <w:rFonts w:ascii="Garamond" w:hAnsi="Garamond"/>
+        </w:rPr>
+        <w:t>backend’s</w:t>
+      </w:r>
+      <w:proofErr w:type="spellEnd"/>
+      <w:r>
+        <w:rPr>
+          <w:rFonts w:ascii="Garamond" w:hAnsi="Garamond"/>
+        </w:rPr>
+        <w:t xml:space="preserve"> </w:t>
+      </w:r>
+      <w:proofErr w:type="spellStart"/>
+      <w:r>
+        <w:rPr>
+          <w:rFonts w:ascii="Garamond" w:hAnsi="Garamond"/>
+          <w:b/>
+          <w:bCs/>
+        </w:rPr>
+        <w:t>io.on</w:t>
+      </w:r>
+      <w:proofErr w:type="spellEnd"/>
+      <w:r>
+        <w:rPr>
+          <w:rFonts w:ascii="Garamond" w:hAnsi="Garamond"/>
+          <w:b/>
+          <w:bCs/>
+        </w:rPr>
+        <w:t>(‘connection’)</w:t>
       </w:r>
       <w:r>
         <w:rPr>
@@ -10260,6 +10733,7 @@
         </w:rPr>
         <w:t xml:space="preserve"> handler uses the authenticated </w:t>
       </w:r>
+      <w:proofErr w:type="spellStart"/>
       <w:r>
         <w:rPr>
           <w:rFonts w:ascii="Garamond" w:hAnsi="Garamond"/>
@@ -10268,6 +10742,7 @@
         </w:rPr>
         <w:t>socket.user</w:t>
       </w:r>
+      <w:proofErr w:type="spellEnd"/>
       <w:r>
         <w:rPr>
           <w:rFonts w:ascii="Garamond" w:hAnsi="Garamond"/>
@@ -10298,7 +10773,7 @@
         <w:rPr>
           <w:rFonts w:ascii="Garamond" w:hAnsi="Garamond"/>
         </w:rPr>
-        <w:t xml:space="preserve"> named </w:t>
+        <w:t xml:space="preserve"> </w:t>
       </w:r>
       <w:r>
         <w:rPr>
@@ -10326,7 +10801,31 @@
         <w:rPr>
           <w:rFonts w:ascii="Garamond" w:hAnsi="Garamond"/>
         </w:rPr>
-        <w:t>which is used for notifying them of messages received from any other user.</w:t>
+        <w:t xml:space="preserve">which is </w:t>
+      </w:r>
+      <w:r>
+        <w:rPr>
+          <w:rFonts w:ascii="Garamond" w:hAnsi="Garamond"/>
+        </w:rPr>
+        <w:t xml:space="preserve">later </w:t>
+      </w:r>
+      <w:r>
+        <w:rPr>
+          <w:rFonts w:ascii="Garamond" w:hAnsi="Garamond"/>
+        </w:rPr>
+        <w:t>used for notifying them</w:t>
+      </w:r>
+      <w:r>
+        <w:rPr>
+          <w:rFonts w:ascii="Garamond" w:hAnsi="Garamond"/>
+        </w:rPr>
+        <w:t xml:space="preserve"> in real-time</w:t>
+      </w:r>
+      <w:r>
+        <w:rPr>
+          <w:rFonts w:ascii="Garamond" w:hAnsi="Garamond"/>
+        </w:rPr>
+        <w:t xml:space="preserve"> of messages received from any other user.</w:t>
       </w:r>
       <w:r>
         <w:rPr>
@@ -10334,6 +10833,7 @@
         </w:rPr>
         <w:t xml:space="preserve"> Crucially, the server also initialises </w:t>
       </w:r>
+      <w:proofErr w:type="spellStart"/>
       <w:r>
         <w:rPr>
           <w:rFonts w:ascii="Garamond" w:hAnsi="Garamond"/>
@@ -10342,6 +10842,7 @@
         </w:rPr>
         <w:t>socket.data.dmPeers</w:t>
       </w:r>
+      <w:proofErr w:type="spellEnd"/>
       <w:r>
         <w:rPr>
           <w:rFonts w:ascii="Garamond" w:hAnsi="Garamond"/>
@@ -10358,7 +10859,43 @@
         <w:rPr>
           <w:rFonts w:ascii="Garamond" w:hAnsi="Garamond"/>
         </w:rPr>
-        <w:t>between student and tutors.</w:t>
+        <w:t xml:space="preserve">and chat recipient user id </w:t>
+      </w:r>
+      <w:r>
+        <w:rPr>
+          <w:rFonts w:ascii="Garamond" w:hAnsi="Garamond"/>
+        </w:rPr>
+        <w:t>for</w:t>
+      </w:r>
+      <w:r>
+        <w:rPr>
+          <w:rFonts w:ascii="Garamond" w:hAnsi="Garamond"/>
+        </w:rPr>
+        <w:t xml:space="preserve"> student and tutor</w:t>
+      </w:r>
+      <w:r>
+        <w:rPr>
+          <w:rFonts w:ascii="Garamond" w:hAnsi="Garamond"/>
+        </w:rPr>
+        <w:t xml:space="preserve"> chat pairings</w:t>
+      </w:r>
+      <w:r>
+        <w:rPr>
+          <w:rFonts w:ascii="Garamond" w:hAnsi="Garamond"/>
+        </w:rPr>
+        <w:t>.</w:t>
+      </w:r>
+      <w:r>
+        <w:rPr>
+          <w:rFonts w:ascii="Garamond" w:hAnsi="Garamond"/>
+        </w:rPr>
+        <w:t xml:space="preserve"> While the socket is connected, this keeps a record of the rooms and recipients a user has been having conversations with</w:t>
+      </w:r>
+      <w:r>
+        <w:rPr>
+          <w:rFonts w:ascii="Garamond" w:hAnsi="Garamond"/>
+        </w:rPr>
+        <w:t xml:space="preserve"> since login.</w:t>
       </w:r>
     </w:p>
     <w:p>
@@ -10374,6 +10911,7 @@
         </w:rPr>
         <w:t xml:space="preserve">A conversation room is created only when the student opens a chat window in the frontend via the ‘message tutor’ button in the </w:t>
       </w:r>
+      <w:proofErr w:type="spellStart"/>
       <w:r>
         <w:rPr>
           <w:rFonts w:ascii="Garamond" w:hAnsi="Garamond"/>
@@ -10382,11 +10920,36 @@
         </w:rPr>
         <w:t>FocusedTutorCard</w:t>
       </w:r>
-      <w:r>
-        <w:rPr>
-          <w:rFonts w:ascii="Garamond" w:hAnsi="Garamond"/>
-        </w:rPr>
-        <w:t xml:space="preserve"> component. The button can only be clicked if a student is logged in and it opens the </w:t>
+      <w:proofErr w:type="spellEnd"/>
+      <w:r>
+        <w:rPr>
+          <w:rFonts w:ascii="Garamond" w:hAnsi="Garamond"/>
+        </w:rPr>
+        <w:t xml:space="preserve"> component. The button </w:t>
+      </w:r>
+      <w:r>
+        <w:rPr>
+          <w:rFonts w:ascii="Garamond" w:hAnsi="Garamond"/>
+        </w:rPr>
+        <w:t>is only available</w:t>
+      </w:r>
+      <w:r>
+        <w:rPr>
+          <w:rFonts w:ascii="Garamond" w:hAnsi="Garamond"/>
+        </w:rPr>
+        <w:t xml:space="preserve"> if a student is logged in and</w:t>
+      </w:r>
+      <w:r>
+        <w:rPr>
+          <w:rFonts w:ascii="Garamond" w:hAnsi="Garamond"/>
+        </w:rPr>
+        <w:t>, when clicked,</w:t>
+      </w:r>
+      <w:r>
+        <w:rPr>
+          <w:rFonts w:ascii="Garamond" w:hAnsi="Garamond"/>
+        </w:rPr>
+        <w:t xml:space="preserve">  opens the </w:t>
       </w:r>
       <w:r>
         <w:rPr>
@@ -10402,6 +10965,7 @@
         </w:rPr>
         <w:t xml:space="preserve"> component. Once opened, this component emits the </w:t>
       </w:r>
+      <w:proofErr w:type="spellStart"/>
       <w:r>
         <w:rPr>
           <w:rFonts w:ascii="Garamond" w:hAnsi="Garamond"/>
@@ -10410,6 +10974,7 @@
         </w:rPr>
         <w:t>join_room</w:t>
       </w:r>
+      <w:proofErr w:type="spellEnd"/>
       <w:r>
         <w:rPr>
           <w:rFonts w:ascii="Garamond" w:hAnsi="Garamond"/>
@@ -10440,6 +11005,7 @@
         </w:rPr>
         <w:t xml:space="preserve">tutor’s user id (loaded in </w:t>
       </w:r>
+      <w:proofErr w:type="spellStart"/>
       <w:r>
         <w:rPr>
           <w:rFonts w:ascii="Garamond" w:hAnsi="Garamond"/>
@@ -10452,8 +11018,16 @@
         <w:rPr>
           <w:rFonts w:ascii="Garamond" w:hAnsi="Garamond"/>
         </w:rPr>
-        <w:t xml:space="preserve">’s initial render) labelled as </w:t>
-      </w:r>
+        <w:t>’s</w:t>
+      </w:r>
+      <w:proofErr w:type="spellEnd"/>
+      <w:r>
+        <w:rPr>
+          <w:rFonts w:ascii="Garamond" w:hAnsi="Garamond"/>
+        </w:rPr>
+        <w:t xml:space="preserve"> initial render) labelled as </w:t>
+      </w:r>
+      <w:proofErr w:type="spellStart"/>
       <w:r>
         <w:rPr>
           <w:rFonts w:ascii="Garamond" w:hAnsi="Garamond"/>
@@ -10462,6 +11036,7 @@
         </w:rPr>
         <w:t>otherUserId</w:t>
       </w:r>
+      <w:proofErr w:type="spellEnd"/>
       <w:r>
         <w:rPr>
           <w:rFonts w:ascii="Garamond" w:hAnsi="Garamond"/>
@@ -10484,15 +11059,32 @@
         <w:rPr>
           <w:rFonts w:ascii="Garamond" w:hAnsi="Garamond"/>
         </w:rPr>
-        <w:t xml:space="preserve">’s user id via </w:t>
-      </w:r>
-      <w:r>
-        <w:rPr>
-          <w:rFonts w:ascii="Garamond" w:hAnsi="Garamond"/>
-          <w:b/>
-          <w:bCs/>
-        </w:rPr>
-        <w:t xml:space="preserve">socket.user </w:t>
+        <w:t xml:space="preserve">’s </w:t>
+      </w:r>
+      <w:r>
+        <w:rPr>
+          <w:rFonts w:ascii="Garamond" w:hAnsi="Garamond"/>
+        </w:rPr>
+        <w:lastRenderedPageBreak/>
+        <w:t xml:space="preserve">user id via </w:t>
+      </w:r>
+      <w:proofErr w:type="spellStart"/>
+      <w:r>
+        <w:rPr>
+          <w:rFonts w:ascii="Garamond" w:hAnsi="Garamond"/>
+          <w:b/>
+          <w:bCs/>
+        </w:rPr>
+        <w:t>socket.user</w:t>
+      </w:r>
+      <w:proofErr w:type="spellEnd"/>
+      <w:r>
+        <w:rPr>
+          <w:rFonts w:ascii="Garamond" w:hAnsi="Garamond"/>
+          <w:b/>
+          <w:bCs/>
+        </w:rPr>
+        <w:t xml:space="preserve"> </w:t>
       </w:r>
       <w:r>
         <w:rPr>
@@ -10524,6 +11116,7 @@
         </w:rPr>
         <w:t xml:space="preserve"> from </w:t>
       </w:r>
+      <w:proofErr w:type="spellStart"/>
       <w:r>
         <w:rPr>
           <w:rFonts w:ascii="Garamond" w:hAnsi="Garamond"/>
@@ -10532,64 +11125,1395 @@
         </w:rPr>
         <w:t>otherUserId</w:t>
       </w:r>
-      <w:r>
-        <w:rPr>
-          <w:rFonts w:ascii="Garamond" w:hAnsi="Garamond"/>
-        </w:rPr>
-        <w:t xml:space="preserve">, prevents self-chat, and </w:t>
+      <w:proofErr w:type="spellEnd"/>
+      <w:r>
+        <w:rPr>
+          <w:rFonts w:ascii="Garamond" w:hAnsi="Garamond"/>
+        </w:rPr>
+        <w:t xml:space="preserve">, </w:t>
+      </w:r>
+      <w:r>
+        <w:rPr>
+          <w:rFonts w:ascii="Garamond" w:hAnsi="Garamond"/>
+        </w:rPr>
+        <w:t xml:space="preserve">runs validation to </w:t>
+      </w:r>
+      <w:r>
+        <w:rPr>
+          <w:rFonts w:ascii="Garamond" w:hAnsi="Garamond"/>
+        </w:rPr>
+        <w:t>prevent</w:t>
+      </w:r>
+      <w:r>
+        <w:rPr>
+          <w:rFonts w:ascii="Garamond" w:hAnsi="Garamond"/>
+        </w:rPr>
+        <w:t xml:space="preserve"> </w:t>
+      </w:r>
+      <w:r>
+        <w:rPr>
+          <w:rFonts w:ascii="Garamond" w:hAnsi="Garamond"/>
+        </w:rPr>
+        <w:t xml:space="preserve">self-chat, and generates a permanent, unique room name by ordering the </w:t>
+      </w:r>
+      <w:r>
+        <w:rPr>
+          <w:rFonts w:ascii="Garamond" w:hAnsi="Garamond"/>
+        </w:rPr>
+        <w:t>logged-in user</w:t>
+      </w:r>
+      <w:r>
+        <w:rPr>
+          <w:rFonts w:ascii="Garamond" w:hAnsi="Garamond"/>
+        </w:rPr>
+        <w:t xml:space="preserve"> and </w:t>
+      </w:r>
+      <w:r>
+        <w:rPr>
+          <w:rFonts w:ascii="Garamond" w:hAnsi="Garamond"/>
+        </w:rPr>
+        <w:t>recipient user</w:t>
+      </w:r>
+      <w:r>
+        <w:rPr>
+          <w:rFonts w:ascii="Garamond" w:hAnsi="Garamond"/>
+        </w:rPr>
+        <w:t xml:space="preserve"> ids from lowest to highest</w:t>
+      </w:r>
+      <w:r>
+        <w:rPr>
+          <w:rFonts w:ascii="Garamond" w:hAnsi="Garamond"/>
+        </w:rPr>
+        <w:t xml:space="preserve">. </w:t>
+      </w:r>
+      <w:r>
+        <w:rPr>
+          <w:rFonts w:ascii="Garamond" w:hAnsi="Garamond"/>
+        </w:rPr>
+        <w:t>The room name is generated this way</w:t>
+      </w:r>
+      <w:r>
+        <w:rPr>
+          <w:rFonts w:ascii="Garamond" w:hAnsi="Garamond"/>
+        </w:rPr>
+        <w:t xml:space="preserve"> so both </w:t>
+      </w:r>
+      <w:r>
+        <w:rPr>
+          <w:rFonts w:ascii="Garamond" w:hAnsi="Garamond"/>
+        </w:rPr>
+        <w:t>participants</w:t>
+      </w:r>
+      <w:r>
+        <w:rPr>
+          <w:rFonts w:ascii="Garamond" w:hAnsi="Garamond"/>
+        </w:rPr>
+        <w:t xml:space="preserve"> in a chat resolve to the same room name. </w:t>
+      </w:r>
+      <w:r>
+        <w:rPr>
+          <w:rFonts w:ascii="Garamond" w:hAnsi="Garamond"/>
+        </w:rPr>
+        <w:t>The logged-in user’s socket then joins that room and the room number</w:t>
+      </w:r>
+      <w:r>
+        <w:rPr>
+          <w:rFonts w:ascii="Garamond" w:hAnsi="Garamond"/>
+        </w:rPr>
+        <w:t xml:space="preserve"> and recipient/other user id</w:t>
+      </w:r>
+      <w:r>
+        <w:rPr>
+          <w:rFonts w:ascii="Garamond" w:hAnsi="Garamond"/>
+        </w:rPr>
+        <w:t xml:space="preserve"> </w:t>
+      </w:r>
+      <w:r>
+        <w:rPr>
+          <w:rFonts w:ascii="Garamond" w:hAnsi="Garamond"/>
+        </w:rPr>
+        <w:t>are</w:t>
+      </w:r>
+      <w:r>
+        <w:rPr>
+          <w:rFonts w:ascii="Garamond" w:hAnsi="Garamond"/>
+        </w:rPr>
+        <w:t xml:space="preserve"> stored in </w:t>
+      </w:r>
+      <w:proofErr w:type="spellStart"/>
+      <w:r>
+        <w:rPr>
+          <w:rFonts w:ascii="Garamond" w:hAnsi="Garamond"/>
+          <w:b/>
+          <w:bCs/>
+        </w:rPr>
+        <w:t>socket.data.dmPeers</w:t>
+      </w:r>
+      <w:proofErr w:type="spellEnd"/>
+      <w:r>
+        <w:rPr>
+          <w:rFonts w:ascii="Garamond" w:hAnsi="Garamond"/>
+          <w:b/>
+          <w:bCs/>
+        </w:rPr>
+        <w:t xml:space="preserve"> </w:t>
+      </w:r>
+      <w:r>
+        <w:rPr>
+          <w:rFonts w:ascii="Garamond" w:hAnsi="Garamond"/>
+        </w:rPr>
+        <w:t>as key-value pairs</w:t>
+      </w:r>
+      <w:r>
+        <w:rPr>
+          <w:rFonts w:ascii="Garamond" w:hAnsi="Garamond"/>
+        </w:rPr>
+        <w:t xml:space="preserve">. Finally, the server emits the room name back to the frontend where it is stored in the </w:t>
+      </w:r>
+      <w:r>
+        <w:rPr>
+          <w:rFonts w:ascii="Garamond" w:hAnsi="Garamond"/>
+          <w:b/>
+          <w:bCs/>
+        </w:rPr>
+        <w:t>ChatWindow</w:t>
+      </w:r>
+      <w:r>
+        <w:rPr>
+          <w:rFonts w:ascii="Garamond" w:hAnsi="Garamond"/>
+        </w:rPr>
+        <w:t xml:space="preserve"> component state and used to direct </w:t>
+      </w:r>
+      <w:r>
+        <w:rPr>
+          <w:rFonts w:ascii="Garamond" w:hAnsi="Garamond"/>
+        </w:rPr>
+        <w:t>the component’s subsequent chat</w:t>
+      </w:r>
+      <w:r>
+        <w:rPr>
+          <w:rFonts w:ascii="Garamond" w:hAnsi="Garamond"/>
+        </w:rPr>
+        <w:t xml:space="preserve"> messages to the correct room via </w:t>
+      </w:r>
+      <w:r>
+        <w:rPr>
+          <w:rFonts w:ascii="Garamond" w:hAnsi="Garamond"/>
+        </w:rPr>
+        <w:t>its</w:t>
+      </w:r>
+      <w:r>
+        <w:rPr>
+          <w:rFonts w:ascii="Garamond" w:hAnsi="Garamond"/>
+        </w:rPr>
+        <w:t xml:space="preserve"> </w:t>
+      </w:r>
+      <w:r>
+        <w:rPr>
+          <w:rFonts w:ascii="Garamond" w:hAnsi="Garamond"/>
+        </w:rPr>
+        <w:t xml:space="preserve">emitted </w:t>
+      </w:r>
+      <w:proofErr w:type="spellStart"/>
+      <w:r>
+        <w:rPr>
+          <w:rFonts w:ascii="Garamond" w:hAnsi="Garamond"/>
+          <w:b/>
+          <w:bCs/>
+        </w:rPr>
+        <w:t>chat</w:t>
+      </w:r>
+      <w:r>
+        <w:rPr>
+          <w:rFonts w:ascii="Garamond" w:hAnsi="Garamond"/>
+          <w:b/>
+          <w:bCs/>
+        </w:rPr>
+        <w:t>_message</w:t>
+      </w:r>
+      <w:proofErr w:type="spellEnd"/>
+      <w:r>
+        <w:rPr>
+          <w:rFonts w:ascii="Garamond" w:hAnsi="Garamond"/>
+        </w:rPr>
+        <w:t xml:space="preserve"> event.</w:t>
+      </w:r>
+    </w:p>
+    <w:p>
+      <w:pPr>
+        <w:spacing w:line="360" w:lineRule="auto"/>
+        <w:rPr>
+          <w:rFonts w:ascii="Garamond" w:hAnsi="Garamond"/>
+        </w:rPr>
+      </w:pPr>
+      <w:r>
+        <w:rPr>
+          <w:rFonts w:ascii="Garamond" w:hAnsi="Garamond"/>
+        </w:rPr>
+        <w:t xml:space="preserve">In parallel with joining a live room, </w:t>
+      </w:r>
+      <w:r>
+        <w:rPr>
+          <w:rFonts w:ascii="Garamond" w:hAnsi="Garamond"/>
+          <w:b/>
+          <w:bCs/>
+        </w:rPr>
+        <w:t>ChatWindow</w:t>
+      </w:r>
+      <w:r>
+        <w:rPr>
+          <w:rFonts w:ascii="Garamond" w:hAnsi="Garamond"/>
+        </w:rPr>
+        <w:t xml:space="preserve"> component fetches any historical messages for the same chat pair by sending an </w:t>
+      </w:r>
+      <w:r>
+        <w:rPr>
+          <w:rFonts w:ascii="Garamond" w:hAnsi="Garamond"/>
+        </w:rPr>
+        <w:t>HTTP</w:t>
+      </w:r>
+      <w:r>
+        <w:rPr>
+          <w:rFonts w:ascii="Garamond" w:hAnsi="Garamond"/>
+        </w:rPr>
+        <w:t xml:space="preserve"> request</w:t>
+      </w:r>
+      <w:r>
+        <w:rPr>
+          <w:rFonts w:ascii="Garamond" w:hAnsi="Garamond"/>
+        </w:rPr>
+        <w:t xml:space="preserve">. This request is handled by the protected </w:t>
+      </w:r>
+      <w:proofErr w:type="spellStart"/>
+      <w:r>
+        <w:rPr>
+          <w:rFonts w:ascii="Garamond" w:hAnsi="Garamond"/>
+          <w:b/>
+          <w:bCs/>
+        </w:rPr>
+        <w:t>getMessagesFromDB</w:t>
+      </w:r>
+      <w:proofErr w:type="spellEnd"/>
+      <w:r>
+        <w:rPr>
+          <w:rFonts w:ascii="Garamond" w:hAnsi="Garamond"/>
+          <w:b/>
+          <w:bCs/>
+        </w:rPr>
+        <w:t xml:space="preserve"> </w:t>
+      </w:r>
+      <w:r>
+        <w:rPr>
+          <w:rFonts w:ascii="Garamond" w:hAnsi="Garamond"/>
+        </w:rPr>
+        <w:t>controller which</w:t>
+      </w:r>
+      <w:r>
+        <w:rPr>
+          <w:rFonts w:ascii="Garamond" w:hAnsi="Garamond"/>
+        </w:rPr>
+        <w:t xml:space="preserve"> uses </w:t>
+      </w:r>
+      <w:proofErr w:type="spellStart"/>
+      <w:r>
+        <w:rPr>
+          <w:rFonts w:ascii="Garamond" w:hAnsi="Garamond"/>
+          <w:b/>
+          <w:bCs/>
+        </w:rPr>
+        <w:t>req.user</w:t>
+      </w:r>
+      <w:proofErr w:type="spellEnd"/>
+      <w:r>
+        <w:rPr>
+          <w:rFonts w:ascii="Garamond" w:hAnsi="Garamond"/>
+        </w:rPr>
+        <w:t xml:space="preserve"> and </w:t>
+      </w:r>
+      <w:proofErr w:type="spellStart"/>
+      <w:r>
+        <w:rPr>
+          <w:rFonts w:ascii="Garamond" w:hAnsi="Garamond"/>
+          <w:b/>
+          <w:bCs/>
+        </w:rPr>
+        <w:t>req.params.otherUserId</w:t>
+      </w:r>
+      <w:proofErr w:type="spellEnd"/>
+      <w:r>
+        <w:rPr>
+          <w:rFonts w:ascii="Garamond" w:hAnsi="Garamond"/>
+        </w:rPr>
+        <w:t xml:space="preserve"> to identify the participants, arranges the ids in ascending order, and checks if a room </w:t>
+      </w:r>
+      <w:r>
+        <w:rPr>
+          <w:rFonts w:ascii="Garamond" w:hAnsi="Garamond"/>
+        </w:rPr>
+        <w:t>for that chat pair</w:t>
+      </w:r>
+      <w:r>
+        <w:rPr>
+          <w:rFonts w:ascii="Garamond" w:hAnsi="Garamond"/>
+        </w:rPr>
+        <w:t xml:space="preserve"> is stored in the database</w:t>
+      </w:r>
+      <w:r>
+        <w:rPr>
+          <w:rFonts w:ascii="Garamond" w:hAnsi="Garamond"/>
+        </w:rPr>
+        <w:t xml:space="preserve">. </w:t>
+      </w:r>
+      <w:r>
+        <w:rPr>
+          <w:rFonts w:ascii="Garamond" w:hAnsi="Garamond"/>
+        </w:rPr>
+        <w:t xml:space="preserve">If a matching room is found, its messages are loaded from the database and rendered in the frontend </w:t>
+      </w:r>
+      <w:r>
+        <w:rPr>
+          <w:rFonts w:ascii="Garamond" w:hAnsi="Garamond"/>
+          <w:b/>
+          <w:bCs/>
+        </w:rPr>
+        <w:t>ChatWindow</w:t>
+      </w:r>
+      <w:r>
+        <w:rPr>
+          <w:rFonts w:ascii="Garamond" w:hAnsi="Garamond"/>
+        </w:rPr>
+        <w:t xml:space="preserve"> via state. If no room is found, an empty array is returned. </w:t>
+      </w:r>
+    </w:p>
+    <w:p>
+      <w:pPr>
+        <w:spacing w:line="360" w:lineRule="auto"/>
+        <w:rPr>
+          <w:rFonts w:ascii="Garamond" w:hAnsi="Garamond"/>
+        </w:rPr>
+      </w:pPr>
+      <w:r>
+        <w:rPr>
+          <w:rFonts w:ascii="Garamond" w:hAnsi="Garamond"/>
+        </w:rPr>
+        <w:t xml:space="preserve">For message persistence, when a user sends a message from </w:t>
+      </w:r>
+      <w:r>
+        <w:rPr>
+          <w:rFonts w:ascii="Garamond" w:hAnsi="Garamond"/>
+          <w:b/>
+          <w:bCs/>
+        </w:rPr>
+        <w:t xml:space="preserve">ChatWindow, </w:t>
+      </w:r>
+      <w:r>
+        <w:rPr>
+          <w:rFonts w:ascii="Garamond" w:hAnsi="Garamond"/>
+        </w:rPr>
+        <w:t>the component’s</w:t>
+      </w:r>
+      <w:r>
+        <w:rPr>
+          <w:rFonts w:ascii="Garamond" w:hAnsi="Garamond"/>
+          <w:b/>
+          <w:bCs/>
+        </w:rPr>
+        <w:t xml:space="preserve"> </w:t>
+      </w:r>
+      <w:proofErr w:type="spellStart"/>
+      <w:r>
+        <w:rPr>
+          <w:rFonts w:ascii="Garamond" w:hAnsi="Garamond"/>
+          <w:b/>
+          <w:bCs/>
+        </w:rPr>
+        <w:t>handleSend</w:t>
+      </w:r>
+      <w:proofErr w:type="spellEnd"/>
+      <w:r>
+        <w:rPr>
+          <w:rFonts w:ascii="Garamond" w:hAnsi="Garamond"/>
+          <w:b/>
+          <w:bCs/>
+        </w:rPr>
+        <w:t xml:space="preserve"> </w:t>
+      </w:r>
+      <w:r>
+        <w:rPr>
+          <w:rFonts w:ascii="Garamond" w:hAnsi="Garamond"/>
+        </w:rPr>
+        <w:t xml:space="preserve">function validates that the message is not empty and that a </w:t>
+      </w:r>
+      <w:r>
+        <w:rPr>
+          <w:rFonts w:ascii="Garamond" w:hAnsi="Garamond"/>
+          <w:b/>
+          <w:bCs/>
+        </w:rPr>
+        <w:t>room</w:t>
+      </w:r>
+      <w:r>
+        <w:rPr>
+          <w:rFonts w:ascii="Garamond" w:hAnsi="Garamond"/>
+        </w:rPr>
+        <w:t xml:space="preserve"> name has been received from the backend. It then emits the </w:t>
+      </w:r>
+      <w:proofErr w:type="spellStart"/>
+      <w:r>
+        <w:rPr>
+          <w:rFonts w:ascii="Garamond" w:hAnsi="Garamond"/>
+          <w:b/>
+          <w:bCs/>
+        </w:rPr>
+        <w:t>chat_message</w:t>
+      </w:r>
+      <w:proofErr w:type="spellEnd"/>
+      <w:r>
+        <w:rPr>
+          <w:rFonts w:ascii="Garamond" w:hAnsi="Garamond"/>
+        </w:rPr>
+        <w:t xml:space="preserve"> event containing the room name and trimmed message text</w:t>
+      </w:r>
+      <w:r>
+        <w:rPr>
+          <w:rFonts w:ascii="Garamond" w:hAnsi="Garamond"/>
+        </w:rPr>
+        <w:t xml:space="preserve"> to the server</w:t>
+      </w:r>
+      <w:r>
+        <w:rPr>
+          <w:rFonts w:ascii="Garamond" w:hAnsi="Garamond"/>
+        </w:rPr>
+        <w:t xml:space="preserve">. For security, the component does not send user or recipient user ids; instead, the backend </w:t>
+      </w:r>
+      <w:r>
+        <w:rPr>
+          <w:rFonts w:ascii="Garamond" w:hAnsi="Garamond"/>
+        </w:rPr>
+        <w:t xml:space="preserve">again </w:t>
+      </w:r>
+      <w:r>
+        <w:rPr>
+          <w:rFonts w:ascii="Garamond" w:hAnsi="Garamond"/>
+        </w:rPr>
+        <w:t xml:space="preserve">derives the ids from the </w:t>
+      </w:r>
+      <w:proofErr w:type="spellStart"/>
+      <w:r>
+        <w:rPr>
+          <w:rFonts w:ascii="Garamond" w:hAnsi="Garamond"/>
+          <w:b/>
+          <w:bCs/>
+        </w:rPr>
+        <w:t>socket.user</w:t>
+      </w:r>
+      <w:proofErr w:type="spellEnd"/>
+      <w:r>
+        <w:rPr>
+          <w:rFonts w:ascii="Garamond" w:hAnsi="Garamond"/>
+        </w:rPr>
+        <w:t xml:space="preserve"> and </w:t>
+      </w:r>
+      <w:proofErr w:type="spellStart"/>
+      <w:r>
+        <w:rPr>
+          <w:rFonts w:ascii="Garamond" w:hAnsi="Garamond"/>
+          <w:b/>
+          <w:bCs/>
+        </w:rPr>
+        <w:t>socket.data.dmPeers</w:t>
+      </w:r>
+      <w:proofErr w:type="spellEnd"/>
+      <w:r>
+        <w:rPr>
+          <w:rFonts w:ascii="Garamond" w:hAnsi="Garamond"/>
+        </w:rPr>
+        <w:t xml:space="preserve"> objects.</w:t>
+      </w:r>
+    </w:p>
+    <w:p>
+      <w:pPr>
+        <w:spacing w:line="360" w:lineRule="auto"/>
+        <w:rPr>
+          <w:rFonts w:ascii="Garamond" w:hAnsi="Garamond"/>
+        </w:rPr>
+      </w:pPr>
+      <w:r>
+        <w:rPr>
+          <w:rFonts w:ascii="Garamond" w:hAnsi="Garamond"/>
+        </w:rPr>
+        <w:t xml:space="preserve">When the backend receives the component’s </w:t>
+      </w:r>
+      <w:proofErr w:type="spellStart"/>
+      <w:r>
+        <w:rPr>
+          <w:rFonts w:ascii="Garamond" w:hAnsi="Garamond"/>
+          <w:b/>
+          <w:bCs/>
+        </w:rPr>
+        <w:t>chat_message</w:t>
+      </w:r>
+      <w:proofErr w:type="spellEnd"/>
+      <w:r>
+        <w:rPr>
+          <w:rFonts w:ascii="Garamond" w:hAnsi="Garamond"/>
+        </w:rPr>
+        <w:t xml:space="preserve"> event, its </w:t>
+      </w:r>
+      <w:proofErr w:type="spellStart"/>
+      <w:r>
+        <w:rPr>
+          <w:rFonts w:ascii="Garamond" w:hAnsi="Garamond"/>
+          <w:b/>
+          <w:bCs/>
+        </w:rPr>
+        <w:t>chat_message</w:t>
+      </w:r>
+      <w:proofErr w:type="spellEnd"/>
+      <w:r>
+        <w:rPr>
+          <w:rFonts w:ascii="Garamond" w:hAnsi="Garamond"/>
+        </w:rPr>
+        <w:t xml:space="preserve"> event handler validates that the socket is a member of that room. It then derives the user and recipient ids as described above,</w:t>
+      </w:r>
+      <w:r>
+        <w:rPr>
+          <w:rFonts w:ascii="Garamond" w:hAnsi="Garamond"/>
+        </w:rPr>
+        <w:t xml:space="preserve"> and</w:t>
+      </w:r>
+      <w:r>
+        <w:rPr>
+          <w:rFonts w:ascii="Garamond" w:hAnsi="Garamond"/>
+        </w:rPr>
+        <w:t xml:space="preserve"> </w:t>
+      </w:r>
+      <w:r>
+        <w:rPr>
+          <w:rFonts w:ascii="Garamond" w:hAnsi="Garamond"/>
+        </w:rPr>
+        <w:t>uses the room name sent back from the client</w:t>
+      </w:r>
+      <w:r>
+        <w:rPr>
+          <w:rFonts w:ascii="Garamond" w:hAnsi="Garamond"/>
+        </w:rPr>
+        <w:t xml:space="preserve">. The handler then uses an UPSERT query so the room name is only stored if it doesn’t already exist and </w:t>
+      </w:r>
+      <w:r>
+        <w:rPr>
+          <w:rFonts w:ascii="Garamond" w:hAnsi="Garamond"/>
+        </w:rPr>
+        <w:t xml:space="preserve">then </w:t>
+      </w:r>
+      <w:r>
+        <w:rPr>
+          <w:rFonts w:ascii="Garamond" w:hAnsi="Garamond"/>
+        </w:rPr>
+        <w:t xml:space="preserve">the </w:t>
+      </w:r>
+      <w:proofErr w:type="spellStart"/>
+      <w:r>
+        <w:rPr>
+          <w:rFonts w:ascii="Garamond" w:hAnsi="Garamond"/>
+        </w:rPr>
+        <w:t>room_id</w:t>
+      </w:r>
+      <w:proofErr w:type="spellEnd"/>
+      <w:r>
+        <w:rPr>
+          <w:rFonts w:ascii="Garamond" w:hAnsi="Garamond"/>
+        </w:rPr>
+        <w:t xml:space="preserve"> is returned. This reduces calls to the database as the logic is handled in one query rather than check-then-insert queries.</w:t>
+      </w:r>
+    </w:p>
+    <w:p>
+      <w:pPr>
+        <w:spacing w:line="360" w:lineRule="auto"/>
+        <w:rPr>
+          <w:rFonts w:ascii="Garamond" w:hAnsi="Garamond"/>
+        </w:rPr>
+      </w:pPr>
+      <w:r>
+        <w:rPr>
+          <w:rFonts w:ascii="Garamond" w:hAnsi="Garamond"/>
+        </w:rPr>
+        <w:t xml:space="preserve">The returned </w:t>
+      </w:r>
+      <w:proofErr w:type="spellStart"/>
+      <w:r>
+        <w:rPr>
+          <w:rFonts w:ascii="Garamond" w:hAnsi="Garamond"/>
+          <w:b/>
+          <w:bCs/>
+        </w:rPr>
+        <w:t>room_id</w:t>
+      </w:r>
+      <w:proofErr w:type="spellEnd"/>
+      <w:r>
+        <w:rPr>
+          <w:rFonts w:ascii="Garamond" w:hAnsi="Garamond"/>
+        </w:rPr>
+        <w:t xml:space="preserve"> is then used to insert the message text </w:t>
+      </w:r>
+      <w:r>
+        <w:rPr>
+          <w:rFonts w:ascii="Garamond" w:hAnsi="Garamond"/>
+        </w:rPr>
+        <w:t>into</w:t>
+      </w:r>
+      <w:r>
+        <w:rPr>
+          <w:rFonts w:ascii="Garamond" w:hAnsi="Garamond"/>
+        </w:rPr>
+        <w:t xml:space="preserve"> the </w:t>
+      </w:r>
+      <w:proofErr w:type="spellStart"/>
+      <w:r>
+        <w:rPr>
+          <w:rFonts w:ascii="Garamond" w:hAnsi="Garamond"/>
+          <w:b/>
+          <w:bCs/>
+        </w:rPr>
+        <w:t>chat_messages</w:t>
+      </w:r>
+      <w:proofErr w:type="spellEnd"/>
+      <w:r>
+        <w:rPr>
+          <w:rFonts w:ascii="Garamond" w:hAnsi="Garamond"/>
+        </w:rPr>
+        <w:t xml:space="preserve"> table along with sender user id, recipient user id and room id. </w:t>
+      </w:r>
+      <w:r>
+        <w:rPr>
+          <w:rFonts w:ascii="Garamond" w:hAnsi="Garamond"/>
+        </w:rPr>
+        <w:t>At this insert, t</w:t>
+      </w:r>
+      <w:r>
+        <w:rPr>
+          <w:rFonts w:ascii="Garamond" w:hAnsi="Garamond"/>
+        </w:rPr>
+        <w:t xml:space="preserve">he database returns a </w:t>
+      </w:r>
+      <w:proofErr w:type="spellStart"/>
+      <w:r>
+        <w:rPr>
+          <w:rFonts w:ascii="Garamond" w:hAnsi="Garamond"/>
+          <w:b/>
+          <w:bCs/>
+        </w:rPr>
+        <w:t>message_</w:t>
+      </w:r>
+      <w:r>
+        <w:rPr>
+          <w:rFonts w:ascii="Garamond" w:hAnsi="Garamond"/>
+        </w:rPr>
+        <w:t>id</w:t>
+      </w:r>
+      <w:proofErr w:type="spellEnd"/>
+      <w:r>
+        <w:rPr>
+          <w:rFonts w:ascii="Garamond" w:hAnsi="Garamond"/>
+        </w:rPr>
+        <w:t xml:space="preserve">, a </w:t>
+      </w:r>
+      <w:proofErr w:type="spellStart"/>
+      <w:r>
+        <w:rPr>
+          <w:rFonts w:ascii="Garamond" w:hAnsi="Garamond"/>
+          <w:b/>
+          <w:bCs/>
+        </w:rPr>
+        <w:t>sent</w:t>
+      </w:r>
+      <w:r>
+        <w:rPr>
+          <w:rFonts w:ascii="Garamond" w:hAnsi="Garamond"/>
+          <w:b/>
+          <w:bCs/>
+        </w:rPr>
+        <w:t>_at</w:t>
+      </w:r>
+      <w:proofErr w:type="spellEnd"/>
+      <w:r>
+        <w:rPr>
+          <w:rFonts w:ascii="Garamond" w:hAnsi="Garamond"/>
+        </w:rPr>
+        <w:t xml:space="preserve"> timestamp </w:t>
+      </w:r>
+      <w:r>
+        <w:rPr>
+          <w:rFonts w:ascii="Garamond" w:hAnsi="Garamond"/>
+        </w:rPr>
+        <w:t xml:space="preserve">and the </w:t>
+      </w:r>
+      <w:proofErr w:type="spellStart"/>
+      <w:r>
+        <w:rPr>
+          <w:rFonts w:ascii="Garamond" w:hAnsi="Garamond"/>
+          <w:b/>
+          <w:bCs/>
+        </w:rPr>
+        <w:t>room_id</w:t>
+      </w:r>
+      <w:proofErr w:type="spellEnd"/>
+      <w:r>
+        <w:rPr>
+          <w:rFonts w:ascii="Garamond" w:hAnsi="Garamond"/>
+        </w:rPr>
+        <w:t xml:space="preserve"> </w:t>
+      </w:r>
+      <w:r>
+        <w:rPr>
+          <w:rFonts w:ascii="Garamond" w:hAnsi="Garamond"/>
+        </w:rPr>
+        <w:t xml:space="preserve">which are then used to backfill the </w:t>
+      </w:r>
+      <w:proofErr w:type="spellStart"/>
+      <w:r>
+        <w:rPr>
+          <w:rFonts w:ascii="Garamond" w:hAnsi="Garamond"/>
+          <w:b/>
+          <w:bCs/>
+        </w:rPr>
+        <w:t>chat</w:t>
+      </w:r>
+      <w:r>
+        <w:rPr>
+          <w:rFonts w:ascii="Garamond" w:hAnsi="Garamond"/>
+          <w:b/>
+          <w:bCs/>
+        </w:rPr>
+        <w:t>_rooms</w:t>
+      </w:r>
+      <w:proofErr w:type="spellEnd"/>
+      <w:r>
+        <w:rPr>
+          <w:rFonts w:ascii="Garamond" w:hAnsi="Garamond"/>
+        </w:rPr>
+        <w:t xml:space="preserve"> table</w:t>
+      </w:r>
+      <w:r>
+        <w:rPr>
+          <w:rFonts w:ascii="Garamond" w:hAnsi="Garamond"/>
+        </w:rPr>
+        <w:t xml:space="preserve">’s </w:t>
+      </w:r>
+      <w:r>
+        <w:rPr>
+          <w:rFonts w:ascii="Garamond" w:hAnsi="Garamond"/>
+        </w:rPr>
+        <w:t xml:space="preserve">relevant </w:t>
+      </w:r>
+      <w:proofErr w:type="spellStart"/>
+      <w:r>
+        <w:rPr>
+          <w:rFonts w:ascii="Garamond" w:hAnsi="Garamond"/>
+          <w:b/>
+          <w:bCs/>
+        </w:rPr>
+        <w:t>room_id</w:t>
+      </w:r>
+      <w:proofErr w:type="spellEnd"/>
+      <w:r>
+        <w:rPr>
+          <w:rFonts w:ascii="Garamond" w:hAnsi="Garamond"/>
+        </w:rPr>
+        <w:t xml:space="preserve"> row with the </w:t>
+      </w:r>
+      <w:proofErr w:type="spellStart"/>
+      <w:r>
+        <w:rPr>
+          <w:rFonts w:ascii="Garamond" w:hAnsi="Garamond"/>
+          <w:b/>
+          <w:bCs/>
+        </w:rPr>
+        <w:t>message_id</w:t>
+      </w:r>
+      <w:proofErr w:type="spellEnd"/>
+      <w:r>
+        <w:rPr>
+          <w:rFonts w:ascii="Garamond" w:hAnsi="Garamond"/>
+        </w:rPr>
+        <w:t xml:space="preserve"> and </w:t>
+      </w:r>
+      <w:proofErr w:type="spellStart"/>
+      <w:r>
+        <w:rPr>
+          <w:rFonts w:ascii="Garamond" w:hAnsi="Garamond"/>
+          <w:b/>
+          <w:bCs/>
+        </w:rPr>
+        <w:t>sent_at</w:t>
+      </w:r>
+      <w:proofErr w:type="spellEnd"/>
+      <w:r>
+        <w:rPr>
+          <w:rFonts w:ascii="Garamond" w:hAnsi="Garamond"/>
+        </w:rPr>
+        <w:t xml:space="preserve"> timestamp. This</w:t>
+      </w:r>
+      <w:r>
+        <w:rPr>
+          <w:rFonts w:ascii="Garamond" w:hAnsi="Garamond"/>
+        </w:rPr>
+        <w:t xml:space="preserve"> backfilling</w:t>
+      </w:r>
+      <w:r>
+        <w:rPr>
+          <w:rFonts w:ascii="Garamond" w:hAnsi="Garamond"/>
+        </w:rPr>
+        <w:t xml:space="preserve"> </w:t>
+      </w:r>
+      <w:r>
+        <w:rPr>
+          <w:rFonts w:ascii="Garamond" w:hAnsi="Garamond"/>
+        </w:rPr>
+        <w:t>enables</w:t>
+      </w:r>
+      <w:r>
+        <w:rPr>
+          <w:rFonts w:ascii="Garamond" w:hAnsi="Garamond"/>
+        </w:rPr>
+        <w:t xml:space="preserve"> the inbox-summary functionality described below.</w:t>
+      </w:r>
+      <w:r>
+        <w:rPr>
+          <w:rFonts w:ascii="Garamond" w:hAnsi="Garamond"/>
+        </w:rPr>
+        <w:t xml:space="preserve"> Once the message has been saved, the backend creates a message object and emits it to the frontend via </w:t>
+      </w:r>
+      <w:r>
+        <w:rPr>
+          <w:rFonts w:ascii="Garamond" w:hAnsi="Garamond"/>
+          <w:b/>
+          <w:bCs/>
+        </w:rPr>
+        <w:t>io.to(room).emit()</w:t>
+      </w:r>
+      <w:r>
+        <w:rPr>
+          <w:rFonts w:ascii="Garamond" w:hAnsi="Garamond"/>
+        </w:rPr>
+        <w:t xml:space="preserve"> so that both parties </w:t>
+      </w:r>
+      <w:r>
+        <w:rPr>
+          <w:rFonts w:ascii="Garamond" w:hAnsi="Garamond"/>
+        </w:rPr>
+        <w:t xml:space="preserve">in the room </w:t>
+      </w:r>
+      <w:r>
+        <w:rPr>
+          <w:rFonts w:ascii="Garamond" w:hAnsi="Garamond"/>
+        </w:rPr>
+        <w:t>receive the message.</w:t>
+      </w:r>
+      <w:r>
+        <w:rPr>
+          <w:rFonts w:ascii="Garamond" w:hAnsi="Garamond"/>
+        </w:rPr>
+        <w:t xml:space="preserve"> Finally, to support notification, a truncated message object is sent to the recipient’s personal room via </w:t>
+      </w:r>
+      <w:r>
+        <w:rPr>
+          <w:rFonts w:ascii="Garamond" w:hAnsi="Garamond"/>
+          <w:b/>
+          <w:bCs/>
+        </w:rPr>
+        <w:t>io.to(`user:${</w:t>
+      </w:r>
+      <w:proofErr w:type="spellStart"/>
+      <w:r>
+        <w:rPr>
+          <w:rFonts w:ascii="Garamond" w:hAnsi="Garamond"/>
+          <w:b/>
+          <w:bCs/>
+        </w:rPr>
+        <w:t>recipientUserId</w:t>
+      </w:r>
+      <w:proofErr w:type="spellEnd"/>
+      <w:r>
+        <w:rPr>
+          <w:rFonts w:ascii="Garamond" w:hAnsi="Garamond"/>
+          <w:b/>
+          <w:bCs/>
+        </w:rPr>
+        <w:t>}`).emit('</w:t>
+      </w:r>
+      <w:proofErr w:type="spellStart"/>
+      <w:r>
+        <w:rPr>
+          <w:rFonts w:ascii="Garamond" w:hAnsi="Garamond"/>
+          <w:b/>
+          <w:bCs/>
+        </w:rPr>
+        <w:t>incoming_chat</w:t>
+      </w:r>
+      <w:proofErr w:type="spellEnd"/>
+      <w:r>
+        <w:rPr>
+          <w:rFonts w:ascii="Garamond" w:hAnsi="Garamond"/>
+          <w:b/>
+          <w:bCs/>
+        </w:rPr>
+        <w:t>'</w:t>
+      </w:r>
+      <w:r>
+        <w:rPr>
+          <w:rFonts w:ascii="Garamond" w:hAnsi="Garamond"/>
+          <w:b/>
+          <w:bCs/>
+        </w:rPr>
+        <w:t>)</w:t>
+      </w:r>
+      <w:r>
+        <w:rPr>
+          <w:rFonts w:ascii="Garamond" w:hAnsi="Garamond"/>
+        </w:rPr>
+        <w:t>.</w:t>
+      </w:r>
+    </w:p>
+    <w:p>
+      <w:pPr>
+        <w:spacing w:line="360" w:lineRule="auto"/>
+        <w:rPr>
+          <w:rFonts w:ascii="Garamond" w:hAnsi="Garamond"/>
+        </w:rPr>
+      </w:pPr>
+      <w:r>
+        <w:rPr>
+          <w:rFonts w:ascii="Garamond" w:hAnsi="Garamond"/>
+        </w:rPr>
+        <w:t xml:space="preserve">On the frontend, </w:t>
+      </w:r>
+      <w:r>
+        <w:rPr>
+          <w:rFonts w:ascii="Garamond" w:hAnsi="Garamond"/>
+          <w:b/>
+          <w:bCs/>
+        </w:rPr>
+        <w:t xml:space="preserve">ChatWindow </w:t>
+      </w:r>
+      <w:r>
+        <w:rPr>
+          <w:rFonts w:ascii="Garamond" w:hAnsi="Garamond"/>
+        </w:rPr>
+        <w:t xml:space="preserve">component listens for server-emitted </w:t>
+      </w:r>
+      <w:proofErr w:type="spellStart"/>
+      <w:r>
+        <w:rPr>
+          <w:rFonts w:ascii="Garamond" w:hAnsi="Garamond"/>
+          <w:b/>
+          <w:bCs/>
+        </w:rPr>
+        <w:t>chat_message</w:t>
+      </w:r>
+      <w:proofErr w:type="spellEnd"/>
+      <w:r>
+        <w:rPr>
+          <w:rFonts w:ascii="Garamond" w:hAnsi="Garamond"/>
+        </w:rPr>
+        <w:t xml:space="preserve"> event and adds </w:t>
+      </w:r>
+      <w:r>
+        <w:rPr>
+          <w:rFonts w:ascii="Garamond" w:hAnsi="Garamond"/>
+        </w:rPr>
+        <w:t>the payload message</w:t>
+      </w:r>
+      <w:r>
+        <w:rPr>
+          <w:rFonts w:ascii="Garamond" w:hAnsi="Garamond"/>
+        </w:rPr>
+        <w:t xml:space="preserve"> to its </w:t>
+      </w:r>
+      <w:r>
+        <w:rPr>
+          <w:rFonts w:ascii="Garamond" w:hAnsi="Garamond"/>
+          <w:b/>
+          <w:bCs/>
+        </w:rPr>
+        <w:t>messages</w:t>
+      </w:r>
+      <w:r>
+        <w:rPr>
+          <w:rFonts w:ascii="Garamond" w:hAnsi="Garamond"/>
+        </w:rPr>
+        <w:t xml:space="preserve"> state array</w:t>
+      </w:r>
+      <w:r>
+        <w:rPr>
+          <w:rFonts w:ascii="Garamond" w:hAnsi="Garamond"/>
+        </w:rPr>
+        <w:t xml:space="preserve">. Because the component has the socket event listener for real-time messages and a separate fetch of chat history from the database running in parallel, there is a chance that a live message could arrive during the fetch and then be </w:t>
+      </w:r>
+      <w:r>
+        <w:rPr>
+          <w:rFonts w:ascii="Garamond" w:hAnsi="Garamond"/>
+        </w:rPr>
+        <w:t xml:space="preserve">either </w:t>
+      </w:r>
+      <w:r>
+        <w:rPr>
+          <w:rFonts w:ascii="Garamond" w:hAnsi="Garamond"/>
+        </w:rPr>
+        <w:t>lost</w:t>
+      </w:r>
+      <w:r>
+        <w:rPr>
+          <w:rFonts w:ascii="Garamond" w:hAnsi="Garamond"/>
+        </w:rPr>
+        <w:t xml:space="preserve"> from</w:t>
+      </w:r>
+      <w:r>
+        <w:rPr>
+          <w:rFonts w:ascii="Garamond" w:hAnsi="Garamond"/>
+        </w:rPr>
+        <w:t xml:space="preserve"> or duplicated</w:t>
+      </w:r>
+      <w:r>
+        <w:rPr>
+          <w:rFonts w:ascii="Garamond" w:hAnsi="Garamond"/>
+        </w:rPr>
+        <w:t xml:space="preserve"> in the UI</w:t>
+      </w:r>
+      <w:r>
+        <w:rPr>
+          <w:rFonts w:ascii="Garamond" w:hAnsi="Garamond"/>
+        </w:rPr>
+        <w:t xml:space="preserve"> when the fetch response lands</w:t>
+      </w:r>
+      <w:r>
+        <w:rPr>
+          <w:rFonts w:ascii="Garamond" w:hAnsi="Garamond"/>
+        </w:rPr>
+        <w:t xml:space="preserve"> and is rendered by updating the </w:t>
+      </w:r>
+      <w:r>
+        <w:rPr>
+          <w:rFonts w:ascii="Garamond" w:hAnsi="Garamond"/>
+          <w:b/>
+          <w:bCs/>
+        </w:rPr>
+        <w:t xml:space="preserve">messages </w:t>
+      </w:r>
+      <w:r>
+        <w:rPr>
+          <w:rFonts w:ascii="Garamond" w:hAnsi="Garamond"/>
+        </w:rPr>
+        <w:t>state</w:t>
+      </w:r>
+      <w:r>
+        <w:rPr>
+          <w:rFonts w:ascii="Garamond" w:hAnsi="Garamond"/>
+        </w:rPr>
+        <w:t xml:space="preserve">. It would be lost if the </w:t>
       </w:r>
       <w:r>
         <w:rPr>
           <w:rFonts w:ascii="Garamond" w:hAnsi="Garamond"/>
         </w:rPr>
         <w:lastRenderedPageBreak/>
-        <w:t xml:space="preserve">generates a permanent, unique room name by ordering the </w:t>
-      </w:r>
-      <w:r>
-        <w:rPr>
-          <w:rFonts w:ascii="Garamond" w:hAnsi="Garamond"/>
-        </w:rPr>
-        <w:t>logged-in user</w:t>
-      </w:r>
-      <w:r>
-        <w:rPr>
-          <w:rFonts w:ascii="Garamond" w:hAnsi="Garamond"/>
-        </w:rPr>
-        <w:t xml:space="preserve"> and </w:t>
-      </w:r>
-      <w:r>
-        <w:rPr>
-          <w:rFonts w:ascii="Garamond" w:hAnsi="Garamond"/>
-        </w:rPr>
-        <w:t>recipient user</w:t>
-      </w:r>
-      <w:r>
-        <w:rPr>
-          <w:rFonts w:ascii="Garamond" w:hAnsi="Garamond"/>
-        </w:rPr>
-        <w:t xml:space="preserve"> ids from lowest to highest</w:t>
-      </w:r>
-      <w:r>
-        <w:rPr>
-          <w:rFonts w:ascii="Garamond" w:hAnsi="Garamond"/>
-        </w:rPr>
-        <w:t xml:space="preserve">. This is so both particpants in a chat resolve to the same room name. </w:t>
-      </w:r>
-      <w:r>
-        <w:rPr>
-          <w:rFonts w:ascii="Garamond" w:hAnsi="Garamond"/>
-        </w:rPr>
-        <w:t>The logged-in user’s socket then joins that room and the room number</w:t>
-      </w:r>
-      <w:r>
-        <w:rPr>
-          <w:rFonts w:ascii="Garamond" w:hAnsi="Garamond"/>
-        </w:rPr>
-        <w:t xml:space="preserve"> and recipient/other user id</w:t>
-      </w:r>
-      <w:r>
-        <w:rPr>
-          <w:rFonts w:ascii="Garamond" w:hAnsi="Garamond"/>
+        <w:t>fetch complete</w:t>
+      </w:r>
+      <w:r>
+        <w:rPr>
+          <w:rFonts w:ascii="Garamond" w:hAnsi="Garamond"/>
+        </w:rPr>
+        <w:t xml:space="preserve">d before the message was written to database prior to </w:t>
+      </w:r>
+      <w:r>
+        <w:rPr>
+          <w:rFonts w:ascii="Garamond" w:hAnsi="Garamond"/>
+        </w:rPr>
+        <w:t xml:space="preserve">its </w:t>
+      </w:r>
+      <w:r>
+        <w:rPr>
+          <w:rFonts w:ascii="Garamond" w:hAnsi="Garamond"/>
+        </w:rPr>
+        <w:t>emi</w:t>
+      </w:r>
+      <w:r>
+        <w:rPr>
+          <w:rFonts w:ascii="Garamond" w:hAnsi="Garamond"/>
+        </w:rPr>
+        <w:t>t event</w:t>
+      </w:r>
+      <w:r>
+        <w:rPr>
+          <w:rFonts w:ascii="Garamond" w:hAnsi="Garamond"/>
+        </w:rPr>
+        <w:t>, and duplicated if it was written to database, rendered in UI, and then read again in the fetch.</w:t>
+      </w:r>
+      <w:r>
+        <w:rPr>
+          <w:rFonts w:ascii="Garamond" w:hAnsi="Garamond"/>
+        </w:rPr>
+        <w:t xml:space="preserve"> Consequently, the </w:t>
+      </w:r>
+      <w:proofErr w:type="spellStart"/>
+      <w:r>
+        <w:rPr>
+          <w:rFonts w:ascii="Garamond" w:hAnsi="Garamond"/>
+          <w:b/>
+          <w:bCs/>
+        </w:rPr>
+        <w:t>useEffect</w:t>
+      </w:r>
+      <w:proofErr w:type="spellEnd"/>
+      <w:r>
+        <w:rPr>
+          <w:rFonts w:ascii="Garamond" w:hAnsi="Garamond"/>
+        </w:rPr>
+        <w:t xml:space="preserve"> code merges the pre- and post-fetch </w:t>
+      </w:r>
+      <w:r>
+        <w:rPr>
+          <w:rFonts w:ascii="Garamond" w:hAnsi="Garamond"/>
+          <w:b/>
+          <w:bCs/>
+        </w:rPr>
+        <w:t>messages</w:t>
+      </w:r>
+      <w:r>
+        <w:rPr>
+          <w:rFonts w:ascii="Garamond" w:hAnsi="Garamond"/>
+        </w:rPr>
+        <w:t xml:space="preserve"> state </w:t>
+      </w:r>
+      <w:r>
+        <w:rPr>
+          <w:rFonts w:ascii="Garamond" w:hAnsi="Garamond"/>
+        </w:rPr>
+        <w:t xml:space="preserve">(to preserve a message that was in UI during fetch but not yet written to database when the fetch queries it) </w:t>
+      </w:r>
+      <w:r>
+        <w:rPr>
+          <w:rFonts w:ascii="Garamond" w:hAnsi="Garamond"/>
+        </w:rPr>
+        <w:t>and</w:t>
+      </w:r>
+      <w:r>
+        <w:rPr>
+          <w:rFonts w:ascii="Garamond" w:hAnsi="Garamond"/>
+        </w:rPr>
+        <w:t xml:space="preserve"> removes potential </w:t>
+      </w:r>
+      <w:r>
+        <w:rPr>
+          <w:rFonts w:ascii="Garamond" w:hAnsi="Garamond"/>
+        </w:rPr>
+        <w:t>d</w:t>
+      </w:r>
+      <w:r>
+        <w:rPr>
+          <w:rFonts w:ascii="Garamond" w:hAnsi="Garamond"/>
+        </w:rPr>
+        <w:t xml:space="preserve">uplicates </w:t>
+      </w:r>
+      <w:r>
+        <w:rPr>
+          <w:rFonts w:ascii="Garamond" w:hAnsi="Garamond"/>
+        </w:rPr>
+        <w:t>(for</w:t>
+      </w:r>
+      <w:r>
+        <w:rPr>
+          <w:rFonts w:ascii="Garamond" w:hAnsi="Garamond"/>
+        </w:rPr>
+        <w:t xml:space="preserve"> the case where the message was in UI during fetch but was also in the database when queried).</w:t>
+      </w:r>
+      <w:r>
+        <w:rPr>
+          <w:rFonts w:ascii="Garamond" w:hAnsi="Garamond"/>
+        </w:rPr>
+        <w:t xml:space="preserve"> This ensures that both participants see a coherent message timeline.</w:t>
+      </w:r>
+    </w:p>
+    <w:p>
+      <w:pPr>
+        <w:spacing w:line="360" w:lineRule="auto"/>
+        <w:rPr>
+          <w:rFonts w:ascii="Garamond" w:hAnsi="Garamond"/>
+        </w:rPr>
+      </w:pPr>
+      <w:r>
+        <w:rPr>
+          <w:rFonts w:ascii="Garamond" w:hAnsi="Garamond"/>
+        </w:rPr>
+        <w:t xml:space="preserve">For real-time notification outside of a chat window, the server also emits an </w:t>
+      </w:r>
+      <w:proofErr w:type="spellStart"/>
+      <w:r>
+        <w:rPr>
+          <w:rFonts w:ascii="Garamond" w:hAnsi="Garamond"/>
+          <w:b/>
+          <w:bCs/>
+        </w:rPr>
+        <w:t>incoming_chat</w:t>
+      </w:r>
+      <w:proofErr w:type="spellEnd"/>
+      <w:r>
+        <w:rPr>
+          <w:rFonts w:ascii="Garamond" w:hAnsi="Garamond"/>
+        </w:rPr>
+        <w:t xml:space="preserve"> event to the recipient’s personal room that was created post-login in the </w:t>
+      </w:r>
+      <w:proofErr w:type="spellStart"/>
+      <w:r>
+        <w:rPr>
+          <w:rFonts w:ascii="Garamond" w:hAnsi="Garamond"/>
+          <w:b/>
+          <w:bCs/>
+        </w:rPr>
+        <w:t>io.on</w:t>
+      </w:r>
+      <w:proofErr w:type="spellEnd"/>
+      <w:r>
+        <w:rPr>
+          <w:rFonts w:ascii="Garamond" w:hAnsi="Garamond"/>
+          <w:b/>
+          <w:bCs/>
+        </w:rPr>
+        <w:t>(‘connection’)</w:t>
+      </w:r>
+      <w:r>
+        <w:rPr>
+          <w:rFonts w:ascii="Garamond" w:hAnsi="Garamond"/>
+        </w:rPr>
+        <w:t xml:space="preserve"> listener. The event emits the sender’s user id, name,</w:t>
+      </w:r>
+      <w:r>
+        <w:rPr>
+          <w:rFonts w:ascii="Garamond" w:hAnsi="Garamond"/>
+        </w:rPr>
+        <w:t xml:space="preserve"> and</w:t>
+      </w:r>
+      <w:r>
+        <w:rPr>
+          <w:rFonts w:ascii="Garamond" w:hAnsi="Garamond"/>
+        </w:rPr>
+        <w:t xml:space="preserve"> a message preview</w:t>
+      </w:r>
+      <w:r>
+        <w:rPr>
+          <w:rFonts w:ascii="Garamond" w:hAnsi="Garamond"/>
+        </w:rPr>
+        <w:t xml:space="preserve">. On the frontend, the </w:t>
+      </w:r>
+      <w:proofErr w:type="spellStart"/>
+      <w:r>
+        <w:rPr>
+          <w:rFonts w:ascii="Garamond" w:hAnsi="Garamond"/>
+          <w:b/>
+          <w:bCs/>
+        </w:rPr>
+        <w:t>ChatNotifier</w:t>
+      </w:r>
+      <w:proofErr w:type="spellEnd"/>
+      <w:r>
+        <w:rPr>
+          <w:rFonts w:ascii="Garamond" w:hAnsi="Garamond"/>
+        </w:rPr>
+        <w:t xml:space="preserve"> component listens for the </w:t>
+      </w:r>
+      <w:proofErr w:type="spellStart"/>
+      <w:r>
+        <w:rPr>
+          <w:rFonts w:ascii="Garamond" w:hAnsi="Garamond"/>
+          <w:b/>
+          <w:bCs/>
+        </w:rPr>
+        <w:t>incoming_chat</w:t>
+      </w:r>
+      <w:proofErr w:type="spellEnd"/>
+      <w:r>
+        <w:rPr>
+          <w:rFonts w:ascii="Garamond" w:hAnsi="Garamond"/>
+        </w:rPr>
+        <w:t xml:space="preserve"> event. When received, it validates the payload and </w:t>
+      </w:r>
+      <w:r>
+        <w:rPr>
+          <w:rFonts w:ascii="Garamond" w:hAnsi="Garamond"/>
+        </w:rPr>
+        <w:t xml:space="preserve">checks if the recipient is currently in an active </w:t>
+      </w:r>
+      <w:r>
+        <w:rPr>
+          <w:rFonts w:ascii="Garamond" w:hAnsi="Garamond"/>
+          <w:b/>
+          <w:bCs/>
+        </w:rPr>
+        <w:t>ChatWindow</w:t>
+      </w:r>
+      <w:r>
+        <w:rPr>
+          <w:rFonts w:ascii="Garamond" w:hAnsi="Garamond"/>
+        </w:rPr>
+        <w:t xml:space="preserve"> with the sender. If so, no notification is shown; if not, a popup appears on screen displaying sender’s name, message preview, and gives the option to open a </w:t>
+      </w:r>
+      <w:r>
+        <w:rPr>
+          <w:rFonts w:ascii="Garamond" w:hAnsi="Garamond"/>
+          <w:b/>
+          <w:bCs/>
+        </w:rPr>
+        <w:t>ChatWindow</w:t>
+      </w:r>
+      <w:r>
+        <w:rPr>
+          <w:rFonts w:ascii="Garamond" w:hAnsi="Garamond"/>
+        </w:rPr>
+        <w:t xml:space="preserve"> or dismiss.</w:t>
+      </w:r>
+      <w:r>
+        <w:rPr>
+          <w:rFonts w:ascii="Garamond" w:hAnsi="Garamond"/>
+        </w:rPr>
+        <w:t xml:space="preserve"> Clicking ‘open’ </w:t>
+      </w:r>
+      <w:r>
+        <w:rPr>
+          <w:rFonts w:ascii="Garamond" w:hAnsi="Garamond"/>
+        </w:rPr>
+        <w:t xml:space="preserve">updates the </w:t>
+      </w:r>
+      <w:proofErr w:type="spellStart"/>
+      <w:r>
+        <w:rPr>
+          <w:rFonts w:ascii="Garamond" w:hAnsi="Garamond"/>
+          <w:b/>
+          <w:bCs/>
+        </w:rPr>
+        <w:t>activeChat</w:t>
+      </w:r>
+      <w:proofErr w:type="spellEnd"/>
+      <w:r>
+        <w:rPr>
+          <w:rFonts w:ascii="Garamond" w:hAnsi="Garamond"/>
+        </w:rPr>
+        <w:t xml:space="preserve"> state in the </w:t>
+      </w:r>
+      <w:proofErr w:type="spellStart"/>
+      <w:r>
+        <w:rPr>
+          <w:rFonts w:ascii="Garamond" w:hAnsi="Garamond"/>
+          <w:b/>
+          <w:bCs/>
+        </w:rPr>
+        <w:t>ChatContext</w:t>
+      </w:r>
+      <w:proofErr w:type="spellEnd"/>
+      <w:r>
+        <w:rPr>
+          <w:rFonts w:ascii="Garamond" w:hAnsi="Garamond"/>
+          <w:b/>
+          <w:bCs/>
         </w:rPr>
         <w:t xml:space="preserve"> </w:t>
       </w:r>
@@ -10597,652 +12521,64 @@
         <w:rPr>
           <w:rFonts w:ascii="Garamond" w:hAnsi="Garamond"/>
         </w:rPr>
-        <w:t>are</w:t>
-      </w:r>
-      <w:r>
-        <w:rPr>
-          <w:rFonts w:ascii="Garamond" w:hAnsi="Garamond"/>
-        </w:rPr>
-        <w:t xml:space="preserve"> stored in </w:t>
-      </w:r>
-      <w:r>
-        <w:rPr>
-          <w:rFonts w:ascii="Garamond" w:hAnsi="Garamond"/>
-          <w:b/>
-          <w:bCs/>
-        </w:rPr>
-        <w:t>socket.data.dmPeers</w:t>
-      </w:r>
-      <w:r>
-        <w:rPr>
-          <w:rFonts w:ascii="Garamond" w:hAnsi="Garamond"/>
-          <w:b/>
-          <w:bCs/>
+        <w:t xml:space="preserve"> and displays the window onscreen. The </w:t>
+      </w:r>
+      <w:r>
+        <w:rPr>
+          <w:rFonts w:ascii="Garamond" w:hAnsi="Garamond"/>
+          <w:b/>
+          <w:bCs/>
+        </w:rPr>
+        <w:t>ChatWindow</w:t>
+      </w:r>
+      <w:r>
+        <w:rPr>
+          <w:rFonts w:ascii="Garamond" w:hAnsi="Garamond"/>
+        </w:rPr>
+        <w:t xml:space="preserve"> fetches conversation history as described above.</w:t>
+      </w:r>
+    </w:p>
+    <w:p>
+      <w:pPr>
+        <w:spacing w:line="360" w:lineRule="auto"/>
+        <w:rPr>
+          <w:rFonts w:ascii="Garamond" w:hAnsi="Garamond"/>
+        </w:rPr>
+      </w:pPr>
+      <w:r>
+        <w:rPr>
+          <w:rFonts w:ascii="Garamond" w:hAnsi="Garamond"/>
+        </w:rPr>
+        <w:t xml:space="preserve">The use of socket.io and HTTP, combined with state-based conditional rendering and use of </w:t>
+      </w:r>
+      <w:r>
+        <w:rPr>
+          <w:rFonts w:ascii="Garamond" w:hAnsi="Garamond"/>
+          <w:b/>
+          <w:bCs/>
+        </w:rPr>
+        <w:t>React</w:t>
+      </w:r>
+      <w:r>
+        <w:rPr>
+          <w:rFonts w:ascii="Garamond" w:hAnsi="Garamond"/>
         </w:rPr>
         <w:t xml:space="preserve"> </w:t>
       </w:r>
       <w:r>
         <w:rPr>
           <w:rFonts w:ascii="Garamond" w:hAnsi="Garamond"/>
-        </w:rPr>
-        <w:t>as key-value pairs</w:t>
-      </w:r>
-      <w:r>
-        <w:rPr>
-          <w:rFonts w:ascii="Garamond" w:hAnsi="Garamond"/>
-        </w:rPr>
-        <w:t xml:space="preserve">. Finally, the server emits the room name back to the frontend where it is stored in the </w:t>
-      </w:r>
-      <w:r>
-        <w:rPr>
-          <w:rFonts w:ascii="Garamond" w:hAnsi="Garamond"/>
-          <w:b/>
-          <w:bCs/>
-        </w:rPr>
-        <w:t>ChatWindow</w:t>
-      </w:r>
-      <w:r>
-        <w:rPr>
-          <w:rFonts w:ascii="Garamond" w:hAnsi="Garamond"/>
-        </w:rPr>
-        <w:t xml:space="preserve"> component state and used to direct </w:t>
-      </w:r>
-      <w:r>
-        <w:rPr>
-          <w:rFonts w:ascii="Garamond" w:hAnsi="Garamond"/>
-        </w:rPr>
-        <w:t>the component’s subsequent chat</w:t>
-      </w:r>
-      <w:r>
-        <w:rPr>
-          <w:rFonts w:ascii="Garamond" w:hAnsi="Garamond"/>
-        </w:rPr>
-        <w:t xml:space="preserve"> messages to the correct room via </w:t>
-      </w:r>
-      <w:r>
-        <w:rPr>
-          <w:rFonts w:ascii="Garamond" w:hAnsi="Garamond"/>
-        </w:rPr>
-        <w:t>its</w:t>
-      </w:r>
-      <w:r>
-        <w:rPr>
-          <w:rFonts w:ascii="Garamond" w:hAnsi="Garamond"/>
-        </w:rPr>
-        <w:t xml:space="preserve"> emitted  </w:t>
-      </w:r>
-      <w:r>
-        <w:rPr>
-          <w:rFonts w:ascii="Garamond" w:hAnsi="Garamond"/>
-          <w:b/>
-          <w:bCs/>
-        </w:rPr>
-        <w:t>chat_message</w:t>
-      </w:r>
-      <w:r>
-        <w:rPr>
-          <w:rFonts w:ascii="Garamond" w:hAnsi="Garamond"/>
-        </w:rPr>
-        <w:t xml:space="preserve"> event.</w:t>
-      </w:r>
-    </w:p>
-    <w:p>
-      <w:pPr>
-        <w:spacing w:line="360" w:lineRule="auto"/>
-        <w:rPr>
-          <w:rFonts w:ascii="Garamond" w:hAnsi="Garamond"/>
-        </w:rPr>
-      </w:pPr>
-      <w:r>
-        <w:rPr>
-          <w:rFonts w:ascii="Garamond" w:hAnsi="Garamond"/>
-        </w:rPr>
-        <w:t xml:space="preserve">In parallel with joining a live room, </w:t>
-      </w:r>
-      <w:r>
-        <w:rPr>
-          <w:rFonts w:ascii="Garamond" w:hAnsi="Garamond"/>
-          <w:b/>
-          <w:bCs/>
-        </w:rPr>
-        <w:t>ChatWindow</w:t>
-      </w:r>
-      <w:r>
-        <w:rPr>
-          <w:rFonts w:ascii="Garamond" w:hAnsi="Garamond"/>
-        </w:rPr>
-        <w:t xml:space="preserve"> component fetches any historical messages for the same chat pair by sending an http request</w:t>
-      </w:r>
-      <w:r>
-        <w:rPr>
-          <w:rFonts w:ascii="Garamond" w:hAnsi="Garamond"/>
-        </w:rPr>
-        <w:t xml:space="preserve">. This request is handled by the protected </w:t>
-      </w:r>
-      <w:r>
-        <w:rPr>
-          <w:rFonts w:ascii="Garamond" w:hAnsi="Garamond"/>
-          <w:b/>
-          <w:bCs/>
-        </w:rPr>
-        <w:t>getMessagesFromDB</w:t>
-      </w:r>
-      <w:r>
-        <w:rPr>
-          <w:rFonts w:ascii="Garamond" w:hAnsi="Garamond"/>
-          <w:b/>
-          <w:bCs/>
-        </w:rPr>
-        <w:t xml:space="preserve"> </w:t>
-      </w:r>
-      <w:r>
-        <w:rPr>
-          <w:rFonts w:ascii="Garamond" w:hAnsi="Garamond"/>
-        </w:rPr>
-        <w:t xml:space="preserve">controller  which uses </w:t>
-      </w:r>
-      <w:r>
-        <w:rPr>
-          <w:rFonts w:ascii="Garamond" w:hAnsi="Garamond"/>
-          <w:b/>
-          <w:bCs/>
-        </w:rPr>
-        <w:t>req.user</w:t>
-      </w:r>
-      <w:r>
-        <w:rPr>
-          <w:rFonts w:ascii="Garamond" w:hAnsi="Garamond"/>
-        </w:rPr>
-        <w:t xml:space="preserve"> and </w:t>
-      </w:r>
-      <w:r>
-        <w:rPr>
-          <w:rFonts w:ascii="Garamond" w:hAnsi="Garamond"/>
-          <w:b/>
-          <w:bCs/>
-        </w:rPr>
-        <w:t>req.params.otherUserId</w:t>
-      </w:r>
-      <w:r>
-        <w:rPr>
-          <w:rFonts w:ascii="Garamond" w:hAnsi="Garamond"/>
-        </w:rPr>
-        <w:t xml:space="preserve"> to identify the participants, arranges the ids in ascending order, and checks if a room of that name is stored in the database, If a matching room is found, its messages are loaded from the database and rendered in the frontend </w:t>
-      </w:r>
-      <w:r>
-        <w:rPr>
-          <w:rFonts w:ascii="Garamond" w:hAnsi="Garamond"/>
-          <w:b/>
-          <w:bCs/>
-        </w:rPr>
-        <w:t>ChatWindow</w:t>
-      </w:r>
-      <w:r>
-        <w:rPr>
-          <w:rFonts w:ascii="Garamond" w:hAnsi="Garamond"/>
-        </w:rPr>
-        <w:t xml:space="preserve"> via state. If no room is found, an empty array is returned. </w:t>
-      </w:r>
-    </w:p>
-    <w:p>
-      <w:pPr>
-        <w:spacing w:line="360" w:lineRule="auto"/>
-        <w:rPr>
-          <w:rFonts w:ascii="Garamond" w:hAnsi="Garamond"/>
-        </w:rPr>
-      </w:pPr>
-      <w:r>
-        <w:rPr>
-          <w:rFonts w:ascii="Garamond" w:hAnsi="Garamond"/>
-        </w:rPr>
-        <w:t xml:space="preserve">For message persistence, when a user sends a message from </w:t>
-      </w:r>
-      <w:r>
-        <w:rPr>
-          <w:rFonts w:ascii="Garamond" w:hAnsi="Garamond"/>
-          <w:b/>
-          <w:bCs/>
-        </w:rPr>
-        <w:t xml:space="preserve">ChatWindow, </w:t>
-      </w:r>
-      <w:r>
-        <w:rPr>
-          <w:rFonts w:ascii="Garamond" w:hAnsi="Garamond"/>
-        </w:rPr>
-        <w:t>the component’s</w:t>
-      </w:r>
-      <w:r>
-        <w:rPr>
-          <w:rFonts w:ascii="Garamond" w:hAnsi="Garamond"/>
-          <w:b/>
-          <w:bCs/>
-        </w:rPr>
-        <w:t xml:space="preserve"> </w:t>
-      </w:r>
-      <w:r>
-        <w:rPr>
-          <w:rFonts w:ascii="Garamond" w:hAnsi="Garamond"/>
-          <w:b/>
-          <w:bCs/>
-        </w:rPr>
-        <w:t>handleSend</w:t>
-      </w:r>
-      <w:r>
-        <w:rPr>
-          <w:rFonts w:ascii="Garamond" w:hAnsi="Garamond"/>
-          <w:b/>
-          <w:bCs/>
-        </w:rPr>
-        <w:t xml:space="preserve"> </w:t>
-      </w:r>
-      <w:r>
-        <w:rPr>
-          <w:rFonts w:ascii="Garamond" w:hAnsi="Garamond"/>
-        </w:rPr>
-        <w:t xml:space="preserve">function validates that the message is not empty and that a </w:t>
-      </w:r>
-      <w:r>
-        <w:rPr>
-          <w:rFonts w:ascii="Garamond" w:hAnsi="Garamond"/>
-          <w:b/>
-          <w:bCs/>
-        </w:rPr>
-        <w:t>room</w:t>
-      </w:r>
-      <w:r>
-        <w:rPr>
-          <w:rFonts w:ascii="Garamond" w:hAnsi="Garamond"/>
-        </w:rPr>
-        <w:t xml:space="preserve"> name has been received from the backend. It then emits the </w:t>
-      </w:r>
-      <w:r>
-        <w:rPr>
-          <w:rFonts w:ascii="Garamond" w:hAnsi="Garamond"/>
-          <w:b/>
-          <w:bCs/>
-        </w:rPr>
-        <w:t>chat_message</w:t>
-      </w:r>
-      <w:r>
-        <w:rPr>
-          <w:rFonts w:ascii="Garamond" w:hAnsi="Garamond"/>
-        </w:rPr>
-        <w:t xml:space="preserve"> event containing the room name and trimmed message text. For security, the component does not send user or recipient user ids; instead, the backend derives the ids from the </w:t>
-      </w:r>
-      <w:r>
-        <w:rPr>
-          <w:rFonts w:ascii="Garamond" w:hAnsi="Garamond"/>
-          <w:b/>
-          <w:bCs/>
-        </w:rPr>
-        <w:t>socket.user</w:t>
-      </w:r>
-      <w:r>
-        <w:rPr>
-          <w:rFonts w:ascii="Garamond" w:hAnsi="Garamond"/>
-        </w:rPr>
-        <w:t xml:space="preserve"> and </w:t>
-      </w:r>
-      <w:r>
-        <w:rPr>
-          <w:rFonts w:ascii="Garamond" w:hAnsi="Garamond"/>
-          <w:b/>
-          <w:bCs/>
-        </w:rPr>
-        <w:t>socket.data.dmPeers</w:t>
-      </w:r>
-      <w:r>
-        <w:rPr>
-          <w:rFonts w:ascii="Garamond" w:hAnsi="Garamond"/>
-        </w:rPr>
-        <w:t xml:space="preserve"> objects.</w:t>
-      </w:r>
-    </w:p>
-    <w:p>
-      <w:pPr>
-        <w:spacing w:line="360" w:lineRule="auto"/>
-        <w:rPr>
-          <w:rFonts w:ascii="Garamond" w:hAnsi="Garamond"/>
-        </w:rPr>
-      </w:pPr>
-      <w:r>
-        <w:rPr>
-          <w:rFonts w:ascii="Garamond" w:hAnsi="Garamond"/>
-        </w:rPr>
-        <w:t xml:space="preserve">When the backend receives the component’s </w:t>
-      </w:r>
-      <w:r>
-        <w:rPr>
-          <w:rFonts w:ascii="Garamond" w:hAnsi="Garamond"/>
-          <w:b/>
-          <w:bCs/>
-        </w:rPr>
-        <w:t>chat_message</w:t>
-      </w:r>
-      <w:r>
-        <w:rPr>
-          <w:rFonts w:ascii="Garamond" w:hAnsi="Garamond"/>
-        </w:rPr>
-        <w:t xml:space="preserve"> event, its </w:t>
-      </w:r>
-      <w:r>
-        <w:rPr>
-          <w:rFonts w:ascii="Garamond" w:hAnsi="Garamond"/>
-          <w:b/>
-          <w:bCs/>
-        </w:rPr>
-        <w:t>chat_message</w:t>
-      </w:r>
-      <w:r>
-        <w:rPr>
-          <w:rFonts w:ascii="Garamond" w:hAnsi="Garamond"/>
-        </w:rPr>
-        <w:t xml:space="preserve"> event handler validates that the socket is a member of that room. It then derives the user and recipient ids as described above,</w:t>
-      </w:r>
-      <w:r>
-        <w:rPr>
-          <w:rFonts w:ascii="Garamond" w:hAnsi="Garamond"/>
-        </w:rPr>
-        <w:t xml:space="preserve"> and</w:t>
-      </w:r>
-      <w:r>
-        <w:rPr>
-          <w:rFonts w:ascii="Garamond" w:hAnsi="Garamond"/>
-        </w:rPr>
-        <w:t xml:space="preserve"> regenerates the room name</w:t>
-      </w:r>
-      <w:r>
-        <w:rPr>
-          <w:rFonts w:ascii="Garamond" w:hAnsi="Garamond"/>
-        </w:rPr>
-        <w:t>. The handler then uses an UPSERT query so the room name is only stored if it doesn’t already exist and the room_id is returned. This reduces calls to the database as the logic is handled in one query rather than check-then-insert queries.</w:t>
-      </w:r>
-    </w:p>
-    <w:p>
-      <w:pPr>
-        <w:spacing w:line="360" w:lineRule="auto"/>
-        <w:rPr>
-          <w:rFonts w:ascii="Garamond" w:hAnsi="Garamond"/>
-        </w:rPr>
-      </w:pPr>
-      <w:r>
-        <w:rPr>
-          <w:rFonts w:ascii="Garamond" w:hAnsi="Garamond"/>
-        </w:rPr>
-        <w:t xml:space="preserve">The returned </w:t>
-      </w:r>
-      <w:r>
-        <w:rPr>
-          <w:rFonts w:ascii="Garamond" w:hAnsi="Garamond"/>
-          <w:b/>
-          <w:bCs/>
-        </w:rPr>
-        <w:t>room_id</w:t>
-      </w:r>
-      <w:r>
-        <w:rPr>
-          <w:rFonts w:ascii="Garamond" w:hAnsi="Garamond"/>
-        </w:rPr>
-        <w:t xml:space="preserve"> is then used to insert the message text in to the </w:t>
-      </w:r>
-      <w:r>
-        <w:rPr>
-          <w:rFonts w:ascii="Garamond" w:hAnsi="Garamond"/>
-          <w:b/>
-          <w:bCs/>
-        </w:rPr>
-        <w:t>chat_messages</w:t>
-      </w:r>
-      <w:r>
-        <w:rPr>
-          <w:rFonts w:ascii="Garamond" w:hAnsi="Garamond"/>
-        </w:rPr>
-        <w:t xml:space="preserve"> table along with sender user id, recipient user id and room id. </w:t>
-      </w:r>
-      <w:r>
-        <w:rPr>
-          <w:rFonts w:ascii="Garamond" w:hAnsi="Garamond"/>
-        </w:rPr>
-        <w:t>At this insert, t</w:t>
-      </w:r>
-      <w:r>
-        <w:rPr>
-          <w:rFonts w:ascii="Garamond" w:hAnsi="Garamond"/>
-        </w:rPr>
-        <w:t xml:space="preserve">he database returns a </w:t>
-      </w:r>
-      <w:r>
-        <w:rPr>
-          <w:rFonts w:ascii="Garamond" w:hAnsi="Garamond"/>
-          <w:b/>
-          <w:bCs/>
-        </w:rPr>
-        <w:t>message_id</w:t>
-      </w:r>
-      <w:r>
-        <w:rPr>
-          <w:rFonts w:ascii="Garamond" w:hAnsi="Garamond"/>
-        </w:rPr>
-        <w:t xml:space="preserve">  and </w:t>
-      </w:r>
-      <w:r>
-        <w:rPr>
-          <w:rFonts w:ascii="Garamond" w:hAnsi="Garamond"/>
-          <w:b/>
-          <w:bCs/>
-        </w:rPr>
-        <w:t>sent_at</w:t>
-      </w:r>
-      <w:r>
-        <w:rPr>
-          <w:rFonts w:ascii="Garamond" w:hAnsi="Garamond"/>
-        </w:rPr>
-        <w:t xml:space="preserve"> timestamp </w:t>
-      </w:r>
-      <w:r>
-        <w:rPr>
-          <w:rFonts w:ascii="Garamond" w:hAnsi="Garamond"/>
-        </w:rPr>
-        <w:t xml:space="preserve">and the </w:t>
-      </w:r>
-      <w:r>
-        <w:rPr>
-          <w:rFonts w:ascii="Garamond" w:hAnsi="Garamond"/>
-          <w:b/>
-          <w:bCs/>
-        </w:rPr>
-        <w:t>room_id</w:t>
-      </w:r>
-      <w:r>
-        <w:rPr>
-          <w:rFonts w:ascii="Garamond" w:hAnsi="Garamond"/>
-        </w:rPr>
-        <w:t xml:space="preserve"> </w:t>
-      </w:r>
-      <w:r>
-        <w:rPr>
-          <w:rFonts w:ascii="Garamond" w:hAnsi="Garamond"/>
-        </w:rPr>
-        <w:t xml:space="preserve">which are then used to backfill the </w:t>
-      </w:r>
-      <w:r>
-        <w:rPr>
-          <w:rFonts w:ascii="Garamond" w:hAnsi="Garamond"/>
-          <w:b/>
-          <w:bCs/>
-        </w:rPr>
-        <w:t>chat</w:t>
-      </w:r>
-      <w:r>
-        <w:rPr>
-          <w:rFonts w:ascii="Garamond" w:hAnsi="Garamond"/>
-          <w:b/>
-          <w:bCs/>
-        </w:rPr>
-        <w:t>_rooms</w:t>
-      </w:r>
-      <w:r>
-        <w:rPr>
-          <w:rFonts w:ascii="Garamond" w:hAnsi="Garamond"/>
-        </w:rPr>
-        <w:t xml:space="preserve"> table relevant </w:t>
-      </w:r>
-      <w:r>
-        <w:rPr>
-          <w:rFonts w:ascii="Garamond" w:hAnsi="Garamond"/>
-          <w:b/>
-          <w:bCs/>
-        </w:rPr>
-        <w:t>room_id</w:t>
-      </w:r>
-      <w:r>
-        <w:rPr>
-          <w:rFonts w:ascii="Garamond" w:hAnsi="Garamond"/>
-        </w:rPr>
-        <w:t xml:space="preserve"> row with the </w:t>
-      </w:r>
-      <w:r>
-        <w:rPr>
-          <w:rFonts w:ascii="Garamond" w:hAnsi="Garamond"/>
-          <w:b/>
-          <w:bCs/>
-        </w:rPr>
-        <w:t>message_id</w:t>
-      </w:r>
-      <w:r>
-        <w:rPr>
-          <w:rFonts w:ascii="Garamond" w:hAnsi="Garamond"/>
-        </w:rPr>
-        <w:t xml:space="preserve"> and </w:t>
-      </w:r>
-      <w:r>
-        <w:rPr>
-          <w:rFonts w:ascii="Garamond" w:hAnsi="Garamond"/>
-          <w:b/>
-          <w:bCs/>
-        </w:rPr>
-        <w:t>sent_at</w:t>
-      </w:r>
-      <w:r>
-        <w:rPr>
-          <w:rFonts w:ascii="Garamond" w:hAnsi="Garamond"/>
-        </w:rPr>
-        <w:t xml:space="preserve"> timestamp. This allows the inbox-summary functionality described below.</w:t>
-      </w:r>
-      <w:r>
-        <w:rPr>
-          <w:rFonts w:ascii="Garamond" w:hAnsi="Garamond"/>
-        </w:rPr>
-        <w:t xml:space="preserve"> Once the message has been saved, the backend creates a message object and emits it to the frontend via </w:t>
-      </w:r>
-      <w:r>
-        <w:rPr>
-          <w:rFonts w:ascii="Garamond" w:hAnsi="Garamond"/>
-          <w:b/>
-          <w:bCs/>
-        </w:rPr>
-        <w:t>io.to(room).emit()</w:t>
-      </w:r>
-      <w:r>
-        <w:rPr>
-          <w:rFonts w:ascii="Garamond" w:hAnsi="Garamond"/>
-        </w:rPr>
-        <w:t xml:space="preserve"> so that both parties receive the message.</w:t>
-      </w:r>
-      <w:r>
-        <w:rPr>
-          <w:rFonts w:ascii="Garamond" w:hAnsi="Garamond"/>
-        </w:rPr>
-        <w:t xml:space="preserve"> Finally, to support notification, a truncated message object is sent to the recipient’s personal room via </w:t>
-      </w:r>
-      <w:r>
-        <w:rPr>
-          <w:rFonts w:ascii="Garamond" w:hAnsi="Garamond"/>
-          <w:b/>
-          <w:bCs/>
-        </w:rPr>
-        <w:t>io.to(`user:${recipientUserId}`).emit('incoming_chat'</w:t>
-      </w:r>
-      <w:r>
-        <w:rPr>
-          <w:rFonts w:ascii="Garamond" w:hAnsi="Garamond"/>
-          <w:b/>
-          <w:bCs/>
-        </w:rPr>
-        <w:t>)</w:t>
-      </w:r>
-      <w:r>
-        <w:rPr>
-          <w:rFonts w:ascii="Garamond" w:hAnsi="Garamond"/>
-        </w:rPr>
-        <w:t>.</w:t>
-      </w:r>
-    </w:p>
-    <w:p>
-      <w:pPr>
-        <w:spacing w:line="360" w:lineRule="auto"/>
-        <w:rPr>
-          <w:rFonts w:ascii="Garamond" w:hAnsi="Garamond"/>
-        </w:rPr>
-      </w:pPr>
-      <w:r>
-        <w:rPr>
-          <w:rFonts w:ascii="Garamond" w:hAnsi="Garamond"/>
-        </w:rPr>
-        <w:t xml:space="preserve">On the frontend, </w:t>
-      </w:r>
-      <w:r>
-        <w:rPr>
-          <w:rFonts w:ascii="Garamond" w:hAnsi="Garamond"/>
-          <w:b/>
-          <w:bCs/>
-        </w:rPr>
-        <w:t xml:space="preserve">ChatWindow </w:t>
-      </w:r>
-      <w:r>
-        <w:rPr>
-          <w:rFonts w:ascii="Garamond" w:hAnsi="Garamond"/>
-        </w:rPr>
-        <w:t xml:space="preserve">component listens for server-emitted </w:t>
-      </w:r>
-      <w:r>
-        <w:rPr>
-          <w:rFonts w:ascii="Garamond" w:hAnsi="Garamond"/>
-          <w:b/>
-          <w:bCs/>
-        </w:rPr>
-        <w:t>chat_message</w:t>
-      </w:r>
-      <w:r>
-        <w:rPr>
-          <w:rFonts w:ascii="Garamond" w:hAnsi="Garamond"/>
-        </w:rPr>
-        <w:t xml:space="preserve"> events and adds them to its </w:t>
-      </w:r>
-      <w:r>
-        <w:rPr>
-          <w:rFonts w:ascii="Garamond" w:hAnsi="Garamond"/>
-          <w:b/>
-          <w:bCs/>
-        </w:rPr>
-        <w:t>messages</w:t>
-      </w:r>
-      <w:r>
-        <w:rPr>
-          <w:rFonts w:ascii="Garamond" w:hAnsi="Garamond"/>
-        </w:rPr>
-        <w:t xml:space="preserve"> state array</w:t>
-      </w:r>
-    </w:p>
-    <w:p>
-      <w:pPr>
-        <w:spacing w:line="360" w:lineRule="auto"/>
-        <w:rPr>
-          <w:rFonts w:ascii="Garamond" w:hAnsi="Garamond"/>
-          <w:b/>
-          <w:bCs/>
-        </w:rPr>
-      </w:pPr>
+          <w:b/>
+          <w:bCs/>
+        </w:rPr>
+        <w:t>Context</w:t>
+      </w:r>
+      <w:r>
+        <w:rPr>
+          <w:rFonts w:ascii="Garamond" w:hAnsi="Garamond"/>
+        </w:rPr>
+        <w:t>, allows app-wide, authenticated, real-time notification and webchat</w:t>
+      </w:r>
     </w:p>
     <w:p>
       <w:pPr>
@@ -11502,7 +12838,6 @@
           <w:sz w:val="28"/>
           <w:szCs w:val="28"/>
         </w:rPr>
-        <w:lastRenderedPageBreak/>
         <w:t>References</w:t>
       </w:r>
       <w:bookmarkEnd w:id="28"/>
@@ -11539,7 +12874,6 @@
           <w:rPr>
             <w:rStyle w:val="Hyperlink"/>
             <w:rFonts w:ascii="Garamond" w:hAnsi="Garamond"/>
-            <w:color w:val="auto"/>
           </w:rPr>
           <w:t>https://musicteachers.co.uk/</w:t>
         </w:r>
@@ -11563,7 +12897,6 @@
           <w:rPr>
             <w:rStyle w:val="Hyperlink"/>
             <w:rFonts w:ascii="Garamond" w:hAnsi="Garamond"/>
-            <w:color w:val="auto"/>
           </w:rPr>
           <w:t>https://musicteacher.com/</w:t>
         </w:r>
@@ -11587,7 +12920,6 @@
           <w:rPr>
             <w:rStyle w:val="Hyperlink"/>
             <w:rFonts w:ascii="Garamond" w:hAnsi="Garamond"/>
-            <w:color w:val="auto"/>
           </w:rPr>
           <w:t>https://www.firsttutors.com/uk/music/</w:t>
         </w:r>
@@ -11626,7 +12958,19 @@
         <w:rPr>
           <w:rFonts w:ascii="Garamond" w:hAnsi="Garamond"/>
         </w:rPr>
-        <w:t>1: https://socket.io/docs/v4/how-it-works/</w:t>
+        <w:t xml:space="preserve">1: </w:t>
+      </w:r>
+      <w:r>
+        <w:rPr>
+          <w:rFonts w:ascii="Garamond" w:hAnsi="Garamond"/>
+        </w:rPr>
+        <w:t>http</w:t>
+      </w:r>
+      <w:r>
+        <w:rPr>
+          <w:rFonts w:ascii="Garamond" w:hAnsi="Garamond"/>
+        </w:rPr>
+        <w:t>s://socket.io/docs/v4/how-it-works/</w:t>
       </w:r>
     </w:p>
     <w:p>
@@ -13061,6 +14405,7 @@
   <w:style w:type="character" w:default="1" w:styleId="DefaultParagraphFont">
     <w:name w:val="Default Paragraph Font"/>
     <w:uiPriority w:val="1"/>
+    <w:semiHidden/>
     <w:unhideWhenUsed/>
   </w:style>
   <w:style w:type="table" w:default="1" w:styleId="TableNormal">
@@ -13470,6 +14815,18 @@
       <w:ind w:left="220"/>
     </w:pPr>
   </w:style>
+  <w:style w:type="character" w:styleId="UnresolvedMention">
+    <w:name w:val="Unresolved Mention"/>
+    <w:basedOn w:val="DefaultParagraphFont"/>
+    <w:uiPriority w:val="99"/>
+    <w:semiHidden/>
+    <w:unhideWhenUsed/>
+    <w:rsid w:val="00C41118"/>
+    <w:rPr>
+      <w:color w:val="605E5C"/>
+      <w:shd w:val="clear" w:color="auto" w:fill="E1DFDD"/>
+    </w:rPr>
+  </w:style>
 </w:styles>
 </file>
 

</xml_diff>

<commit_message>
completed section of Testing chapter
as above
</commit_message>
<xml_diff>
--- a/docs/dissertation start.docx
+++ b/docs/dissertation start.docx
@@ -12269,7 +12269,7 @@
         <w:t xml:space="preserve"> valid</w:t>
       </w:r>
       <w:r>
-        <w:t xml:space="preserve"> data and </w:t>
+        <w:t xml:space="preserve"> and </w:t>
       </w:r>
       <w:r>
         <w:t>in</w:t>
@@ -12326,17 +12326,17 @@
         <w:t>were displayed</w:t>
       </w:r>
       <w:r>
+        <w:t xml:space="preserve"> when navigating away from the input field</w:t>
+      </w:r>
+      <w:r>
+        <w:t>, and form submission was not allowed</w:t>
+      </w:r>
+      <w:r>
+        <w:t>. This verified that the schema-based validation and real-time user feedback were functioning correctly.</w:t>
+      </w:r>
+      <w:r>
         <w:t xml:space="preserve"> </w:t>
       </w:r>
-      <w:r>
-        <w:t>when navigating away from the input field</w:t>
-      </w:r>
-      <w:r>
-        <w:t>. This verified that the schema-based validation and real-time user feedback were functioning correctly.</w:t>
-      </w:r>
-      <w:r>
-        <w:t xml:space="preserve"> </w:t>
-      </w:r>
     </w:p>
     <w:p>
       <w:pPr>
@@ -12383,10 +12383,7 @@
         <w:t>.</w:t>
       </w:r>
       <w:r>
-        <w:t xml:space="preserve"> </w:t>
-      </w:r>
-      <w:r>
-        <w:t xml:space="preserve">Successful </w:t>
+        <w:t xml:space="preserve"> Successful </w:t>
       </w:r>
       <w:r>
         <w:t xml:space="preserve">tutor </w:t>
@@ -12404,13 +12401,7 @@
       </w:r>
       <w:proofErr w:type="spellEnd"/>
       <w:r>
-        <w:t xml:space="preserve"> component which was populated with the test tutor’s </w:t>
-      </w:r>
-      <w:r>
-        <w:t>details</w:t>
-      </w:r>
-      <w:r>
-        <w:t xml:space="preserve"> fetched from the backend; the information corresponded exactly to the information entered in the tutor registration form.</w:t>
+        <w:t xml:space="preserve"> component which was populated with the test tutor’s details fetched from the backend; the information corresponded exactly to the information entered in the tutor registration form.</w:t>
       </w:r>
       <w:r>
         <w:t xml:space="preserve"> </w:t>
@@ -12543,7 +12534,13 @@
         <w:spacing w:line="360" w:lineRule="auto"/>
       </w:pPr>
       <w:r>
-        <w:t>Screenshots are included in the appendix as evidence.</w:t>
+        <w:t xml:space="preserve">Screenshots are included in the </w:t>
+      </w:r>
+      <w:r>
+        <w:t xml:space="preserve">testing </w:t>
+      </w:r>
+      <w:r>
+        <w:t>appendix as evidence.</w:t>
       </w:r>
     </w:p>
     <w:p>
@@ -12559,6 +12556,193 @@
     </w:p>
     <w:p>
       <w:pPr>
+        <w:spacing w:line="360" w:lineRule="auto"/>
+      </w:pPr>
+      <w:r>
+        <w:t>The registration and login endpoints were tested with valid and invalid data</w:t>
+      </w:r>
+      <w:r>
+        <w:t xml:space="preserve"> for tutor and student</w:t>
+      </w:r>
+      <w:r>
+        <w:t>.</w:t>
+      </w:r>
+      <w:r>
+        <w:t xml:space="preserve"> Both were successfully registered when correct data was sent</w:t>
+      </w:r>
+      <w:r>
+        <w:t xml:space="preserve"> to the registration endpoint</w:t>
+      </w:r>
+      <w:r>
+        <w:t xml:space="preserve">; the API returned </w:t>
+      </w:r>
+      <w:r>
+        <w:rPr>
+          <w:b/>
+          <w:bCs/>
+        </w:rPr>
+        <w:t>201</w:t>
+      </w:r>
+      <w:r>
+        <w:t xml:space="preserve"> HTTP response code and</w:t>
+      </w:r>
+      <w:r>
+        <w:t xml:space="preserve"> a</w:t>
+      </w:r>
+      <w:r>
+        <w:t xml:space="preserve"> success message.</w:t>
+      </w:r>
+    </w:p>
+    <w:p>
+      <w:pPr>
+        <w:spacing w:line="360" w:lineRule="auto"/>
+      </w:pPr>
+      <w:r>
+        <w:t>When re-registration</w:t>
+      </w:r>
+      <w:r>
+        <w:t xml:space="preserve"> with the same data</w:t>
+      </w:r>
+      <w:r>
+        <w:t xml:space="preserve"> was </w:t>
+      </w:r>
+      <w:r>
+        <w:t>attempted</w:t>
+      </w:r>
+      <w:r>
+        <w:t>,</w:t>
+      </w:r>
+      <w:r>
+        <w:t xml:space="preserve"> the API returned </w:t>
+      </w:r>
+      <w:r>
+        <w:t xml:space="preserve">the expected </w:t>
+      </w:r>
+      <w:r>
+        <w:rPr>
+          <w:b/>
+          <w:bCs/>
+        </w:rPr>
+        <w:t>409</w:t>
+      </w:r>
+      <w:r>
+        <w:t xml:space="preserve"> HTTP response and error message.</w:t>
+      </w:r>
+    </w:p>
+    <w:p>
+      <w:pPr>
+        <w:spacing w:line="360" w:lineRule="auto"/>
+      </w:pPr>
+      <w:r>
+        <w:t xml:space="preserve">Login attempts with </w:t>
+      </w:r>
+      <w:r>
+        <w:t>valis</w:t>
+      </w:r>
+      <w:r>
+        <w:t xml:space="preserve"> </w:t>
+      </w:r>
+      <w:r>
+        <w:t>credentials</w:t>
+      </w:r>
+      <w:r>
+        <w:t xml:space="preserve"> returned </w:t>
+      </w:r>
+      <w:r>
+        <w:rPr>
+          <w:b/>
+          <w:bCs/>
+        </w:rPr>
+        <w:t>200</w:t>
+      </w:r>
+      <w:r>
+        <w:t xml:space="preserve"> HTTP response, the </w:t>
+      </w:r>
+      <w:r>
+        <w:rPr>
+          <w:b/>
+          <w:bCs/>
+        </w:rPr>
+        <w:t>user</w:t>
+      </w:r>
+      <w:r>
+        <w:t xml:space="preserve"> object, and an HTTP-only cookie with a signed </w:t>
+      </w:r>
+      <w:r>
+        <w:rPr>
+          <w:b/>
+          <w:bCs/>
+        </w:rPr>
+        <w:t>JWT</w:t>
+      </w:r>
+      <w:r>
+        <w:t xml:space="preserve"> payload. Login attempts with either </w:t>
+      </w:r>
+      <w:r>
+        <w:t>an</w:t>
+      </w:r>
+      <w:r>
+        <w:t xml:space="preserve"> incorrect email or password returned </w:t>
+      </w:r>
+      <w:r>
+        <w:rPr>
+          <w:b/>
+          <w:bCs/>
+        </w:rPr>
+        <w:t>401</w:t>
+      </w:r>
+      <w:r>
+        <w:t xml:space="preserve"> HTTP response and error message.</w:t>
+      </w:r>
+    </w:p>
+    <w:p>
+      <w:pPr>
+        <w:spacing w:line="360" w:lineRule="auto"/>
+      </w:pPr>
+      <w:r>
+        <w:t xml:space="preserve">A GET request to the logout endpoint returned the </w:t>
+      </w:r>
+      <w:r>
+        <w:t>expected</w:t>
+      </w:r>
+      <w:r>
+        <w:t xml:space="preserve"> HTTP response and cleared the cookie</w:t>
+      </w:r>
+      <w:r>
+        <w:t xml:space="preserve">. Cookie clearance was </w:t>
+      </w:r>
+      <w:r>
+        <w:t xml:space="preserve">confirmed separately by </w:t>
+      </w:r>
+      <w:r>
+        <w:t>GET request to</w:t>
+      </w:r>
+      <w:r>
+        <w:t xml:space="preserve"> a</w:t>
+      </w:r>
+      <w:r>
+        <w:t xml:space="preserve"> protected route which returned</w:t>
+      </w:r>
+      <w:r>
+        <w:t xml:space="preserve"> the</w:t>
+      </w:r>
+      <w:r>
+        <w:t xml:space="preserve"> message for </w:t>
+      </w:r>
+      <w:r>
+        <w:t xml:space="preserve">an </w:t>
+      </w:r>
+      <w:r>
+        <w:t>unauthorised user.</w:t>
+      </w:r>
+    </w:p>
+    <w:p>
+      <w:pPr>
+        <w:spacing w:line="360" w:lineRule="auto"/>
+      </w:pPr>
+    </w:p>
+    <w:p>
+      <w:pPr>
         <w:pStyle w:val="Heading2"/>
         <w:spacing w:line="360" w:lineRule="auto"/>
       </w:pPr>
@@ -12608,19 +12792,7 @@
       </w:pPr>
       <w:bookmarkStart w:id="42" w:name="_Toc225105238"/>
       <w:r>
-        <w:t>4.</w:t>
-      </w:r>
-      <w:r>
-        <w:t>4</w:t>
-      </w:r>
-      <w:r>
-        <w:t xml:space="preserve"> </w:t>
-      </w:r>
-      <w:r>
-        <w:t>Real-time webchat</w:t>
-      </w:r>
-      <w:r>
-        <w:t xml:space="preserve"> testing</w:t>
+        <w:t>4.4 Real-time webchat testing</w:t>
       </w:r>
       <w:bookmarkEnd w:id="42"/>
     </w:p>
@@ -12631,13 +12803,7 @@
       </w:pPr>
       <w:bookmarkStart w:id="43" w:name="_Toc225105239"/>
       <w:r>
-        <w:t>4.</w:t>
-      </w:r>
-      <w:r>
-        <w:t>4</w:t>
-      </w:r>
-      <w:r>
-        <w:t>.1 Frontend testing</w:t>
+        <w:t>4.4.1 Frontend testing</w:t>
       </w:r>
       <w:bookmarkEnd w:id="43"/>
     </w:p>
@@ -12648,13 +12814,7 @@
       </w:pPr>
       <w:bookmarkStart w:id="44" w:name="_Toc225105240"/>
       <w:r>
-        <w:t>4.</w:t>
-      </w:r>
-      <w:r>
-        <w:t>4.</w:t>
-      </w:r>
-      <w:r>
-        <w:t>2 Manual end-to-end testing</w:t>
+        <w:t>4.4.2 Manual end-to-end testing</w:t>
       </w:r>
       <w:bookmarkEnd w:id="44"/>
     </w:p>
@@ -12665,13 +12825,7 @@
       </w:pPr>
       <w:bookmarkStart w:id="45" w:name="_Toc225105241"/>
       <w:r>
-        <w:t>4.</w:t>
-      </w:r>
-      <w:r>
-        <w:t>4</w:t>
-      </w:r>
-      <w:r>
-        <w:t>.3 API testing</w:t>
+        <w:t>4.4.3 API testing</w:t>
       </w:r>
       <w:bookmarkEnd w:id="45"/>
     </w:p>
@@ -12692,82 +12846,6 @@
     </w:p>
     <w:p>
       <w:pPr>
-        <w:pStyle w:val="Heading2"/>
-        <w:spacing w:line="360" w:lineRule="auto"/>
-      </w:pPr>
-    </w:p>
-    <w:p>
-      <w:pPr>
-        <w:spacing w:line="360" w:lineRule="auto"/>
-      </w:pPr>
-    </w:p>
-    <w:p>
-      <w:pPr>
-        <w:spacing w:line="360" w:lineRule="auto"/>
-      </w:pPr>
-    </w:p>
-    <w:p>
-      <w:pPr>
-        <w:spacing w:line="360" w:lineRule="auto"/>
-      </w:pPr>
-    </w:p>
-    <w:p>
-      <w:pPr>
-        <w:spacing w:line="360" w:lineRule="auto"/>
-      </w:pPr>
-    </w:p>
-    <w:p>
-      <w:pPr>
-        <w:spacing w:line="360" w:lineRule="auto"/>
-      </w:pPr>
-    </w:p>
-    <w:p>
-      <w:pPr>
-        <w:spacing w:line="360" w:lineRule="auto"/>
-      </w:pPr>
-    </w:p>
-    <w:p>
-      <w:pPr>
-        <w:spacing w:line="360" w:lineRule="auto"/>
-      </w:pPr>
-    </w:p>
-    <w:p>
-      <w:pPr>
-        <w:spacing w:line="360" w:lineRule="auto"/>
-      </w:pPr>
-    </w:p>
-    <w:p>
-      <w:pPr>
-        <w:spacing w:line="360" w:lineRule="auto"/>
-      </w:pPr>
-    </w:p>
-    <w:p>
-      <w:pPr>
-        <w:spacing w:line="360" w:lineRule="auto"/>
-      </w:pPr>
-    </w:p>
-    <w:p>
-      <w:pPr>
-        <w:spacing w:line="360" w:lineRule="auto"/>
-      </w:pPr>
-    </w:p>
-    <w:p>
-      <w:pPr>
-        <w:spacing w:line="360" w:lineRule="auto"/>
-      </w:pPr>
-    </w:p>
-    <w:p>
-      <w:pPr>
-        <w:spacing w:line="360" w:lineRule="auto"/>
-      </w:pPr>
-    </w:p>
-    <w:p>
-      <w:pPr>
-        <w:spacing w:line="360" w:lineRule="auto"/>
-      </w:pPr>
-    </w:p>
-    <w:p>
-      <w:pPr>
         <w:spacing w:line="360" w:lineRule="auto"/>
       </w:pPr>
     </w:p>
@@ -12778,6 +12856,13 @@
         <w:ind w:left="2160" w:firstLine="720"/>
       </w:pPr>
       <w:bookmarkStart w:id="46" w:name="_Toc225105242"/>
+    </w:p>
+    <w:p>
+      <w:pPr>
+        <w:pStyle w:val="Heading1"/>
+        <w:spacing w:line="360" w:lineRule="auto"/>
+        <w:ind w:left="2160" w:firstLine="720"/>
+      </w:pPr>
       <w:r>
         <w:t>APPENDICES</w:t>
       </w:r>
@@ -12906,6 +12991,7 @@
       <w:bookmarkStart w:id="47" w:name="_Toc224478608"/>
       <w:bookmarkStart w:id="48" w:name="_Toc225105243"/>
       <w:r>
+        <w:lastRenderedPageBreak/>
         <w:t>Appendix 1: Code snippets.</w:t>
       </w:r>
       <w:bookmarkEnd w:id="47"/>
@@ -14845,6 +14931,9 @@
         <w:spacing w:line="360" w:lineRule="auto"/>
       </w:pPr>
       <w:r>
+        <w:rPr>
+          <w:noProof/>
+        </w:rPr>
         <w:drawing>
           <wp:inline distT="0" distB="0" distL="0" distR="0" wp14:anchorId="57D995A7" wp14:editId="514F1AFB">
             <wp:extent cx="5306165" cy="5763429"/>
@@ -14887,45 +14976,42 @@
         <w:spacing w:line="360" w:lineRule="auto"/>
       </w:pPr>
       <w:r>
-        <w:t xml:space="preserve">Figure showing that the correct warning messages are displayed when user attempts to continue to the second part of the form with data </w:t>
-      </w:r>
-      <w:r>
-        <w:t>missing</w:t>
-      </w:r>
-      <w:r>
-        <w:t>.</w:t>
-      </w:r>
-    </w:p>
-    <w:p>
-      <w:pPr>
-        <w:spacing w:line="360" w:lineRule="auto"/>
-      </w:pPr>
-    </w:p>
-    <w:p>
-      <w:pPr>
-        <w:spacing w:line="360" w:lineRule="auto"/>
-      </w:pPr>
-    </w:p>
-    <w:p>
-      <w:pPr>
-        <w:spacing w:line="360" w:lineRule="auto"/>
-      </w:pPr>
-    </w:p>
-    <w:p>
-      <w:pPr>
-        <w:spacing w:line="360" w:lineRule="auto"/>
-      </w:pPr>
-    </w:p>
-    <w:p>
-      <w:pPr>
-        <w:spacing w:line="360" w:lineRule="auto"/>
-      </w:pPr>
-    </w:p>
-    <w:p>
-      <w:pPr>
-        <w:spacing w:line="360" w:lineRule="auto"/>
-      </w:pPr>
-      <w:r>
+        <w:t>Figure showing that the correct warning messages are displayed when user attempts to continue to the second part of the form with data missing.</w:t>
+      </w:r>
+    </w:p>
+    <w:p>
+      <w:pPr>
+        <w:spacing w:line="360" w:lineRule="auto"/>
+      </w:pPr>
+    </w:p>
+    <w:p>
+      <w:pPr>
+        <w:spacing w:line="360" w:lineRule="auto"/>
+      </w:pPr>
+    </w:p>
+    <w:p>
+      <w:pPr>
+        <w:spacing w:line="360" w:lineRule="auto"/>
+      </w:pPr>
+    </w:p>
+    <w:p>
+      <w:pPr>
+        <w:spacing w:line="360" w:lineRule="auto"/>
+      </w:pPr>
+    </w:p>
+    <w:p>
+      <w:pPr>
+        <w:spacing w:line="360" w:lineRule="auto"/>
+      </w:pPr>
+    </w:p>
+    <w:p>
+      <w:pPr>
+        <w:spacing w:line="360" w:lineRule="auto"/>
+      </w:pPr>
+      <w:r>
+        <w:rPr>
+          <w:noProof/>
+        </w:rPr>
         <w:lastRenderedPageBreak/>
         <w:drawing>
           <wp:inline distT="0" distB="0" distL="0" distR="0" wp14:anchorId="5FB5F882" wp14:editId="630B8CC2">
@@ -14987,6 +15073,9 @@
         <w:spacing w:line="360" w:lineRule="auto"/>
       </w:pPr>
       <w:r>
+        <w:rPr>
+          <w:noProof/>
+        </w:rPr>
         <w:lastRenderedPageBreak/>
         <w:drawing>
           <wp:inline distT="0" distB="0" distL="0" distR="0" wp14:anchorId="2EB9BE0F" wp14:editId="26BD0511">
@@ -15038,6 +15127,9 @@
         <w:spacing w:line="360" w:lineRule="auto"/>
       </w:pPr>
       <w:r>
+        <w:rPr>
+          <w:noProof/>
+        </w:rPr>
         <w:drawing>
           <wp:inline distT="0" distB="0" distL="0" distR="0" wp14:anchorId="16B58A01" wp14:editId="4D7C1012">
             <wp:extent cx="4267796" cy="1686160"/>
@@ -15088,6 +15180,9 @@
         <w:spacing w:line="360" w:lineRule="auto"/>
       </w:pPr>
       <w:r>
+        <w:rPr>
+          <w:noProof/>
+        </w:rPr>
         <w:drawing>
           <wp:inline distT="0" distB="0" distL="0" distR="0" wp14:anchorId="7B9BA6BA" wp14:editId="1D583917">
             <wp:extent cx="4315427" cy="943107"/>
@@ -15144,6 +15239,9 @@
         <w:spacing w:line="360" w:lineRule="auto"/>
       </w:pPr>
       <w:r>
+        <w:rPr>
+          <w:noProof/>
+        </w:rPr>
         <w:drawing>
           <wp:inline distT="0" distB="0" distL="0" distR="0" wp14:anchorId="511B0C7B" wp14:editId="15BABB27">
             <wp:extent cx="4305901" cy="933580"/>
@@ -15205,6 +15303,9 @@
         <w:spacing w:line="360" w:lineRule="auto"/>
       </w:pPr>
       <w:r>
+        <w:rPr>
+          <w:noProof/>
+        </w:rPr>
         <w:lastRenderedPageBreak/>
         <w:drawing>
           <wp:inline distT="0" distB="0" distL="0" distR="0" wp14:anchorId="653FEAE0" wp14:editId="60227F58">
@@ -15273,6 +15374,9 @@
         <w:spacing w:line="360" w:lineRule="auto"/>
       </w:pPr>
       <w:r>
+        <w:rPr>
+          <w:noProof/>
+        </w:rPr>
         <w:drawing>
           <wp:inline distT="0" distB="0" distL="0" distR="0" wp14:anchorId="2A9B343F" wp14:editId="4056C2F6">
             <wp:extent cx="5759450" cy="5805805"/>
@@ -15323,6 +15427,9 @@
         <w:spacing w:line="360" w:lineRule="auto"/>
       </w:pPr>
       <w:r>
+        <w:rPr>
+          <w:noProof/>
+        </w:rPr>
         <w:lastRenderedPageBreak/>
         <w:drawing>
           <wp:inline distT="0" distB="0" distL="0" distR="0" wp14:anchorId="6DA75629" wp14:editId="47A1650B">
@@ -15374,6 +15481,9 @@
         <w:spacing w:line="360" w:lineRule="auto"/>
       </w:pPr>
       <w:r>
+        <w:rPr>
+          <w:noProof/>
+        </w:rPr>
         <w:lastRenderedPageBreak/>
         <w:drawing>
           <wp:inline distT="0" distB="0" distL="0" distR="0" wp14:anchorId="62AB5CB8" wp14:editId="6310D9A8">
@@ -15425,6 +15535,9 @@
         <w:spacing w:line="360" w:lineRule="auto"/>
       </w:pPr>
       <w:r>
+        <w:rPr>
+          <w:noProof/>
+        </w:rPr>
         <w:drawing>
           <wp:inline distT="0" distB="0" distL="0" distR="0" wp14:anchorId="0CC4E598" wp14:editId="0522D4C5">
             <wp:extent cx="5416816" cy="742950"/>
@@ -15483,6 +15596,9 @@
         <w:spacing w:line="360" w:lineRule="auto"/>
       </w:pPr>
       <w:r>
+        <w:rPr>
+          <w:noProof/>
+        </w:rPr>
         <w:drawing>
           <wp:inline distT="0" distB="0" distL="0" distR="0" wp14:anchorId="0DFF6B9B" wp14:editId="2F07B788">
             <wp:extent cx="5759450" cy="488315"/>
@@ -15551,6 +15667,9 @@
         <w:spacing w:line="360" w:lineRule="auto"/>
       </w:pPr>
       <w:r>
+        <w:rPr>
+          <w:noProof/>
+        </w:rPr>
         <w:lastRenderedPageBreak/>
         <w:drawing>
           <wp:inline distT="0" distB="0" distL="0" distR="0" wp14:anchorId="2AD1667D" wp14:editId="3E558940">
@@ -15602,6 +15721,9 @@
         <w:spacing w:line="360" w:lineRule="auto"/>
       </w:pPr>
       <w:r>
+        <w:rPr>
+          <w:noProof/>
+        </w:rPr>
         <w:lastRenderedPageBreak/>
         <w:drawing>
           <wp:inline distT="0" distB="0" distL="0" distR="0" wp14:anchorId="55ADDDF9" wp14:editId="0A29892E">
@@ -15645,22 +15767,22 @@
         <w:spacing w:line="360" w:lineRule="auto"/>
       </w:pPr>
       <w:r>
-        <w:t>Student registration form showing correct error messages when confirm email field does not match the email field</w:t>
-      </w:r>
-      <w:r>
-        <w:t xml:space="preserve"> and confirm password does not match the password field.</w:t>
-      </w:r>
-    </w:p>
-    <w:p>
-      <w:pPr>
-        <w:spacing w:line="360" w:lineRule="auto"/>
-      </w:pPr>
-    </w:p>
-    <w:p>
-      <w:pPr>
-        <w:spacing w:line="360" w:lineRule="auto"/>
-      </w:pPr>
-      <w:r>
+        <w:t>Student registration form showing correct error messages when confirm email field does not match the email field and confirm password does not match the password field.</w:t>
+      </w:r>
+    </w:p>
+    <w:p>
+      <w:pPr>
+        <w:spacing w:line="360" w:lineRule="auto"/>
+      </w:pPr>
+    </w:p>
+    <w:p>
+      <w:pPr>
+        <w:spacing w:line="360" w:lineRule="auto"/>
+      </w:pPr>
+      <w:r>
+        <w:rPr>
+          <w:noProof/>
+        </w:rPr>
         <w:drawing>
           <wp:inline distT="0" distB="0" distL="0" distR="0" wp14:anchorId="6BC107EC" wp14:editId="6759E244">
             <wp:extent cx="4734586" cy="981212"/>
@@ -15711,6 +15833,9 @@
         <w:spacing w:line="360" w:lineRule="auto"/>
       </w:pPr>
       <w:r>
+        <w:rPr>
+          <w:noProof/>
+        </w:rPr>
         <w:drawing>
           <wp:inline distT="0" distB="0" distL="0" distR="0" wp14:anchorId="03B7E27B" wp14:editId="40784AD8">
             <wp:extent cx="4439270" cy="962159"/>
@@ -15767,6 +15892,9 @@
         <w:spacing w:line="360" w:lineRule="auto"/>
       </w:pPr>
       <w:r>
+        <w:rPr>
+          <w:noProof/>
+        </w:rPr>
         <w:lastRenderedPageBreak/>
         <w:drawing>
           <wp:inline distT="0" distB="0" distL="0" distR="0" wp14:anchorId="79B70801" wp14:editId="7DBB0233">
@@ -15818,6 +15946,9 @@
         <w:spacing w:line="360" w:lineRule="auto"/>
       </w:pPr>
       <w:r>
+        <w:rPr>
+          <w:noProof/>
+        </w:rPr>
         <w:lastRenderedPageBreak/>
         <w:drawing>
           <wp:inline distT="0" distB="0" distL="0" distR="0" wp14:anchorId="560A3699" wp14:editId="60DD821E">
@@ -15869,6 +16000,9 @@
         <w:spacing w:line="360" w:lineRule="auto"/>
       </w:pPr>
       <w:r>
+        <w:rPr>
+          <w:noProof/>
+        </w:rPr>
         <w:drawing>
           <wp:inline distT="0" distB="0" distL="0" distR="0" wp14:anchorId="4ADF99B5" wp14:editId="159F7B20">
             <wp:extent cx="5759450" cy="373380"/>
@@ -15919,6 +16053,9 @@
         <w:spacing w:line="360" w:lineRule="auto"/>
       </w:pPr>
       <w:r>
+        <w:rPr>
+          <w:noProof/>
+        </w:rPr>
         <w:drawing>
           <wp:inline distT="0" distB="0" distL="0" distR="0" wp14:anchorId="7E08516A" wp14:editId="7ECCB7E2">
             <wp:extent cx="5759450" cy="461010"/>
@@ -15974,6 +16111,9 @@
         <w:spacing w:line="360" w:lineRule="auto"/>
       </w:pPr>
       <w:r>
+        <w:rPr>
+          <w:noProof/>
+        </w:rPr>
         <w:drawing>
           <wp:inline distT="0" distB="0" distL="0" distR="0" wp14:anchorId="38C8EE29" wp14:editId="64682E8C">
             <wp:extent cx="4323283" cy="3187505"/>
@@ -16049,6 +16189,9 @@
         <w:spacing w:line="360" w:lineRule="auto"/>
       </w:pPr>
       <w:r>
+        <w:rPr>
+          <w:noProof/>
+        </w:rPr>
         <w:lastRenderedPageBreak/>
         <w:drawing>
           <wp:inline distT="0" distB="0" distL="0" distR="0" wp14:anchorId="088CA0A1" wp14:editId="15FAFB16">
@@ -16093,6 +16236,10 @@
       </w:pPr>
       <w:proofErr w:type="spellStart"/>
       <w:r>
+        <w:rPr>
+          <w:b/>
+          <w:bCs/>
+        </w:rPr>
         <w:t>TutorProfilePage</w:t>
       </w:r>
       <w:proofErr w:type="spellEnd"/>
@@ -16117,6 +16264,9 @@
         <w:spacing w:line="360" w:lineRule="auto"/>
       </w:pPr>
       <w:r>
+        <w:rPr>
+          <w:noProof/>
+        </w:rPr>
         <w:lastRenderedPageBreak/>
         <w:drawing>
           <wp:inline distT="0" distB="0" distL="0" distR="0" wp14:anchorId="7D448FA4" wp14:editId="49161FB0">
@@ -16161,11 +16311,25 @@
       </w:pPr>
       <w:proofErr w:type="spellStart"/>
       <w:r>
+        <w:rPr>
+          <w:b/>
+          <w:bCs/>
+        </w:rPr>
         <w:t>TutorProfilePage</w:t>
       </w:r>
       <w:proofErr w:type="spellEnd"/>
       <w:r>
-        <w:t xml:space="preserve"> viewed when logged in as a tutor; the message tutor button cannot be </w:t>
+        <w:t xml:space="preserve"> viewed when logged in as a tutor; the </w:t>
+      </w:r>
+      <w:r>
+        <w:rPr>
+          <w:i/>
+          <w:iCs/>
+        </w:rPr>
+        <w:t>message tutor</w:t>
+      </w:r>
+      <w:r>
+        <w:t xml:space="preserve"> button cannot be </w:t>
       </w:r>
       <w:proofErr w:type="gramStart"/>
       <w:r>
@@ -16178,6 +16342,407 @@
       <w:r>
         <w:t>and the user is notified that they cannot book lessons with other tutors.</w:t>
       </w:r>
+    </w:p>
+    <w:p>
+      <w:pPr>
+        <w:ind w:left="1440"/>
+      </w:pPr>
+      <w:r>
+        <w:lastRenderedPageBreak/>
+        <w:drawing>
+          <wp:inline distT="0" distB="0" distL="0" distR="0" wp14:anchorId="5A9C5E77" wp14:editId="70B55524">
+            <wp:extent cx="3369600" cy="4183200"/>
+            <wp:effectExtent l="0" t="0" r="2540" b="8255"/>
+            <wp:docPr id="2085587936" name="Picture 1"/>
+            <wp:cNvGraphicFramePr>
+              <a:graphicFrameLocks xmlns:a="http://schemas.openxmlformats.org/drawingml/2006/main" noChangeAspect="1"/>
+            </wp:cNvGraphicFramePr>
+            <a:graphic xmlns:a="http://schemas.openxmlformats.org/drawingml/2006/main">
+              <a:graphicData uri="http://schemas.openxmlformats.org/drawingml/2006/picture">
+                <pic:pic xmlns:pic="http://schemas.openxmlformats.org/drawingml/2006/picture">
+                  <pic:nvPicPr>
+                    <pic:cNvPr id="2085587936" name=""/>
+                    <pic:cNvPicPr/>
+                  </pic:nvPicPr>
+                  <pic:blipFill>
+                    <a:blip r:embed="rId56"/>
+                    <a:stretch>
+                      <a:fillRect/>
+                    </a:stretch>
+                  </pic:blipFill>
+                  <pic:spPr>
+                    <a:xfrm>
+                      <a:off x="0" y="0"/>
+                      <a:ext cx="3369600" cy="4183200"/>
+                    </a:xfrm>
+                    <a:prstGeom prst="rect">
+                      <a:avLst/>
+                    </a:prstGeom>
+                  </pic:spPr>
+                </pic:pic>
+              </a:graphicData>
+            </a:graphic>
+          </wp:inline>
+        </w:drawing>
+      </w:r>
+    </w:p>
+    <w:p>
+      <w:pPr>
+        <w:ind w:left="1440"/>
+      </w:pPr>
+      <w:r>
+        <w:t>Fig showing valid tutor registration data and valid server response</w:t>
+      </w:r>
+    </w:p>
+    <w:p>
+      <w:pPr>
+        <w:ind w:left="1440"/>
+      </w:pPr>
+      <w:r>
+        <w:drawing>
+          <wp:inline distT="0" distB="0" distL="0" distR="0" wp14:anchorId="1B5D4FDC" wp14:editId="779039D7">
+            <wp:extent cx="3474000" cy="4060800"/>
+            <wp:effectExtent l="0" t="0" r="0" b="0"/>
+            <wp:docPr id="1220657474" name="Picture 1"/>
+            <wp:cNvGraphicFramePr>
+              <a:graphicFrameLocks xmlns:a="http://schemas.openxmlformats.org/drawingml/2006/main" noChangeAspect="1"/>
+            </wp:cNvGraphicFramePr>
+            <a:graphic xmlns:a="http://schemas.openxmlformats.org/drawingml/2006/main">
+              <a:graphicData uri="http://schemas.openxmlformats.org/drawingml/2006/picture">
+                <pic:pic xmlns:pic="http://schemas.openxmlformats.org/drawingml/2006/picture">
+                  <pic:nvPicPr>
+                    <pic:cNvPr id="1220657474" name=""/>
+                    <pic:cNvPicPr/>
+                  </pic:nvPicPr>
+                  <pic:blipFill>
+                    <a:blip r:embed="rId57"/>
+                    <a:stretch>
+                      <a:fillRect/>
+                    </a:stretch>
+                  </pic:blipFill>
+                  <pic:spPr>
+                    <a:xfrm>
+                      <a:off x="0" y="0"/>
+                      <a:ext cx="3474000" cy="4060800"/>
+                    </a:xfrm>
+                    <a:prstGeom prst="rect">
+                      <a:avLst/>
+                    </a:prstGeom>
+                  </pic:spPr>
+                </pic:pic>
+              </a:graphicData>
+            </a:graphic>
+          </wp:inline>
+        </w:drawing>
+      </w:r>
+    </w:p>
+    <w:p>
+      <w:pPr>
+        <w:spacing w:line="240" w:lineRule="auto"/>
+        <w:ind w:left="1440"/>
+      </w:pPr>
+      <w:r>
+        <w:t>Fig showing correct error message and 409 response code when attempting to register with an already registered email.</w:t>
+      </w:r>
+    </w:p>
+    <w:p>
+      <w:pPr>
+        <w:spacing w:line="240" w:lineRule="auto"/>
+        <w:ind w:left="1440"/>
+      </w:pPr>
+      <w:r>
+        <w:lastRenderedPageBreak/>
+        <w:drawing>
+          <wp:inline distT="0" distB="0" distL="0" distR="0" wp14:anchorId="510A68E3" wp14:editId="7307DF5E">
+            <wp:extent cx="3546000" cy="4046400"/>
+            <wp:effectExtent l="0" t="0" r="0" b="0"/>
+            <wp:docPr id="905333140" name="Picture 1"/>
+            <wp:cNvGraphicFramePr>
+              <a:graphicFrameLocks xmlns:a="http://schemas.openxmlformats.org/drawingml/2006/main" noChangeAspect="1"/>
+            </wp:cNvGraphicFramePr>
+            <a:graphic xmlns:a="http://schemas.openxmlformats.org/drawingml/2006/main">
+              <a:graphicData uri="http://schemas.openxmlformats.org/drawingml/2006/picture">
+                <pic:pic xmlns:pic="http://schemas.openxmlformats.org/drawingml/2006/picture">
+                  <pic:nvPicPr>
+                    <pic:cNvPr id="905333140" name=""/>
+                    <pic:cNvPicPr/>
+                  </pic:nvPicPr>
+                  <pic:blipFill>
+                    <a:blip r:embed="rId58"/>
+                    <a:stretch>
+                      <a:fillRect/>
+                    </a:stretch>
+                  </pic:blipFill>
+                  <pic:spPr>
+                    <a:xfrm>
+                      <a:off x="0" y="0"/>
+                      <a:ext cx="3546000" cy="4046400"/>
+                    </a:xfrm>
+                    <a:prstGeom prst="rect">
+                      <a:avLst/>
+                    </a:prstGeom>
+                  </pic:spPr>
+                </pic:pic>
+              </a:graphicData>
+            </a:graphic>
+          </wp:inline>
+        </w:drawing>
+      </w:r>
+    </w:p>
+    <w:p>
+      <w:pPr>
+        <w:spacing w:line="360" w:lineRule="auto"/>
+        <w:ind w:firstLine="720"/>
+      </w:pPr>
+      <w:r>
+        <w:t xml:space="preserve">Fig showing successful login with 200 response code and the </w:t>
+      </w:r>
+      <w:r>
+        <w:rPr>
+          <w:b/>
+          <w:bCs/>
+        </w:rPr>
+        <w:t>user</w:t>
+      </w:r>
+      <w:r>
+        <w:t xml:space="preserve"> object</w:t>
+      </w:r>
+    </w:p>
+    <w:p>
+      <w:pPr>
+        <w:spacing w:line="360" w:lineRule="auto"/>
+        <w:ind w:firstLine="720"/>
+      </w:pPr>
+      <w:r>
+        <w:drawing>
+          <wp:inline distT="0" distB="0" distL="0" distR="0" wp14:anchorId="78CBD6EC" wp14:editId="212FDBC9">
+            <wp:extent cx="4449399" cy="3044825"/>
+            <wp:effectExtent l="0" t="0" r="8890" b="3175"/>
+            <wp:docPr id="1328481752" name="Picture 1"/>
+            <wp:cNvGraphicFramePr>
+              <a:graphicFrameLocks xmlns:a="http://schemas.openxmlformats.org/drawingml/2006/main" noChangeAspect="1"/>
+            </wp:cNvGraphicFramePr>
+            <a:graphic xmlns:a="http://schemas.openxmlformats.org/drawingml/2006/main">
+              <a:graphicData uri="http://schemas.openxmlformats.org/drawingml/2006/picture">
+                <pic:pic xmlns:pic="http://schemas.openxmlformats.org/drawingml/2006/picture">
+                  <pic:nvPicPr>
+                    <pic:cNvPr id="1328481752" name=""/>
+                    <pic:cNvPicPr/>
+                  </pic:nvPicPr>
+                  <pic:blipFill>
+                    <a:blip r:embed="rId59"/>
+                    <a:stretch>
+                      <a:fillRect/>
+                    </a:stretch>
+                  </pic:blipFill>
+                  <pic:spPr>
+                    <a:xfrm>
+                      <a:off x="0" y="0"/>
+                      <a:ext cx="4451029" cy="3045941"/>
+                    </a:xfrm>
+                    <a:prstGeom prst="rect">
+                      <a:avLst/>
+                    </a:prstGeom>
+                  </pic:spPr>
+                </pic:pic>
+              </a:graphicData>
+            </a:graphic>
+          </wp:inline>
+        </w:drawing>
+      </w:r>
+    </w:p>
+    <w:p>
+      <w:pPr>
+        <w:spacing w:line="360" w:lineRule="auto"/>
+        <w:ind w:left="720" w:firstLine="720"/>
+      </w:pPr>
+      <w:r>
+        <w:t xml:space="preserve">Proof of </w:t>
+      </w:r>
+      <w:r>
+        <w:t xml:space="preserve">HTTP-only </w:t>
+      </w:r>
+      <w:r>
+        <w:t xml:space="preserve">cookie with signed </w:t>
+      </w:r>
+      <w:r>
+        <w:rPr>
+          <w:b/>
+          <w:bCs/>
+        </w:rPr>
+        <w:t xml:space="preserve">JWT </w:t>
+      </w:r>
+      <w:r>
+        <w:t>post-login</w:t>
+      </w:r>
+    </w:p>
+    <w:p>
+      <w:pPr>
+        <w:spacing w:line="360" w:lineRule="auto"/>
+        <w:ind w:left="720" w:firstLine="720"/>
+      </w:pPr>
+      <w:r>
+        <w:lastRenderedPageBreak/>
+        <w:drawing>
+          <wp:inline distT="0" distB="0" distL="0" distR="0" wp14:anchorId="0E281811" wp14:editId="06350D9A">
+            <wp:extent cx="3933452" cy="3640458"/>
+            <wp:effectExtent l="0" t="0" r="0" b="0"/>
+            <wp:docPr id="426483148" name="Picture 1"/>
+            <wp:cNvGraphicFramePr>
+              <a:graphicFrameLocks xmlns:a="http://schemas.openxmlformats.org/drawingml/2006/main" noChangeAspect="1"/>
+            </wp:cNvGraphicFramePr>
+            <a:graphic xmlns:a="http://schemas.openxmlformats.org/drawingml/2006/main">
+              <a:graphicData uri="http://schemas.openxmlformats.org/drawingml/2006/picture">
+                <pic:pic xmlns:pic="http://schemas.openxmlformats.org/drawingml/2006/picture">
+                  <pic:nvPicPr>
+                    <pic:cNvPr id="426483148" name=""/>
+                    <pic:cNvPicPr/>
+                  </pic:nvPicPr>
+                  <pic:blipFill>
+                    <a:blip r:embed="rId60"/>
+                    <a:stretch>
+                      <a:fillRect/>
+                    </a:stretch>
+                  </pic:blipFill>
+                  <pic:spPr>
+                    <a:xfrm>
+                      <a:off x="0" y="0"/>
+                      <a:ext cx="3937932" cy="3644605"/>
+                    </a:xfrm>
+                    <a:prstGeom prst="rect">
+                      <a:avLst/>
+                    </a:prstGeom>
+                  </pic:spPr>
+                </pic:pic>
+              </a:graphicData>
+            </a:graphic>
+          </wp:inline>
+        </w:drawing>
+      </w:r>
+    </w:p>
+    <w:p>
+      <w:pPr>
+        <w:spacing w:line="360" w:lineRule="auto"/>
+        <w:ind w:left="720" w:firstLine="720"/>
+      </w:pPr>
+      <w:r>
+        <w:t>Successful logout with 200 response and cookie removal</w:t>
+      </w:r>
+    </w:p>
+    <w:p>
+      <w:pPr>
+        <w:spacing w:line="360" w:lineRule="auto"/>
+        <w:ind w:left="720" w:firstLine="720"/>
+      </w:pPr>
+      <w:r>
+        <w:drawing>
+          <wp:inline distT="0" distB="0" distL="0" distR="0" wp14:anchorId="3D38EDE2" wp14:editId="5693F87F">
+            <wp:extent cx="3420000" cy="3142800"/>
+            <wp:effectExtent l="0" t="0" r="9525" b="635"/>
+            <wp:docPr id="1293724817" name="Picture 1"/>
+            <wp:cNvGraphicFramePr>
+              <a:graphicFrameLocks xmlns:a="http://schemas.openxmlformats.org/drawingml/2006/main" noChangeAspect="1"/>
+            </wp:cNvGraphicFramePr>
+            <a:graphic xmlns:a="http://schemas.openxmlformats.org/drawingml/2006/main">
+              <a:graphicData uri="http://schemas.openxmlformats.org/drawingml/2006/picture">
+                <pic:pic xmlns:pic="http://schemas.openxmlformats.org/drawingml/2006/picture">
+                  <pic:nvPicPr>
+                    <pic:cNvPr id="1293724817" name=""/>
+                    <pic:cNvPicPr/>
+                  </pic:nvPicPr>
+                  <pic:blipFill>
+                    <a:blip r:embed="rId61"/>
+                    <a:stretch>
+                      <a:fillRect/>
+                    </a:stretch>
+                  </pic:blipFill>
+                  <pic:spPr>
+                    <a:xfrm>
+                      <a:off x="0" y="0"/>
+                      <a:ext cx="3420000" cy="3142800"/>
+                    </a:xfrm>
+                    <a:prstGeom prst="rect">
+                      <a:avLst/>
+                    </a:prstGeom>
+                  </pic:spPr>
+                </pic:pic>
+              </a:graphicData>
+            </a:graphic>
+          </wp:inline>
+        </w:drawing>
+      </w:r>
+    </w:p>
+    <w:p>
+      <w:pPr>
+        <w:spacing w:line="360" w:lineRule="auto"/>
+        <w:ind w:left="720" w:firstLine="720"/>
+      </w:pPr>
+      <w:r>
+        <w:t>401 response and error message when incorrect password used for tutor login</w:t>
+      </w:r>
+    </w:p>
+    <w:p>
+      <w:pPr>
+        <w:spacing w:line="360" w:lineRule="auto"/>
+        <w:ind w:left="720" w:firstLine="720"/>
+      </w:pPr>
+      <w:r>
+        <w:lastRenderedPageBreak/>
+        <w:drawing>
+          <wp:inline distT="0" distB="0" distL="0" distR="0" wp14:anchorId="72B2AA5D" wp14:editId="6741D05E">
+            <wp:extent cx="3358800" cy="3142800"/>
+            <wp:effectExtent l="0" t="0" r="0" b="635"/>
+            <wp:docPr id="597586986" name="Picture 1"/>
+            <wp:cNvGraphicFramePr>
+              <a:graphicFrameLocks xmlns:a="http://schemas.openxmlformats.org/drawingml/2006/main" noChangeAspect="1"/>
+            </wp:cNvGraphicFramePr>
+            <a:graphic xmlns:a="http://schemas.openxmlformats.org/drawingml/2006/main">
+              <a:graphicData uri="http://schemas.openxmlformats.org/drawingml/2006/picture">
+                <pic:pic xmlns:pic="http://schemas.openxmlformats.org/drawingml/2006/picture">
+                  <pic:nvPicPr>
+                    <pic:cNvPr id="597586986" name=""/>
+                    <pic:cNvPicPr/>
+                  </pic:nvPicPr>
+                  <pic:blipFill>
+                    <a:blip r:embed="rId62"/>
+                    <a:stretch>
+                      <a:fillRect/>
+                    </a:stretch>
+                  </pic:blipFill>
+                  <pic:spPr>
+                    <a:xfrm>
+                      <a:off x="0" y="0"/>
+                      <a:ext cx="3358800" cy="3142800"/>
+                    </a:xfrm>
+                    <a:prstGeom prst="rect">
+                      <a:avLst/>
+                    </a:prstGeom>
+                  </pic:spPr>
+                </pic:pic>
+              </a:graphicData>
+            </a:graphic>
+          </wp:inline>
+        </w:drawing>
+      </w:r>
+    </w:p>
+    <w:p>
+      <w:pPr>
+        <w:spacing w:line="360" w:lineRule="auto"/>
+        <w:ind w:left="720" w:firstLine="720"/>
+      </w:pPr>
+      <w:r>
+        <w:t>401 response and error message when incorrect email used for tutor login</w:t>
+      </w:r>
+    </w:p>
+    <w:p>
+      <w:pPr>
+        <w:spacing w:line="360" w:lineRule="auto"/>
+      </w:pPr>
+    </w:p>
+    <w:p>
+      <w:pPr>
+        <w:spacing w:line="360" w:lineRule="auto"/>
+      </w:pPr>
     </w:p>
     <w:sectPr>
       <w:pgSz w:w="11906" w:h="16838"/>

</xml_diff>

<commit_message>
minor amendments to resting chaopter and appendix
</commit_message>
<xml_diff>
--- a/docs/dissertation start.docx
+++ b/docs/dissertation start.docx
@@ -13169,7 +13169,15 @@
         <w:spacing w:line="360" w:lineRule="auto"/>
       </w:pPr>
       <w:r>
-        <w:t xml:space="preserve">There are two API endpoints relating to real-time messaging: one for getting all of a chat’s messages from the database and displaying them in the </w:t>
+        <w:t xml:space="preserve">There are two API endpoints relating to real-time messaging: one for getting </w:t>
+      </w:r>
+      <w:proofErr w:type="gramStart"/>
+      <w:r>
+        <w:t>all of</w:t>
+      </w:r>
+      <w:proofErr w:type="gramEnd"/>
+      <w:r>
+        <w:t xml:space="preserve"> a chat’s messages from the database and displaying them in the </w:t>
       </w:r>
       <w:r>
         <w:rPr>
@@ -13179,7 +13187,7 @@
         <w:t>ChatWindow</w:t>
       </w:r>
       <w:r>
-        <w:t xml:space="preserve"> component, and one to get only the most recent message in a particular chat and displaying it in the </w:t>
+        <w:t xml:space="preserve"> component, and one to get only the most recent message in a particular chat and display it in the </w:t>
       </w:r>
       <w:proofErr w:type="spellStart"/>
       <w:r>
@@ -13203,29 +13211,7 @@
       </w:r>
       <w:proofErr w:type="spellEnd"/>
       <w:r>
-        <w:t xml:space="preserve"> component which allows a logged-in user to click on the </w:t>
-      </w:r>
-      <w:proofErr w:type="spellStart"/>
-      <w:r>
-        <w:rPr>
-          <w:b/>
-          <w:bCs/>
-        </w:rPr>
-        <w:t>InboxItem</w:t>
-      </w:r>
-      <w:proofErr w:type="spellEnd"/>
-      <w:r>
-        <w:t xml:space="preserve"> component to open a </w:t>
-      </w:r>
-      <w:r>
-        <w:rPr>
-          <w:b/>
-          <w:bCs/>
-        </w:rPr>
-        <w:t xml:space="preserve">ChatWindow </w:t>
-      </w:r>
-      <w:r>
-        <w:t xml:space="preserve">component. </w:t>
+        <w:t xml:space="preserve">. </w:t>
       </w:r>
       <w:r>
         <w:t>Both endpoints</w:t>
@@ -13243,13 +13229,22 @@
       <w:r>
         <w:t>.</w:t>
       </w:r>
-    </w:p>
-    <w:p>
-      <w:pPr>
-        <w:spacing w:line="360" w:lineRule="auto"/>
-      </w:pPr>
-      <w:r>
-        <w:t>There is no API endpoint for storing messages because the messages are sent through socket.io which does not have access to express’s request and response objects; consequently, messages are stored in the DB with direct queries in the socket.io middleware</w:t>
+      <w:r>
+        <w:t xml:space="preserve"> Further business logic checks that the requesting user is a participant in the chat requested; if they are not, an empty array is returned. This keeps chats confidential.</w:t>
+      </w:r>
+    </w:p>
+    <w:p>
+      <w:pPr>
+        <w:spacing w:line="360" w:lineRule="auto"/>
+      </w:pPr>
+      <w:r>
+        <w:t xml:space="preserve">There is no API endpoint for storing messages because the messages are sent through socket.io which does not have access to express’s request and response objects; consequently, messages are stored in the DB </w:t>
+      </w:r>
+      <w:r>
+        <w:t>via</w:t>
+      </w:r>
+      <w:r>
+        <w:t xml:space="preserve"> direct queries in the socket.io middleware</w:t>
       </w:r>
       <w:r>
         <w:t>, but the database is queried to prove persistence.</w:t>
@@ -13280,6 +13275,9 @@
       <w:proofErr w:type="gramEnd"/>
       <w:r>
         <w:t xml:space="preserve"> and the endpoints were re-tested.</w:t>
+      </w:r>
+      <w:r>
+        <w:t xml:space="preserve"> The endpoints sent the requested data.</w:t>
       </w:r>
     </w:p>
     <w:p>
@@ -13434,7 +13432,6 @@
       <w:bookmarkStart w:id="47" w:name="_Toc224478608"/>
       <w:bookmarkStart w:id="48" w:name="_Toc225105243"/>
       <w:r>
-        <w:lastRenderedPageBreak/>
         <w:t>Appendix 1: Code snippets.</w:t>
       </w:r>
       <w:bookmarkEnd w:id="47"/>
@@ -17441,6 +17438,9 @@
         <w:ind w:left="720" w:firstLine="720"/>
       </w:pPr>
       <w:r>
+        <w:rPr>
+          <w:noProof/>
+        </w:rPr>
         <w:lastRenderedPageBreak/>
         <w:drawing>
           <wp:inline distT="0" distB="0" distL="0" distR="0" wp14:anchorId="0515D447" wp14:editId="0336139C">
@@ -17540,6 +17540,9 @@
     </w:p>
     <w:p>
       <w:r>
+        <w:rPr>
+          <w:noProof/>
+        </w:rPr>
         <w:drawing>
           <wp:inline distT="0" distB="0" distL="0" distR="0" wp14:anchorId="7F7672CB" wp14:editId="06A8A093">
             <wp:extent cx="5759450" cy="4819650"/>
@@ -17621,6 +17624,9 @@
     </w:p>
     <w:p>
       <w:r>
+        <w:rPr>
+          <w:noProof/>
+        </w:rPr>
         <w:drawing>
           <wp:inline distT="0" distB="0" distL="0" distR="0" wp14:anchorId="1E95CC72" wp14:editId="75991DE2">
             <wp:extent cx="5759450" cy="1533525"/>
@@ -17667,10 +17673,7 @@
         <w:t>Fig 2.30</w:t>
       </w:r>
       <w:r>
-        <w:t xml:space="preserve"> Truncated view </w:t>
-      </w:r>
-      <w:r>
-        <w:t xml:space="preserve">of </w:t>
+        <w:t xml:space="preserve"> Truncated view of </w:t>
       </w:r>
       <w:proofErr w:type="spellStart"/>
       <w:r>
@@ -17697,6 +17700,9 @@
         <w:spacing w:line="360" w:lineRule="auto"/>
       </w:pPr>
       <w:r>
+        <w:rPr>
+          <w:noProof/>
+        </w:rPr>
         <w:lastRenderedPageBreak/>
         <w:drawing>
           <wp:inline distT="0" distB="0" distL="0" distR="0" wp14:anchorId="10665DD5" wp14:editId="281C858F">
@@ -17869,6 +17875,9 @@
         <w:ind w:firstLine="720"/>
       </w:pPr>
       <w:r>
+        <w:rPr>
+          <w:noProof/>
+        </w:rPr>
         <w:drawing>
           <wp:inline distT="0" distB="0" distL="0" distR="0" wp14:anchorId="7FB3F8D6" wp14:editId="243E5AFE">
             <wp:extent cx="3892585" cy="3434659"/>
@@ -17923,6 +17932,9 @@
     </w:p>
     <w:p>
       <w:r>
+        <w:rPr>
+          <w:noProof/>
+        </w:rPr>
         <w:drawing>
           <wp:inline distT="0" distB="0" distL="0" distR="0" wp14:anchorId="3D83EC5F" wp14:editId="71B25360">
             <wp:extent cx="5759450" cy="4186555"/>
@@ -17985,6 +17997,9 @@
         <w:spacing w:line="360" w:lineRule="auto"/>
       </w:pPr>
       <w:r>
+        <w:rPr>
+          <w:noProof/>
+        </w:rPr>
         <w:lastRenderedPageBreak/>
         <w:drawing>
           <wp:inline distT="0" distB="0" distL="0" distR="0" wp14:anchorId="61A61230" wp14:editId="21668F0B">
@@ -18055,6 +18070,9 @@
         <w:spacing w:line="360" w:lineRule="auto"/>
       </w:pPr>
       <w:r>
+        <w:rPr>
+          <w:noProof/>
+        </w:rPr>
         <w:drawing>
           <wp:inline distT="0" distB="0" distL="0" distR="0" wp14:anchorId="61C4A2C1" wp14:editId="4878A9C9">
             <wp:extent cx="5759450" cy="592572"/>
@@ -18114,6 +18132,9 @@
         <w:ind w:firstLine="720"/>
       </w:pPr>
       <w:r>
+        <w:rPr>
+          <w:noProof/>
+        </w:rPr>
         <w:drawing>
           <wp:inline distT="0" distB="0" distL="0" distR="0" wp14:anchorId="7E61B374" wp14:editId="052E7629">
             <wp:extent cx="4248743" cy="1619476"/>
@@ -18181,6 +18202,9 @@
         <w:ind w:firstLine="720"/>
       </w:pPr>
       <w:r>
+        <w:rPr>
+          <w:noProof/>
+        </w:rPr>
         <w:drawing>
           <wp:inline distT="0" distB="0" distL="0" distR="0" wp14:anchorId="7FC1771D" wp14:editId="3C03862D">
             <wp:extent cx="4172532" cy="1219370"/>
@@ -18260,6 +18284,9 @@
         <w:ind w:left="720" w:firstLine="720"/>
       </w:pPr>
       <w:r>
+        <w:rPr>
+          <w:noProof/>
+        </w:rPr>
         <w:drawing>
           <wp:inline distT="0" distB="0" distL="0" distR="0" wp14:anchorId="5FF5A3CD" wp14:editId="1D0121A9">
             <wp:extent cx="3070136" cy="4031319"/>
@@ -18317,6 +18344,9 @@
         <w:ind w:left="720" w:firstLine="720"/>
       </w:pPr>
       <w:r>
+        <w:rPr>
+          <w:noProof/>
+        </w:rPr>
         <w:drawing>
           <wp:inline distT="0" distB="0" distL="0" distR="0" wp14:anchorId="19670395" wp14:editId="64871CD9">
             <wp:extent cx="3240069" cy="2758525"/>
@@ -18374,6 +18404,9 @@
         <w:ind w:left="720" w:firstLine="720"/>
       </w:pPr>
       <w:r>
+        <w:rPr>
+          <w:noProof/>
+        </w:rPr>
         <w:lastRenderedPageBreak/>
         <w:drawing>
           <wp:inline distT="0" distB="0" distL="0" distR="0" wp14:anchorId="252146DC" wp14:editId="25251DAB">
@@ -18433,6 +18466,9 @@
         <w:ind w:left="720" w:firstLine="720"/>
       </w:pPr>
       <w:r>
+        <w:rPr>
+          <w:noProof/>
+        </w:rPr>
         <w:drawing>
           <wp:inline distT="0" distB="0" distL="0" distR="0" wp14:anchorId="155880DE" wp14:editId="2943DC07">
             <wp:extent cx="3810851" cy="4040756"/>
@@ -18490,6 +18526,9 @@
         <w:ind w:left="720" w:firstLine="720"/>
       </w:pPr>
       <w:r>
+        <w:rPr>
+          <w:noProof/>
+        </w:rPr>
         <w:lastRenderedPageBreak/>
         <w:drawing>
           <wp:inline distT="0" distB="0" distL="0" distR="0" wp14:anchorId="67FB8C41" wp14:editId="56FE5421">
@@ -18585,6 +18624,9 @@
         <w:ind w:firstLine="720"/>
       </w:pPr>
       <w:r>
+        <w:rPr>
+          <w:noProof/>
+        </w:rPr>
         <w:drawing>
           <wp:inline distT="0" distB="0" distL="0" distR="0" wp14:anchorId="28BF2947" wp14:editId="6BF5F8DB">
             <wp:extent cx="3972807" cy="3300014"/>
@@ -18669,6 +18711,9 @@
         <w:ind w:left="720" w:firstLine="720"/>
       </w:pPr>
       <w:r>
+        <w:rPr>
+          <w:noProof/>
+        </w:rPr>
         <w:drawing>
           <wp:inline distT="0" distB="0" distL="0" distR="0" wp14:anchorId="4735B2E3" wp14:editId="721C8A06">
             <wp:extent cx="3210373" cy="1609950"/>
@@ -18726,6 +18771,9 @@
         <w:ind w:firstLine="720"/>
       </w:pPr>
       <w:r>
+        <w:rPr>
+          <w:noProof/>
+        </w:rPr>
         <w:lastRenderedPageBreak/>
         <w:drawing>
           <wp:inline distT="0" distB="0" distL="0" distR="0" wp14:anchorId="61AB7466" wp14:editId="145E590A">
@@ -18795,6 +18843,9 @@
         <w:ind w:firstLine="720"/>
       </w:pPr>
       <w:r>
+        <w:rPr>
+          <w:noProof/>
+        </w:rPr>
         <w:drawing>
           <wp:inline distT="0" distB="0" distL="0" distR="0" wp14:anchorId="1582AF74" wp14:editId="4CE25238">
             <wp:extent cx="3953886" cy="3316992"/>
@@ -18875,10 +18926,13 @@
         <w:ind w:left="720" w:firstLine="720"/>
       </w:pPr>
       <w:r>
+        <w:rPr>
+          <w:noProof/>
+        </w:rPr>
         <w:drawing>
-          <wp:inline distT="0" distB="0" distL="0" distR="0" wp14:anchorId="4EF90B00" wp14:editId="1D1D5CE6">
-            <wp:extent cx="4278076" cy="5471075"/>
-            <wp:effectExtent l="0" t="0" r="8255" b="0"/>
+          <wp:inline distT="0" distB="0" distL="0" distR="0" wp14:anchorId="4EF90B00" wp14:editId="402B9788">
+            <wp:extent cx="3667125" cy="4689752"/>
+            <wp:effectExtent l="0" t="0" r="0" b="0"/>
             <wp:docPr id="118472898" name="Picture 1"/>
             <wp:cNvGraphicFramePr>
               <a:graphicFrameLocks xmlns:a="http://schemas.openxmlformats.org/drawingml/2006/main" noChangeAspect="1"/>
@@ -18899,7 +18953,7 @@
                   <pic:spPr>
                     <a:xfrm>
                       <a:off x="0" y="0"/>
-                      <a:ext cx="4280748" cy="5474492"/>
+                      <a:ext cx="3673099" cy="4697391"/>
                     </a:xfrm>
                     <a:prstGeom prst="rect">
                       <a:avLst/>
@@ -18925,27 +18979,26 @@
         <w:t>Fig 2.47</w:t>
       </w:r>
       <w:r>
-        <w:t xml:space="preserve"> All chat messages from a particular chat successfully retrieved after log-in and supplying recipient id as URL parameter. Selectivity is guaranteed from the combination of participants’ user ids.</w:t>
-      </w:r>
-    </w:p>
-    <w:p/>
-    <w:p/>
-    <w:p/>
-    <w:p/>
-    <w:p/>
-    <w:p/>
-    <w:p/>
-    <w:p/>
-    <w:p/>
-    <w:p/>
+        <w:t xml:space="preserve"> </w:t>
+      </w:r>
+      <w:r>
+        <w:rPr>
+          <w:sz w:val="20"/>
+          <w:szCs w:val="20"/>
+        </w:rPr>
+        <w:t>All chat messages from a particular chat successfully retrieved after log-in and supplying recipient id as URL parameter. Selectivity is guaranteed from the combination of participants’ user ids.</w:t>
+      </w:r>
+    </w:p>
     <w:p>
       <w:pPr>
         <w:ind w:left="720" w:firstLine="720"/>
       </w:pPr>
       <w:r>
-        <w:lastRenderedPageBreak/>
+        <w:rPr>
+          <w:noProof/>
+        </w:rPr>
         <w:drawing>
-          <wp:inline distT="0" distB="0" distL="0" distR="0" wp14:anchorId="350FFFE9" wp14:editId="2295741E">
+          <wp:inline distT="0" distB="0" distL="0" distR="0" wp14:anchorId="74A850E9" wp14:editId="7834ED48">
             <wp:extent cx="4148886" cy="3463481"/>
             <wp:effectExtent l="0" t="0" r="4445" b="3810"/>
             <wp:docPr id="946572808" name="Picture 1"/>
@@ -18993,7 +19046,7 @@
         <w:t>Fig 2.48</w:t>
       </w:r>
       <w:r>
-        <w:t xml:space="preserve"> Authenticated request to the same endpoint</w:t>
+        <w:t xml:space="preserve"> Unauthenticated request to the same endpoint</w:t>
       </w:r>
     </w:p>
     <w:p>
@@ -19002,6 +19055,10 @@
         <w:jc w:val="center"/>
       </w:pPr>
       <w:r>
+        <w:rPr>
+          <w:noProof/>
+        </w:rPr>
+        <w:lastRenderedPageBreak/>
         <w:drawing>
           <wp:inline distT="0" distB="0" distL="0" distR="0" wp14:anchorId="0AD382A3" wp14:editId="17A08956">
             <wp:extent cx="4296148" cy="3458233"/>
@@ -19063,62 +19120,20 @@
     </w:p>
     <w:p>
       <w:pPr>
-        <w:rPr>
-          <w:b/>
-          <w:bCs/>
-        </w:rPr>
-      </w:pPr>
-    </w:p>
-    <w:p>
-      <w:pPr>
-        <w:rPr>
-          <w:b/>
-          <w:bCs/>
-        </w:rPr>
-      </w:pPr>
-    </w:p>
-    <w:p>
-      <w:pPr>
-        <w:rPr>
-          <w:b/>
-          <w:bCs/>
-        </w:rPr>
-      </w:pPr>
-    </w:p>
-    <w:p>
-      <w:pPr>
-        <w:rPr>
-          <w:b/>
-          <w:bCs/>
-        </w:rPr>
-      </w:pPr>
-    </w:p>
-    <w:p>
-      <w:pPr>
-        <w:rPr>
-          <w:b/>
-          <w:bCs/>
-        </w:rPr>
-      </w:pPr>
-    </w:p>
-    <w:p>
-      <w:pPr>
-        <w:rPr>
-          <w:b/>
-          <w:bCs/>
-        </w:rPr>
-      </w:pPr>
-    </w:p>
-    <w:p>
-      <w:pPr>
-        <w:ind w:left="1440"/>
-      </w:pPr>
-      <w:r>
-        <w:lastRenderedPageBreak/>
+        <w:ind w:left="720" w:firstLine="720"/>
+        <w:rPr>
+          <w:b/>
+          <w:bCs/>
+        </w:rPr>
+      </w:pPr>
+      <w:r>
+        <w:rPr>
+          <w:noProof/>
+        </w:rPr>
         <w:drawing>
-          <wp:inline distT="0" distB="0" distL="0" distR="0" wp14:anchorId="5916F48F" wp14:editId="28EA8783">
-            <wp:extent cx="3948778" cy="3653340"/>
-            <wp:effectExtent l="0" t="0" r="0" b="4445"/>
+          <wp:inline distT="0" distB="0" distL="0" distR="0" wp14:anchorId="6A4A86C1" wp14:editId="5603A4D7">
+            <wp:extent cx="4333875" cy="4009625"/>
+            <wp:effectExtent l="0" t="0" r="0" b="0"/>
             <wp:docPr id="458981228" name="Picture 1"/>
             <wp:cNvGraphicFramePr>
               <a:graphicFrameLocks xmlns:a="http://schemas.openxmlformats.org/drawingml/2006/main" noChangeAspect="1"/>
@@ -19139,7 +19154,7 @@
                   <pic:spPr>
                     <a:xfrm>
                       <a:off x="0" y="0"/>
-                      <a:ext cx="3953099" cy="3657338"/>
+                      <a:ext cx="4343915" cy="4018914"/>
                     </a:xfrm>
                     <a:prstGeom prst="rect">
                       <a:avLst/>
@@ -19166,11 +19181,212 @@
       <w:r>
         <w:t xml:space="preserve"> Unauthenticated request to the same </w:t>
       </w:r>
-      <w:proofErr w:type="spellStart"/>
-      <w:r>
-        <w:t>enpoint</w:t>
-      </w:r>
-      <w:proofErr w:type="spellEnd"/>
+      <w:r>
+        <w:t>endpoint</w:t>
+      </w:r>
+    </w:p>
+    <w:p>
+      <w:pPr>
+        <w:ind w:left="1440" w:firstLine="720"/>
+      </w:pPr>
+    </w:p>
+    <w:p>
+      <w:pPr>
+        <w:ind w:left="1440" w:firstLine="720"/>
+      </w:pPr>
+    </w:p>
+    <w:p>
+      <w:pPr>
+        <w:ind w:left="1440" w:firstLine="720"/>
+      </w:pPr>
+    </w:p>
+    <w:p>
+      <w:pPr>
+        <w:ind w:left="1440" w:firstLine="720"/>
+      </w:pPr>
+    </w:p>
+    <w:p>
+      <w:r>
+        <w:lastRenderedPageBreak/>
+        <w:drawing>
+          <wp:inline distT="0" distB="0" distL="0" distR="0" wp14:anchorId="158220FA" wp14:editId="1EB1895F">
+            <wp:extent cx="5759450" cy="723265"/>
+            <wp:effectExtent l="0" t="0" r="0" b="635"/>
+            <wp:docPr id="996392053" name="Picture 1"/>
+            <wp:cNvGraphicFramePr>
+              <a:graphicFrameLocks xmlns:a="http://schemas.openxmlformats.org/drawingml/2006/main" noChangeAspect="1"/>
+            </wp:cNvGraphicFramePr>
+            <a:graphic xmlns:a="http://schemas.openxmlformats.org/drawingml/2006/main">
+              <a:graphicData uri="http://schemas.openxmlformats.org/drawingml/2006/picture">
+                <pic:pic xmlns:pic="http://schemas.openxmlformats.org/drawingml/2006/picture">
+                  <pic:nvPicPr>
+                    <pic:cNvPr id="996392053" name=""/>
+                    <pic:cNvPicPr/>
+                  </pic:nvPicPr>
+                  <pic:blipFill>
+                    <a:blip r:embed="rId83"/>
+                    <a:stretch>
+                      <a:fillRect/>
+                    </a:stretch>
+                  </pic:blipFill>
+                  <pic:spPr>
+                    <a:xfrm>
+                      <a:off x="0" y="0"/>
+                      <a:ext cx="5759450" cy="723265"/>
+                    </a:xfrm>
+                    <a:prstGeom prst="rect">
+                      <a:avLst/>
+                    </a:prstGeom>
+                  </pic:spPr>
+                </pic:pic>
+              </a:graphicData>
+            </a:graphic>
+          </wp:inline>
+        </w:drawing>
+      </w:r>
+    </w:p>
+    <w:p>
+      <w:pPr>
+        <w:jc w:val="center"/>
+      </w:pPr>
+      <w:r>
+        <w:rPr>
+          <w:b/>
+          <w:bCs/>
+        </w:rPr>
+        <w:t xml:space="preserve">Fig 2.51 </w:t>
+      </w:r>
+      <w:r>
+        <w:t xml:space="preserve">Record of the chat’s messages in the </w:t>
+      </w:r>
+      <w:proofErr w:type="spellStart"/>
+      <w:r>
+        <w:rPr>
+          <w:b/>
+          <w:bCs/>
+        </w:rPr>
+        <w:t>chat_messages</w:t>
+      </w:r>
+      <w:proofErr w:type="spellEnd"/>
+      <w:r>
+        <w:t xml:space="preserve"> database</w:t>
+      </w:r>
+      <w:r>
+        <w:t>. These are stored via socket.io middleware</w:t>
+      </w:r>
+    </w:p>
+    <w:p>
+      <w:pPr>
+        <w:ind w:left="720" w:firstLine="720"/>
+      </w:pPr>
+    </w:p>
+    <w:p>
+      <w:r>
+        <w:drawing>
+          <wp:inline distT="0" distB="0" distL="0" distR="0" wp14:anchorId="5C4DE867" wp14:editId="1018CD12">
+            <wp:extent cx="5759450" cy="528320"/>
+            <wp:effectExtent l="0" t="0" r="0" b="5080"/>
+            <wp:docPr id="221418581" name="Picture 1"/>
+            <wp:cNvGraphicFramePr>
+              <a:graphicFrameLocks xmlns:a="http://schemas.openxmlformats.org/drawingml/2006/main" noChangeAspect="1"/>
+            </wp:cNvGraphicFramePr>
+            <a:graphic xmlns:a="http://schemas.openxmlformats.org/drawingml/2006/main">
+              <a:graphicData uri="http://schemas.openxmlformats.org/drawingml/2006/picture">
+                <pic:pic xmlns:pic="http://schemas.openxmlformats.org/drawingml/2006/picture">
+                  <pic:nvPicPr>
+                    <pic:cNvPr id="221418581" name=""/>
+                    <pic:cNvPicPr/>
+                  </pic:nvPicPr>
+                  <pic:blipFill>
+                    <a:blip r:embed="rId84"/>
+                    <a:stretch>
+                      <a:fillRect/>
+                    </a:stretch>
+                  </pic:blipFill>
+                  <pic:spPr>
+                    <a:xfrm>
+                      <a:off x="0" y="0"/>
+                      <a:ext cx="5759450" cy="528320"/>
+                    </a:xfrm>
+                    <a:prstGeom prst="rect">
+                      <a:avLst/>
+                    </a:prstGeom>
+                  </pic:spPr>
+                </pic:pic>
+              </a:graphicData>
+            </a:graphic>
+          </wp:inline>
+        </w:drawing>
+      </w:r>
+    </w:p>
+    <w:p>
+      <w:pPr>
+        <w:jc w:val="center"/>
+      </w:pPr>
+      <w:r>
+        <w:rPr>
+          <w:b/>
+          <w:bCs/>
+        </w:rPr>
+        <w:t>Fig 2.52</w:t>
+      </w:r>
+      <w:r>
+        <w:t xml:space="preserve"> </w:t>
+      </w:r>
+      <w:proofErr w:type="spellStart"/>
+      <w:r>
+        <w:rPr>
+          <w:b/>
+          <w:bCs/>
+        </w:rPr>
+        <w:t>chat_rooms</w:t>
+      </w:r>
+      <w:proofErr w:type="spellEnd"/>
+      <w:r>
+        <w:t xml:space="preserve"> table recording the </w:t>
+      </w:r>
+      <w:proofErr w:type="spellStart"/>
+      <w:r>
+        <w:t>message_id</w:t>
+      </w:r>
+      <w:proofErr w:type="spellEnd"/>
+      <w:r>
+        <w:t xml:space="preserve"> of the latest message in the chat; this is used </w:t>
+      </w:r>
+      <w:r>
+        <w:t xml:space="preserve">to populate the </w:t>
+      </w:r>
+      <w:proofErr w:type="spellStart"/>
+      <w:r>
+        <w:rPr>
+          <w:b/>
+          <w:bCs/>
+        </w:rPr>
+        <w:t>InboxItem</w:t>
+      </w:r>
+      <w:proofErr w:type="spellEnd"/>
+      <w:r>
+        <w:rPr>
+          <w:b/>
+          <w:bCs/>
+        </w:rPr>
+        <w:t xml:space="preserve"> </w:t>
+      </w:r>
+      <w:r>
+        <w:t xml:space="preserve">component in the </w:t>
+      </w:r>
+      <w:proofErr w:type="spellStart"/>
+      <w:r>
+        <w:rPr>
+          <w:b/>
+          <w:bCs/>
+        </w:rPr>
+        <w:t>MessagesDrawer</w:t>
+      </w:r>
+      <w:proofErr w:type="spellEnd"/>
+      <w:r>
+        <w:t xml:space="preserve"> component.</w:t>
+      </w:r>
     </w:p>
     <w:p>
       <w:pPr>

</xml_diff>

<commit_message>
attempting to add tutor dashboard
add tutor dashbaord post-login.

Added some coee and selctive component rendering to the <Home> component. Currently building a  <TutorHomeSection> component that allows user to amend some of their dtails.
</commit_message>
<xml_diff>
--- a/docs/dissertation start.docx
+++ b/docs/dissertation start.docx
@@ -10472,9 +10472,7 @@
       <w:r>
         <w:rPr>
           <w:rStyle w:val="Heading4Char"/>
-          <w:i w:val="0"/>
           <w:iCs w:val="0"/>
-          <w:color w:val="215E99" w:themeColor="text2" w:themeTint="BF"/>
         </w:rPr>
         <w:lastRenderedPageBreak/>
         <w:t xml:space="preserve">3.2.5 </w:t>
@@ -10482,9 +10480,7 @@
       <w:r>
         <w:rPr>
           <w:rStyle w:val="Heading4Char"/>
-          <w:i w:val="0"/>
           <w:iCs w:val="0"/>
-          <w:color w:val="215E99" w:themeColor="text2" w:themeTint="BF"/>
         </w:rPr>
         <w:t>Real-time messaging</w:t>
       </w:r>
@@ -12145,7 +12141,13 @@
         <w:t xml:space="preserve"> </w:t>
       </w:r>
       <w:r>
-        <w:t xml:space="preserve">highest risk: </w:t>
+        <w:t>highest risk</w:t>
+      </w:r>
+      <w:r>
+        <w:t>; these are</w:t>
+      </w:r>
+      <w:r>
+        <w:t xml:space="preserve"> </w:t>
       </w:r>
       <w:r>
         <w:t xml:space="preserve">student and tutor registration, </w:t>
@@ -12160,7 +12162,7 @@
         <w:t xml:space="preserve"> layered,</w:t>
       </w:r>
       <w:r>
-        <w:t xml:space="preserve"> three-pronged approach was undertaken and consisted of </w:t>
+        <w:t xml:space="preserve"> three-pronged approach was taken and consisted of </w:t>
       </w:r>
       <w:r>
         <w:rPr>
@@ -12452,6 +12454,21 @@
       <w:r>
         <w:t>with missing data to confirm that the correct error messages would display. Login with correct user data was then carried out successfully.</w:t>
       </w:r>
+      <w:r>
+        <w:t xml:space="preserve"> This was confirmed with the change in rendering of the </w:t>
+      </w:r>
+      <w:proofErr w:type="spellStart"/>
+      <w:r>
+        <w:rPr>
+          <w:b/>
+          <w:bCs/>
+        </w:rPr>
+        <w:t>NavBar</w:t>
+      </w:r>
+      <w:proofErr w:type="spellEnd"/>
+      <w:r>
+        <w:t xml:space="preserve"> component as well as the basic welcome message displayed on screen in the home page.</w:t>
+      </w:r>
     </w:p>
     <w:p>
       <w:pPr>
@@ -12508,6 +12525,7 @@
         <w:spacing w:line="360" w:lineRule="auto"/>
       </w:pPr>
       <w:r>
+        <w:lastRenderedPageBreak/>
         <w:t>When re-registration</w:t>
       </w:r>
       <w:r>
@@ -12544,110 +12562,446 @@
         <w:spacing w:line="360" w:lineRule="auto"/>
       </w:pPr>
       <w:r>
+        <w:t xml:space="preserve">Login attempts with </w:t>
+      </w:r>
+      <w:r>
+        <w:t>vali</w:t>
+      </w:r>
+      <w:r>
+        <w:t>d</w:t>
+      </w:r>
+      <w:r>
+        <w:t xml:space="preserve"> </w:t>
+      </w:r>
+      <w:r>
+        <w:t>credentials</w:t>
+      </w:r>
+      <w:r>
+        <w:t xml:space="preserve"> returned </w:t>
+      </w:r>
+      <w:r>
+        <w:rPr>
+          <w:b/>
+          <w:bCs/>
+        </w:rPr>
+        <w:t>200</w:t>
+      </w:r>
+      <w:r>
+        <w:t xml:space="preserve"> HTTP response, the </w:t>
+      </w:r>
+      <w:r>
+        <w:rPr>
+          <w:b/>
+          <w:bCs/>
+        </w:rPr>
+        <w:t>user</w:t>
+      </w:r>
+      <w:r>
+        <w:t xml:space="preserve"> object, and an HTTP-only cookie with a signed </w:t>
+      </w:r>
+      <w:r>
+        <w:rPr>
+          <w:b/>
+          <w:bCs/>
+        </w:rPr>
+        <w:t>JWT</w:t>
+      </w:r>
+      <w:r>
+        <w:t xml:space="preserve"> payload. Login attempts with either </w:t>
+      </w:r>
+      <w:r>
+        <w:t>an</w:t>
+      </w:r>
+      <w:r>
+        <w:t xml:space="preserve"> incorrect email or password returned </w:t>
+      </w:r>
+      <w:r>
+        <w:rPr>
+          <w:b/>
+          <w:bCs/>
+        </w:rPr>
+        <w:t>401</w:t>
+      </w:r>
+      <w:r>
+        <w:t xml:space="preserve"> HTTP response and </w:t>
+      </w:r>
+      <w:r>
+        <w:t xml:space="preserve">the deliberately non-specific </w:t>
+      </w:r>
+      <w:r>
+        <w:t>error message</w:t>
+      </w:r>
+      <w:r>
+        <w:t xml:space="preserve"> of ‘invalid </w:t>
+      </w:r>
+      <w:proofErr w:type="gramStart"/>
+      <w:r>
+        <w:t>credentials’</w:t>
+      </w:r>
+      <w:proofErr w:type="gramEnd"/>
+      <w:r>
+        <w:t>.</w:t>
+      </w:r>
+    </w:p>
+    <w:p>
+      <w:pPr>
+        <w:spacing w:line="360" w:lineRule="auto"/>
+      </w:pPr>
+      <w:r>
+        <w:t xml:space="preserve">A GET request to the logout endpoint returned the </w:t>
+      </w:r>
+      <w:r>
+        <w:t>expected</w:t>
+      </w:r>
+      <w:r>
+        <w:t xml:space="preserve"> HTTP response and cleared the cookie</w:t>
+      </w:r>
+      <w:r>
+        <w:t xml:space="preserve">. Cookie clearance was </w:t>
+      </w:r>
+      <w:r>
+        <w:t xml:space="preserve">confirmed separately by </w:t>
+      </w:r>
+      <w:r>
+        <w:t>GET request to</w:t>
+      </w:r>
+      <w:r>
+        <w:t xml:space="preserve"> a</w:t>
+      </w:r>
+      <w:r>
+        <w:t xml:space="preserve"> protected route which returned</w:t>
+      </w:r>
+      <w:r>
+        <w:t xml:space="preserve"> the</w:t>
+      </w:r>
+      <w:r>
+        <w:t xml:space="preserve"> message for </w:t>
+      </w:r>
+      <w:r>
+        <w:t xml:space="preserve">an </w:t>
+      </w:r>
+      <w:r>
+        <w:t>unauthorised user.</w:t>
+      </w:r>
+    </w:p>
+    <w:p>
+      <w:pPr>
+        <w:pStyle w:val="Heading2"/>
+        <w:spacing w:line="360" w:lineRule="auto"/>
+      </w:pPr>
+      <w:bookmarkStart w:id="38" w:name="_Toc225105234"/>
+      <w:r>
+        <w:t>4.3 Lesson booking testing</w:t>
+      </w:r>
+      <w:bookmarkEnd w:id="38"/>
+    </w:p>
+    <w:p>
+      <w:r>
+        <w:t>Lesson booking</w:t>
+      </w:r>
+      <w:r>
+        <w:t xml:space="preserve"> with a tutor</w:t>
+      </w:r>
+      <w:r>
+        <w:t xml:space="preserve"> can only be carried out by a </w:t>
+      </w:r>
+      <w:r>
+        <w:t xml:space="preserve">logged-in </w:t>
+      </w:r>
+      <w:r>
+        <w:t>student user.</w:t>
+      </w:r>
+    </w:p>
+    <w:p>
+      <w:pPr>
+        <w:pStyle w:val="Heading3"/>
+        <w:spacing w:line="360" w:lineRule="auto"/>
+      </w:pPr>
+      <w:bookmarkStart w:id="39" w:name="_Toc225105235"/>
+      <w:r>
+        <w:t>4.3.1 Frontend testing</w:t>
+      </w:r>
+      <w:bookmarkEnd w:id="39"/>
+    </w:p>
+    <w:p>
+      <w:pPr>
+        <w:spacing w:line="360" w:lineRule="auto"/>
+      </w:pPr>
+      <w:r>
+        <w:t>To begin lesson booking testing, the newly registered tutor’s profile card was located on the’ Find a tutor’ page and t</w:t>
+      </w:r>
+      <w:r>
+        <w:t xml:space="preserve">he card was clicked to navigate to the </w:t>
+      </w:r>
+      <w:proofErr w:type="spellStart"/>
+      <w:r>
+        <w:rPr>
+          <w:b/>
+          <w:bCs/>
+        </w:rPr>
+        <w:t>TutorProfilePage</w:t>
+      </w:r>
+      <w:proofErr w:type="spellEnd"/>
+      <w:r>
+        <w:t xml:space="preserve"> component</w:t>
+      </w:r>
+      <w:r>
+        <w:t xml:space="preserve">. When rendered, </w:t>
+      </w:r>
+      <w:proofErr w:type="gramStart"/>
+      <w:r>
+        <w:t xml:space="preserve">it </w:t>
+      </w:r>
+      <w:r>
+        <w:t xml:space="preserve"> was</w:t>
+      </w:r>
+      <w:proofErr w:type="gramEnd"/>
+      <w:r>
+        <w:t xml:space="preserve"> populated with the test tutor’s details fetched from the backend; the information corresponded exactly to the information entered in the tutor registration form. </w:t>
+      </w:r>
+    </w:p>
+    <w:p>
+      <w:pPr>
+        <w:spacing w:line="360" w:lineRule="auto"/>
+      </w:pPr>
+      <w:r>
+        <w:t xml:space="preserve">To test the requirements that a user could not message </w:t>
+      </w:r>
+      <w:r>
+        <w:t xml:space="preserve">or book lessons with </w:t>
+      </w:r>
+      <w:r>
+        <w:t xml:space="preserve">a tutor unless logged in as a student, the </w:t>
+      </w:r>
+      <w:proofErr w:type="spellStart"/>
+      <w:r>
+        <w:rPr>
+          <w:b/>
+          <w:bCs/>
+        </w:rPr>
+        <w:t>TutorProfilePage</w:t>
+      </w:r>
+      <w:proofErr w:type="spellEnd"/>
+      <w:r>
+        <w:t xml:space="preserve"> was viewed in three states: pre-login, when logged in as a tutor, and when logged in as a student. As required, when viewing pre-login, the user was unable to use the card’s message-tutor button and was prompted to log</w:t>
+      </w:r>
+      <w:r>
+        <w:t xml:space="preserve"> </w:t>
+      </w:r>
+      <w:r>
+        <w:t xml:space="preserve">in to book lessons. When logged in as a tutor, the user could not use the message button, and the UI displayed a message informing the user that tutors cannot book lessons with other tutors. Finally, when logged in as a student, the user could click on the message button, which opened the </w:t>
+      </w:r>
+      <w:r>
+        <w:rPr>
+          <w:b/>
+          <w:bCs/>
+        </w:rPr>
+        <w:t>ChatWindow</w:t>
+      </w:r>
+      <w:r>
+        <w:t xml:space="preserve"> component, and could open the </w:t>
+      </w:r>
+      <w:proofErr w:type="spellStart"/>
+      <w:r>
+        <w:rPr>
+          <w:b/>
+          <w:bCs/>
+        </w:rPr>
+        <w:t>BookingCalendar</w:t>
+      </w:r>
+      <w:proofErr w:type="spellEnd"/>
+      <w:r>
+        <w:t xml:space="preserve"> component to see the tutor’s availability and book lessons.</w:t>
+      </w:r>
+    </w:p>
+    <w:p>
+      <w:pPr>
+        <w:pStyle w:val="Heading3"/>
+        <w:spacing w:line="360" w:lineRule="auto"/>
+      </w:pPr>
+      <w:bookmarkStart w:id="40" w:name="_Toc225105236"/>
+      <w:r>
+        <w:t>4.3.2 Manual end-to-end testing</w:t>
+      </w:r>
+      <w:bookmarkEnd w:id="40"/>
+    </w:p>
+    <w:p>
+      <w:pPr>
+        <w:spacing w:line="360" w:lineRule="auto"/>
+      </w:pPr>
+      <w:r>
+        <w:t>Testing was carried out to ensure that a student could successfully book a lesson with the selected tutor and that, once booked, the details could be viewed in the lesson details section. Separately, the database</w:t>
+      </w:r>
+      <w:r>
+        <w:t xml:space="preserve">’s </w:t>
+      </w:r>
+      <w:r>
+        <w:rPr>
+          <w:b/>
+          <w:bCs/>
+        </w:rPr>
+        <w:t>bookings</w:t>
+      </w:r>
+      <w:r>
+        <w:rPr>
+          <w:b/>
+          <w:bCs/>
+        </w:rPr>
+        <w:t xml:space="preserve"> </w:t>
+      </w:r>
+      <w:r>
+        <w:t xml:space="preserve">table </w:t>
+      </w:r>
+      <w:r>
+        <w:t>was</w:t>
+      </w:r>
+      <w:r>
+        <w:t xml:space="preserve"> queried to verify that the lesson was saved correctly.</w:t>
+      </w:r>
+      <w:r>
+        <w:t xml:space="preserve"> The robustness of the </w:t>
+      </w:r>
+      <w:proofErr w:type="spellStart"/>
+      <w:r>
+        <w:rPr>
+          <w:b/>
+          <w:bCs/>
+        </w:rPr>
+        <w:t>BookingCalendar</w:t>
+      </w:r>
+      <w:proofErr w:type="spellEnd"/>
+      <w:r>
+        <w:t xml:space="preserve"> component’s logic was tested by attempting to book an unavailable slot, to double-book a lesson, and to book a lesson without selecting all the required fields.</w:t>
+      </w:r>
+      <w:r>
+        <w:t xml:space="preserve"> The component correctly prevented booking</w:t>
+      </w:r>
+      <w:r>
+        <w:t xml:space="preserve"> in all</w:t>
+      </w:r>
+      <w:r>
+        <w:t xml:space="preserve"> invalid</w:t>
+      </w:r>
+      <w:r>
+        <w:t xml:space="preserve"> cases</w:t>
+      </w:r>
+      <w:r>
+        <w:t>.</w:t>
+      </w:r>
+    </w:p>
+    <w:p>
+      <w:pPr>
+        <w:pStyle w:val="Heading3"/>
+        <w:spacing w:line="360" w:lineRule="auto"/>
+      </w:pPr>
+      <w:bookmarkStart w:id="41" w:name="_Toc225105237"/>
+      <w:r>
+        <w:t>4.3.3 API testing</w:t>
+      </w:r>
+      <w:bookmarkEnd w:id="41"/>
+    </w:p>
+    <w:p>
+      <w:pPr>
+        <w:spacing w:line="360" w:lineRule="auto"/>
+      </w:pPr>
+      <w:r>
+        <w:t xml:space="preserve">The lesson booking endpoint was tested with valid and invalid data. </w:t>
+      </w:r>
+      <w:r>
+        <w:t>When</w:t>
+      </w:r>
+      <w:r>
+        <w:t xml:space="preserve"> valid data</w:t>
+      </w:r>
+      <w:r>
+        <w:t xml:space="preserve"> was submitted</w:t>
+      </w:r>
+      <w:r>
+        <w:t xml:space="preserve">, the lesson was </w:t>
+      </w:r>
+      <w:r>
+        <w:t>created successfully</w:t>
+      </w:r>
+      <w:r>
+        <w:t xml:space="preserve"> and the </w:t>
+      </w:r>
+      <w:r>
+        <w:t>API returned</w:t>
+      </w:r>
+      <w:r>
+        <w:t xml:space="preserve"> HTTP 201 response</w:t>
+      </w:r>
+      <w:r>
+        <w:t xml:space="preserve"> and a booking confirmation object</w:t>
+      </w:r>
+      <w:r>
+        <w:t xml:space="preserve">. When an invalid tutor or student id </w:t>
+      </w:r>
+      <w:r>
+        <w:t>was</w:t>
+      </w:r>
+      <w:r>
+        <w:t xml:space="preserve"> submitted, the booking was refused. </w:t>
+      </w:r>
+    </w:p>
+    <w:p>
+      <w:pPr>
+        <w:spacing w:line="360" w:lineRule="auto"/>
+      </w:pPr>
+      <w:r>
         <w:lastRenderedPageBreak/>
-        <w:t xml:space="preserve">Login attempts with </w:t>
-      </w:r>
-      <w:r>
-        <w:t>vali</w:t>
-      </w:r>
-      <w:r>
-        <w:t>d</w:t>
+        <w:t>An attempt to create a lesson that overlapped another lesson</w:t>
+      </w:r>
+      <w:r>
+        <w:t xml:space="preserve"> was </w:t>
+      </w:r>
+      <w:r>
+        <w:t>rejected</w:t>
+      </w:r>
+      <w:r>
+        <w:t xml:space="preserve">. </w:t>
+      </w:r>
+      <w:r>
+        <w:t>Similarly, w</w:t>
+      </w:r>
+      <w:r>
+        <w:t xml:space="preserve">hen a past-tense booking was attempted, it was </w:t>
+      </w:r>
+      <w:r>
+        <w:t>rejected</w:t>
+      </w:r>
+      <w:r>
+        <w:t>.</w:t>
       </w:r>
       <w:r>
         <w:t xml:space="preserve"> </w:t>
       </w:r>
       <w:r>
-        <w:t>credentials</w:t>
-      </w:r>
-      <w:r>
-        <w:t xml:space="preserve"> returned </w:t>
-      </w:r>
-      <w:r>
-        <w:rPr>
-          <w:b/>
-          <w:bCs/>
-        </w:rPr>
-        <w:t>200</w:t>
-      </w:r>
-      <w:r>
-        <w:t xml:space="preserve"> HTTP response, the </w:t>
-      </w:r>
-      <w:r>
-        <w:rPr>
-          <w:b/>
-          <w:bCs/>
-        </w:rPr>
-        <w:t>user</w:t>
-      </w:r>
-      <w:r>
-        <w:t xml:space="preserve"> object, and an HTTP-only cookie with a signed </w:t>
-      </w:r>
-      <w:r>
-        <w:rPr>
-          <w:b/>
-          <w:bCs/>
-        </w:rPr>
-        <w:t>JWT</w:t>
-      </w:r>
-      <w:r>
-        <w:t xml:space="preserve"> payload. Login attempts with either </w:t>
-      </w:r>
-      <w:r>
-        <w:t>an</w:t>
-      </w:r>
-      <w:r>
-        <w:t xml:space="preserve"> incorrect email or password returned </w:t>
-      </w:r>
-      <w:r>
-        <w:rPr>
-          <w:b/>
-          <w:bCs/>
-        </w:rPr>
-        <w:t>401</w:t>
-      </w:r>
-      <w:r>
-        <w:t xml:space="preserve"> HTTP response and error message.</w:t>
-      </w:r>
-    </w:p>
-    <w:p>
-      <w:pPr>
-        <w:spacing w:line="360" w:lineRule="auto"/>
-      </w:pPr>
-      <w:r>
-        <w:t xml:space="preserve">A GET request to the logout endpoint returned the </w:t>
-      </w:r>
-      <w:r>
-        <w:t>expected</w:t>
-      </w:r>
-      <w:r>
-        <w:t xml:space="preserve"> HTTP response and cleared the cookie</w:t>
-      </w:r>
-      <w:r>
-        <w:t xml:space="preserve">. Cookie clearance was </w:t>
-      </w:r>
-      <w:r>
-        <w:t xml:space="preserve">confirmed separately by </w:t>
-      </w:r>
-      <w:r>
-        <w:t>GET request to</w:t>
-      </w:r>
-      <w:r>
-        <w:t xml:space="preserve"> a</w:t>
-      </w:r>
-      <w:r>
-        <w:t xml:space="preserve"> protected route which returned</w:t>
-      </w:r>
-      <w:r>
-        <w:t xml:space="preserve"> the</w:t>
-      </w:r>
-      <w:r>
-        <w:t xml:space="preserve"> message for </w:t>
-      </w:r>
-      <w:r>
-        <w:t xml:space="preserve">an </w:t>
-      </w:r>
-      <w:r>
-        <w:t>unauthorised user.</w:t>
+        <w:t>Finally, w</w:t>
+      </w:r>
+      <w:r>
+        <w:t xml:space="preserve">hen an attempt was made to cancel a booking that started within 24 hours, it was </w:t>
+      </w:r>
+      <w:r>
+        <w:t>rejected</w:t>
+      </w:r>
+      <w:r>
+        <w:t xml:space="preserve">. </w:t>
+      </w:r>
+      <w:r>
+        <w:t xml:space="preserve">Although there </w:t>
+      </w:r>
+      <w:r>
+        <w:t>is more business logic in backend booking</w:t>
+      </w:r>
+      <w:r>
+        <w:t xml:space="preserve"> handler</w:t>
+      </w:r>
+      <w:r>
+        <w:t xml:space="preserve"> that can be tested, these cases were judged to be the most important</w:t>
+      </w:r>
+      <w:r>
+        <w:t>.</w:t>
       </w:r>
     </w:p>
     <w:p>
@@ -12655,315 +13009,22 @@
         <w:pStyle w:val="Heading2"/>
         <w:spacing w:line="360" w:lineRule="auto"/>
       </w:pPr>
-      <w:bookmarkStart w:id="38" w:name="_Toc225105234"/>
-      <w:r>
-        <w:t>4.3 Lesson booking testing</w:t>
-      </w:r>
-      <w:bookmarkEnd w:id="38"/>
-    </w:p>
-    <w:p>
-      <w:r>
-        <w:t>Lesson booking</w:t>
-      </w:r>
-      <w:r>
-        <w:t xml:space="preserve"> with a tutor</w:t>
-      </w:r>
-      <w:r>
-        <w:t xml:space="preserve"> can only be carried out by a </w:t>
-      </w:r>
-      <w:r>
-        <w:t xml:space="preserve">logged-in </w:t>
-      </w:r>
-      <w:r>
-        <w:t>student user.</w:t>
-      </w:r>
-    </w:p>
-    <w:p>
-      <w:pPr>
-        <w:pStyle w:val="Heading3"/>
-        <w:spacing w:line="360" w:lineRule="auto"/>
-      </w:pPr>
-      <w:bookmarkStart w:id="39" w:name="_Toc225105235"/>
-      <w:r>
-        <w:t>4.3.1 Frontend testing</w:t>
-      </w:r>
-      <w:bookmarkEnd w:id="39"/>
-    </w:p>
-    <w:p>
-      <w:pPr>
-        <w:spacing w:line="360" w:lineRule="auto"/>
-      </w:pPr>
-      <w:r>
-        <w:t>To begin lesson booking testing, the newly registered tutor’s profile card was located on the’ Find a tutor’ page and t</w:t>
-      </w:r>
-      <w:r>
-        <w:t xml:space="preserve">he card was clicked to navigate to the </w:t>
-      </w:r>
-      <w:proofErr w:type="spellStart"/>
-      <w:r>
-        <w:rPr>
-          <w:b/>
-          <w:bCs/>
-        </w:rPr>
-        <w:t>TutorProfilePage</w:t>
-      </w:r>
-      <w:proofErr w:type="spellEnd"/>
-      <w:r>
-        <w:t xml:space="preserve"> component which was populated with the test tutor’s details fetched from the backend; the information corresponded exactly to the information entered in the tutor registration form. </w:t>
-      </w:r>
-    </w:p>
-    <w:p>
-      <w:pPr>
-        <w:spacing w:line="360" w:lineRule="auto"/>
-      </w:pPr>
-      <w:r>
-        <w:t xml:space="preserve">To test the requirements that a user could not message </w:t>
-      </w:r>
-      <w:r>
-        <w:t xml:space="preserve">or book lessons with </w:t>
-      </w:r>
-      <w:r>
-        <w:t xml:space="preserve">a tutor unless logged in as a student, the </w:t>
-      </w:r>
-      <w:proofErr w:type="spellStart"/>
-      <w:r>
-        <w:rPr>
-          <w:b/>
-          <w:bCs/>
-        </w:rPr>
-        <w:t>TutorProfilePage</w:t>
-      </w:r>
-      <w:proofErr w:type="spellEnd"/>
-      <w:r>
-        <w:t xml:space="preserve"> was viewed in three states: pre-login, when logged in as a tutor, and when logged in as a student. As required, when viewing pre-login, the user was unable to use the card’s message-tutor button and was prompted to log</w:t>
+      <w:bookmarkStart w:id="42" w:name="_Toc225105238"/>
+      <w:r>
+        <w:t>4.4 Real-time webchat testing</w:t>
+      </w:r>
+      <w:bookmarkEnd w:id="42"/>
+    </w:p>
+    <w:p>
+      <w:pPr>
+        <w:spacing w:line="360" w:lineRule="auto"/>
+      </w:pPr>
+      <w:r>
+        <w:t>Real-time webchat/messaging is a crucial piece of app functionality and was prioritised for testing.</w:t>
       </w:r>
       <w:r>
         <w:t xml:space="preserve"> </w:t>
       </w:r>
-      <w:r>
-        <w:t xml:space="preserve">in to book lessons. When logged in as a tutor, the user could not use the message button, and the UI displayed a message informing the user that tutors cannot book lessons with other tutors. Finally, when logged in as a student, the user could click on the message button, which opened the </w:t>
-      </w:r>
-      <w:r>
-        <w:rPr>
-          <w:b/>
-          <w:bCs/>
-        </w:rPr>
-        <w:t>ChatWindow</w:t>
-      </w:r>
-      <w:r>
-        <w:t xml:space="preserve"> component, and could open the </w:t>
-      </w:r>
-      <w:proofErr w:type="spellStart"/>
-      <w:r>
-        <w:rPr>
-          <w:b/>
-          <w:bCs/>
-        </w:rPr>
-        <w:t>BookingCalendar</w:t>
-      </w:r>
-      <w:proofErr w:type="spellEnd"/>
-      <w:r>
-        <w:t xml:space="preserve"> component to see the tutor’s availability and book lessons.</w:t>
-      </w:r>
-    </w:p>
-    <w:p>
-      <w:pPr>
-        <w:pStyle w:val="Heading3"/>
-        <w:spacing w:line="360" w:lineRule="auto"/>
-      </w:pPr>
-      <w:bookmarkStart w:id="40" w:name="_Toc225105236"/>
-      <w:r>
-        <w:t>4.3.2 Manual end-to-end testing</w:t>
-      </w:r>
-      <w:bookmarkEnd w:id="40"/>
-    </w:p>
-    <w:p>
-      <w:pPr>
-        <w:spacing w:line="360" w:lineRule="auto"/>
-      </w:pPr>
-      <w:r>
-        <w:t>Testing was carried out to ensure that a student could successfully book a lesson with the selected tutor and that, once booked, the details could be viewed in the lesson details section. Separately, the database</w:t>
-      </w:r>
-      <w:r>
-        <w:t xml:space="preserve">’s </w:t>
-      </w:r>
-      <w:r>
-        <w:rPr>
-          <w:b/>
-          <w:bCs/>
-        </w:rPr>
-        <w:t>bookings</w:t>
-      </w:r>
-      <w:r>
-        <w:rPr>
-          <w:b/>
-          <w:bCs/>
-        </w:rPr>
-        <w:t xml:space="preserve"> </w:t>
-      </w:r>
-      <w:r>
-        <w:t xml:space="preserve">table </w:t>
-      </w:r>
-      <w:r>
-        <w:t>was</w:t>
-      </w:r>
-      <w:r>
-        <w:t xml:space="preserve"> queried to verify that the lesson was saved correctly.</w:t>
-      </w:r>
-      <w:r>
-        <w:t xml:space="preserve"> The robustness of the </w:t>
-      </w:r>
-      <w:proofErr w:type="spellStart"/>
-      <w:r>
-        <w:rPr>
-          <w:b/>
-          <w:bCs/>
-        </w:rPr>
-        <w:t>BookingCalendar</w:t>
-      </w:r>
-      <w:proofErr w:type="spellEnd"/>
-      <w:r>
-        <w:t xml:space="preserve"> component’s logic was tested by attempting to book an unavailable slot, to double-book a lesson, and to book a lesson without selecting all the required fields.</w:t>
-      </w:r>
-      <w:r>
-        <w:t xml:space="preserve"> The component correctly prevented booking.</w:t>
-      </w:r>
-    </w:p>
-    <w:p>
-      <w:pPr>
-        <w:pStyle w:val="Heading3"/>
-        <w:spacing w:line="360" w:lineRule="auto"/>
-      </w:pPr>
-      <w:bookmarkStart w:id="41" w:name="_Toc225105237"/>
-      <w:r>
-        <w:t>4.3.3 API testing</w:t>
-      </w:r>
-      <w:bookmarkEnd w:id="41"/>
-    </w:p>
-    <w:p>
-      <w:pPr>
-        <w:spacing w:line="360" w:lineRule="auto"/>
-      </w:pPr>
-      <w:r>
-        <w:t xml:space="preserve">The lesson booking endpoint was tested with valid and invalid data. </w:t>
-      </w:r>
-      <w:r>
-        <w:t>When</w:t>
-      </w:r>
-      <w:r>
-        <w:t xml:space="preserve"> valid data</w:t>
-      </w:r>
-      <w:r>
-        <w:t xml:space="preserve"> was submitted</w:t>
-      </w:r>
-      <w:r>
-        <w:t xml:space="preserve">, the lesson was </w:t>
-      </w:r>
-      <w:r>
-        <w:t>created successfully</w:t>
-      </w:r>
-      <w:r>
-        <w:t xml:space="preserve"> and the </w:t>
-      </w:r>
-      <w:r>
-        <w:t>API returned</w:t>
-      </w:r>
-      <w:r>
-        <w:t xml:space="preserve"> HTTP 201 response</w:t>
-      </w:r>
-      <w:r>
-        <w:t xml:space="preserve"> and a booking confirmation object</w:t>
-      </w:r>
-      <w:r>
-        <w:t xml:space="preserve">. When an invalid tutor or student id </w:t>
-      </w:r>
-      <w:r>
-        <w:t>was</w:t>
-      </w:r>
-      <w:r>
-        <w:t xml:space="preserve"> submitted, the booking was refused. </w:t>
-      </w:r>
-    </w:p>
-    <w:p>
-      <w:pPr>
-        <w:spacing w:line="360" w:lineRule="auto"/>
-      </w:pPr>
-      <w:r>
-        <w:t>An attempt to create a lesson that overlapped another lesson</w:t>
-      </w:r>
-      <w:r>
-        <w:t xml:space="preserve"> was </w:t>
-      </w:r>
-      <w:r>
-        <w:t>rejected</w:t>
-      </w:r>
-      <w:r>
-        <w:t xml:space="preserve">. </w:t>
-      </w:r>
-      <w:r>
-        <w:t>Similarly, w</w:t>
-      </w:r>
-      <w:r>
-        <w:t xml:space="preserve">hen a past-tense booking was attempted, it was </w:t>
-      </w:r>
-      <w:r>
-        <w:t>rejected</w:t>
-      </w:r>
-      <w:r>
-        <w:t>.</w:t>
-      </w:r>
-      <w:r>
-        <w:t xml:space="preserve"> </w:t>
-      </w:r>
-      <w:r>
-        <w:t>Finally, w</w:t>
-      </w:r>
-      <w:r>
-        <w:t xml:space="preserve">hen an attempt was made to cancel a booking that </w:t>
-      </w:r>
-      <w:r>
-        <w:lastRenderedPageBreak/>
-        <w:t xml:space="preserve">started within 24 hours, it was refused. </w:t>
-      </w:r>
-      <w:r>
-        <w:t xml:space="preserve">Although there </w:t>
-      </w:r>
-      <w:r>
-        <w:t>is more business logic in backend booking</w:t>
-      </w:r>
-      <w:r>
-        <w:t xml:space="preserve"> handler</w:t>
-      </w:r>
-      <w:r>
-        <w:t xml:space="preserve"> that can be tested, these cases were judged to be the most important</w:t>
-      </w:r>
-      <w:r>
-        <w:t>.</w:t>
-      </w:r>
-    </w:p>
-    <w:p>
-      <w:pPr>
-        <w:pStyle w:val="Heading2"/>
-        <w:spacing w:line="360" w:lineRule="auto"/>
-      </w:pPr>
-      <w:bookmarkStart w:id="42" w:name="_Toc225105238"/>
-      <w:r>
-        <w:t>4.4 Real-time webchat testing</w:t>
-      </w:r>
-      <w:bookmarkEnd w:id="42"/>
-    </w:p>
-    <w:p>
-      <w:pPr>
-        <w:spacing w:line="360" w:lineRule="auto"/>
-      </w:pPr>
-      <w:r>
-        <w:t>Real-time webchat/messaging is a crucial piece of app functionality and was prioritised for testing.</w:t>
-      </w:r>
-    </w:p>
-    <w:p>
-      <w:pPr>
-        <w:spacing w:line="360" w:lineRule="auto"/>
-      </w:pPr>
       <w:r>
         <w:t>Due to their overlap in this feature, frontend testing and manual end-to-end testing were combined.</w:t>
       </w:r>
@@ -13091,6 +13152,9 @@
         <w:t xml:space="preserve"> component. The message appeared instantly in the student’s </w:t>
       </w:r>
       <w:r>
+        <w:t xml:space="preserve">own </w:t>
+      </w:r>
+      <w:r>
         <w:rPr>
           <w:b/>
           <w:bCs/>
@@ -13118,7 +13182,7 @@
       </w:r>
       <w:proofErr w:type="gramEnd"/>
       <w:r>
-        <w:t xml:space="preserve"> and a response message was sent. This message appeared almost instantly in the student’s and tutor’s separate windows.</w:t>
+        <w:t xml:space="preserve"> and a response message was sent. This message appeared almost instantly in the student’s and tutor’s windows.</w:t>
       </w:r>
       <w:r>
         <w:t xml:space="preserve"> This confirmed correct notification and message flow between users in real time</w:t>
@@ -13247,7 +13311,10 @@
         <w:t xml:space="preserve"> direct queries in the socket.io middleware</w:t>
       </w:r>
       <w:r>
-        <w:t>, but the database is queried to prove persistence.</w:t>
+        <w:t>. For testing,</w:t>
+      </w:r>
+      <w:r>
+        <w:t xml:space="preserve"> the database is queried to prove persistence.</w:t>
       </w:r>
     </w:p>
     <w:p>
@@ -13266,6 +13333,7 @@
         <w:spacing w:line="360" w:lineRule="auto"/>
       </w:pPr>
       <w:r>
+        <w:lastRenderedPageBreak/>
         <w:t xml:space="preserve">Then, a student login request was sent via </w:t>
       </w:r>
       <w:proofErr w:type="gramStart"/>
@@ -13277,8 +13345,132 @@
         <w:t xml:space="preserve"> and the endpoints were re-tested.</w:t>
       </w:r>
       <w:r>
-        <w:t xml:space="preserve"> The endpoints sent the requested data.</w:t>
-      </w:r>
+        <w:t xml:space="preserve"> The endpoints sent the requested data</w:t>
+      </w:r>
+      <w:r>
+        <w:t xml:space="preserve"> in the format expected.</w:t>
+      </w:r>
+    </w:p>
+    <w:p/>
+    <w:p/>
+    <w:p>
+      <w:bookmarkStart w:id="46" w:name="_Toc225105242"/>
+    </w:p>
+    <w:bookmarkEnd w:id="46"/>
+    <w:p>
+      <w:pPr>
+        <w:spacing w:line="360" w:lineRule="auto"/>
+      </w:pPr>
+    </w:p>
+    <w:p>
+      <w:pPr>
+        <w:spacing w:line="360" w:lineRule="auto"/>
+      </w:pPr>
+    </w:p>
+    <w:p>
+      <w:pPr>
+        <w:spacing w:line="360" w:lineRule="auto"/>
+      </w:pPr>
+    </w:p>
+    <w:p>
+      <w:pPr>
+        <w:spacing w:line="360" w:lineRule="auto"/>
+      </w:pPr>
+    </w:p>
+    <w:p>
+      <w:pPr>
+        <w:spacing w:line="360" w:lineRule="auto"/>
+      </w:pPr>
+    </w:p>
+    <w:p>
+      <w:pPr>
+        <w:spacing w:line="360" w:lineRule="auto"/>
+      </w:pPr>
+    </w:p>
+    <w:p>
+      <w:pPr>
+        <w:spacing w:line="360" w:lineRule="auto"/>
+      </w:pPr>
+    </w:p>
+    <w:p>
+      <w:pPr>
+        <w:spacing w:line="360" w:lineRule="auto"/>
+      </w:pPr>
+    </w:p>
+    <w:p>
+      <w:pPr>
+        <w:spacing w:line="360" w:lineRule="auto"/>
+      </w:pPr>
+    </w:p>
+    <w:p>
+      <w:pPr>
+        <w:spacing w:line="360" w:lineRule="auto"/>
+      </w:pPr>
+    </w:p>
+    <w:p>
+      <w:pPr>
+        <w:spacing w:line="360" w:lineRule="auto"/>
+      </w:pPr>
+    </w:p>
+    <w:p>
+      <w:pPr>
+        <w:spacing w:line="360" w:lineRule="auto"/>
+      </w:pPr>
+    </w:p>
+    <w:p>
+      <w:pPr>
+        <w:spacing w:line="360" w:lineRule="auto"/>
+      </w:pPr>
+    </w:p>
+    <w:p>
+      <w:pPr>
+        <w:spacing w:line="360" w:lineRule="auto"/>
+      </w:pPr>
+    </w:p>
+    <w:p>
+      <w:pPr>
+        <w:spacing w:line="360" w:lineRule="auto"/>
+      </w:pPr>
+    </w:p>
+    <w:p>
+      <w:pPr>
+        <w:spacing w:line="360" w:lineRule="auto"/>
+      </w:pPr>
+    </w:p>
+    <w:p>
+      <w:pPr>
+        <w:spacing w:line="360" w:lineRule="auto"/>
+      </w:pPr>
+    </w:p>
+    <w:p>
+      <w:pPr>
+        <w:spacing w:line="360" w:lineRule="auto"/>
+      </w:pPr>
+    </w:p>
+    <w:p>
+      <w:pPr>
+        <w:spacing w:line="360" w:lineRule="auto"/>
+      </w:pPr>
+    </w:p>
+    <w:p>
+      <w:pPr>
+        <w:spacing w:line="360" w:lineRule="auto"/>
+      </w:pPr>
+    </w:p>
+    <w:p>
+      <w:pPr>
+        <w:spacing w:line="360" w:lineRule="auto"/>
+      </w:pPr>
+    </w:p>
+    <w:p>
+      <w:pPr>
+        <w:spacing w:line="360" w:lineRule="auto"/>
+      </w:pPr>
+    </w:p>
+    <w:p>
+      <w:pPr>
+        <w:spacing w:line="360" w:lineRule="auto"/>
+      </w:pPr>
     </w:p>
     <w:p>
       <w:pPr>
@@ -13293,41 +13485,10 @@
     <w:p>
       <w:pPr>
         <w:pStyle w:val="Heading1"/>
-        <w:spacing w:line="360" w:lineRule="auto"/>
-        <w:ind w:left="2160" w:firstLine="720"/>
-      </w:pPr>
-      <w:bookmarkStart w:id="46" w:name="_Toc225105242"/>
-    </w:p>
-    <w:p>
-      <w:pPr>
-        <w:pStyle w:val="Heading1"/>
-        <w:spacing w:line="360" w:lineRule="auto"/>
-        <w:ind w:left="2160" w:firstLine="720"/>
       </w:pPr>
       <w:r>
         <w:t>APPENDICES</w:t>
       </w:r>
-      <w:bookmarkEnd w:id="46"/>
-    </w:p>
-    <w:p>
-      <w:pPr>
-        <w:spacing w:line="360" w:lineRule="auto"/>
-      </w:pPr>
-    </w:p>
-    <w:p>
-      <w:pPr>
-        <w:spacing w:line="360" w:lineRule="auto"/>
-      </w:pPr>
-    </w:p>
-    <w:p>
-      <w:pPr>
-        <w:spacing w:line="360" w:lineRule="auto"/>
-      </w:pPr>
-    </w:p>
-    <w:p>
-      <w:pPr>
-        <w:spacing w:line="360" w:lineRule="auto"/>
-      </w:pPr>
     </w:p>
     <w:p>
       <w:pPr>
@@ -13432,6 +13593,7 @@
       <w:bookmarkStart w:id="47" w:name="_Toc224478608"/>
       <w:bookmarkStart w:id="48" w:name="_Toc225105243"/>
       <w:r>
+        <w:lastRenderedPageBreak/>
         <w:t>Appendix 1: Code snippets.</w:t>
       </w:r>
       <w:bookmarkEnd w:id="47"/>
@@ -15327,7 +15489,7 @@
     </w:p>
     <w:p>
       <w:pPr>
-        <w:pStyle w:val="Heading1"/>
+        <w:pStyle w:val="Heading2"/>
       </w:pPr>
       <w:bookmarkStart w:id="59" w:name="_Toc225105247"/>
       <w:r>
@@ -15338,7 +15500,7 @@
     </w:p>
     <w:p>
       <w:pPr>
-        <w:pStyle w:val="Heading2"/>
+        <w:pStyle w:val="Heading3"/>
       </w:pPr>
       <w:bookmarkStart w:id="60" w:name="_Toc225105248"/>
       <w:r>
@@ -15351,7 +15513,7 @@
     </w:p>
     <w:p>
       <w:pPr>
-        <w:pStyle w:val="Heading3"/>
+        <w:pStyle w:val="Heading4"/>
       </w:pPr>
       <w:r>
         <w:t>2.1.1 Frontend testing</w:t>
@@ -16556,8 +16718,7 @@
     <w:p/>
     <w:p>
       <w:pPr>
-        <w:pStyle w:val="Heading3"/>
-        <w:spacing w:line="360" w:lineRule="auto"/>
+        <w:pStyle w:val="Heading4"/>
       </w:pPr>
       <w:r>
         <w:lastRenderedPageBreak/>
@@ -16975,7 +17136,7 @@
     </w:p>
     <w:p>
       <w:pPr>
-        <w:pStyle w:val="Heading3"/>
+        <w:pStyle w:val="Heading4"/>
       </w:pPr>
       <w:r>
         <w:lastRenderedPageBreak/>
@@ -17518,7 +17679,7 @@
     <w:p/>
     <w:p>
       <w:pPr>
-        <w:pStyle w:val="Heading2"/>
+        <w:pStyle w:val="Heading3"/>
       </w:pPr>
       <w:r>
         <w:t xml:space="preserve">2.2 </w:t>
@@ -17532,7 +17693,7 @@
     </w:p>
     <w:p>
       <w:pPr>
-        <w:pStyle w:val="Heading3"/>
+        <w:pStyle w:val="Heading4"/>
       </w:pPr>
       <w:r>
         <w:t>2.2.1 Frontend testing</w:t>
@@ -17857,7 +18018,7 @@
     </w:p>
     <w:p>
       <w:pPr>
-        <w:pStyle w:val="Heading3"/>
+        <w:pStyle w:val="Heading4"/>
         <w:rPr>
           <w:noProof/>
         </w:rPr>
@@ -18272,7 +18433,7 @@
     </w:p>
     <w:p>
       <w:pPr>
-        <w:pStyle w:val="Heading3"/>
+        <w:pStyle w:val="Heading4"/>
       </w:pPr>
       <w:r>
         <w:lastRenderedPageBreak/>
@@ -18604,7 +18765,7 @@
     <w:p/>
     <w:p>
       <w:pPr>
-        <w:pStyle w:val="Heading2"/>
+        <w:pStyle w:val="Heading3"/>
       </w:pPr>
       <w:r>
         <w:lastRenderedPageBreak/>
@@ -18613,7 +18774,7 @@
     </w:p>
     <w:p>
       <w:pPr>
-        <w:pStyle w:val="Heading3"/>
+        <w:pStyle w:val="Heading4"/>
       </w:pPr>
       <w:r>
         <w:t>2.3.1 Frontend testing and manual end-to-end testing</w:t>
@@ -18914,7 +19075,7 @@
     <w:p/>
     <w:p>
       <w:pPr>
-        <w:pStyle w:val="Heading3"/>
+        <w:pStyle w:val="Heading4"/>
       </w:pPr>
       <w:r>
         <w:lastRenderedPageBreak/>
@@ -19207,6 +19368,9 @@
     </w:p>
     <w:p>
       <w:r>
+        <w:rPr>
+          <w:noProof/>
+        </w:rPr>
         <w:lastRenderedPageBreak/>
         <w:drawing>
           <wp:inline distT="0" distB="0" distL="0" distR="0" wp14:anchorId="158220FA" wp14:editId="1EB1895F">
@@ -19282,6 +19446,9 @@
     </w:p>
     <w:p>
       <w:r>
+        <w:rPr>
+          <w:noProof/>
+        </w:rPr>
         <w:drawing>
           <wp:inline distT="0" distB="0" distL="0" distR="0" wp14:anchorId="5C4DE867" wp14:editId="1018CD12">
             <wp:extent cx="5759450" cy="528320"/>
@@ -20672,10 +20839,9 @@
     <w:next w:val="Normal"/>
     <w:link w:val="Heading4Char"/>
     <w:uiPriority w:val="9"/>
-    <w:semiHidden/>
     <w:unhideWhenUsed/>
     <w:qFormat/>
-    <w:rsid w:val="009862C3"/>
+    <w:rsid w:val="008056BC"/>
     <w:pPr>
       <w:keepNext/>
       <w:keepLines/>
@@ -20684,9 +20850,9 @@
     </w:pPr>
     <w:rPr>
       <w:rFonts w:eastAsiaTheme="majorEastAsia" w:cstheme="majorBidi"/>
-      <w:i/>
+      <w:b/>
       <w:iCs/>
-      <w:color w:val="0F4761" w:themeColor="accent1" w:themeShade="BF"/>
+      <w:color w:val="215E99" w:themeColor="text2" w:themeTint="BF"/>
     </w:rPr>
   </w:style>
   <w:style w:type="paragraph" w:styleId="Heading5">
@@ -20871,12 +21037,12 @@
     <w:basedOn w:val="DefaultParagraphFont"/>
     <w:link w:val="Heading4"/>
     <w:uiPriority w:val="9"/>
-    <w:rsid w:val="009862C3"/>
+    <w:rsid w:val="008056BC"/>
     <w:rPr>
-      <w:rFonts w:eastAsiaTheme="majorEastAsia" w:cstheme="majorBidi"/>
-      <w:i/>
+      <w:rFonts w:ascii="Garamond" w:eastAsiaTheme="majorEastAsia" w:hAnsi="Garamond" w:cstheme="majorBidi"/>
+      <w:b/>
       <w:iCs/>
-      <w:color w:val="0F4761" w:themeColor="accent1" w:themeShade="BF"/>
+      <w:color w:val="215E99" w:themeColor="text2" w:themeTint="BF"/>
     </w:rPr>
   </w:style>
   <w:style w:type="character" w:customStyle="1" w:styleId="Heading5Char">

</xml_diff>